<commit_message>
Added photo and purchase link - Flap and Wobble Penguin
</commit_message>
<xml_diff>
--- a/Toy_Instructions/Sound_Movement_Light/Fisher-Price_Flap_and_Wobble_Penguin/Fisher-Price_Flap_and_Wobble_Penguin_Maker_Guide.docx
+++ b/Toy_Instructions/Sound_Movement_Light/Fisher-Price_Flap_and_Wobble_Penguin/Fisher-Price_Flap_and_Wobble_Penguin_Maker_Guide.docx
@@ -20,9 +20,9 @@
         <w:tblLook w:val="04A0" w:firstRow="1" w:lastRow="0" w:firstColumn="1" w:lastColumn="0" w:noHBand="0" w:noVBand="1"/>
       </w:tblPr>
       <w:tblGrid>
-        <w:gridCol w:w="3318"/>
+        <w:gridCol w:w="3317"/>
         <w:gridCol w:w="2646"/>
-        <w:gridCol w:w="3386"/>
+        <w:gridCol w:w="3387"/>
       </w:tblGrid>
       <w:tr>
         <w:trPr>
@@ -48,7 +48,7 @@
                 <w:noProof/>
               </w:rPr>
               <w:drawing>
-                <wp:anchor distT="0" distB="0" distL="114300" distR="114300" simplePos="0" relativeHeight="251671591" behindDoc="0" locked="0" layoutInCell="1" allowOverlap="1" wp14:anchorId="3C3D37EA" wp14:editId="43E8B744">
+                <wp:anchor distT="0" distB="0" distL="114300" distR="114300" simplePos="0" relativeHeight="251658250" behindDoc="0" locked="0" layoutInCell="1" allowOverlap="1" wp14:anchorId="3C3D37EA" wp14:editId="43E8B744">
                   <wp:simplePos x="0" y="0"/>
                   <wp:positionH relativeFrom="column">
                     <wp:posOffset>229739</wp:posOffset>
@@ -126,7 +126,7 @@
                 <w:noProof/>
               </w:rPr>
               <w:drawing>
-                <wp:anchor distT="0" distB="0" distL="114300" distR="114300" simplePos="0" relativeHeight="251667495" behindDoc="0" locked="0" layoutInCell="1" allowOverlap="1" wp14:anchorId="4E78C866" wp14:editId="40B3C9DA">
+                <wp:anchor distT="0" distB="0" distL="114300" distR="114300" simplePos="0" relativeHeight="251658247" behindDoc="0" locked="0" layoutInCell="1" allowOverlap="1" wp14:anchorId="4E78C866" wp14:editId="40B3C9DA">
                   <wp:simplePos x="0" y="0"/>
                   <wp:positionH relativeFrom="column">
                     <wp:posOffset>589732</wp:posOffset>
@@ -239,6 +239,31 @@
             <w:r>
               <w:t xml:space="preserve"> </w:t>
             </w:r>
+            <w:r>
+              <w:t>(</w:t>
+            </w:r>
+            <w:hyperlink r:id="rId13" w:history="1">
+              <w:r>
+                <w:rPr>
+                  <w:rStyle w:val="Hyperlink"/>
+                </w:rPr>
+                <w:t>Amazon</w:t>
+              </w:r>
+            </w:hyperlink>
+            <w:r>
+              <w:t xml:space="preserve">, </w:t>
+            </w:r>
+            <w:hyperlink r:id="rId14" w:history="1">
+              <w:r>
+                <w:rPr>
+                  <w:rStyle w:val="Hyperlink"/>
+                </w:rPr>
+                <w:t>Walmart</w:t>
+              </w:r>
+            </w:hyperlink>
+            <w:r>
+              <w:t>)</w:t>
+            </w:r>
           </w:p>
           <w:p>
             <w:pPr>
@@ -299,7 +324,7 @@
             <w:r>
               <w:t xml:space="preserve">Refer to the </w:t>
             </w:r>
-            <w:hyperlink r:id="rId13" w:history="1">
+            <w:hyperlink r:id="rId15" w:history="1">
               <w:r>
                 <w:rPr>
                   <w:rStyle w:val="Hyperlink"/>
@@ -338,7 +363,7 @@
                 <w:noProof/>
               </w:rPr>
               <w:drawing>
-                <wp:anchor distT="0" distB="0" distL="114300" distR="114300" simplePos="0" relativeHeight="251668519" behindDoc="0" locked="0" layoutInCell="1" allowOverlap="1" wp14:anchorId="6C4BB0B6" wp14:editId="67524D25">
+                <wp:anchor distT="0" distB="0" distL="114300" distR="114300" simplePos="0" relativeHeight="251658248" behindDoc="0" locked="0" layoutInCell="1" allowOverlap="1" wp14:anchorId="6C4BB0B6" wp14:editId="67524D25">
                   <wp:simplePos x="0" y="0"/>
                   <wp:positionH relativeFrom="column">
                     <wp:posOffset>234985</wp:posOffset>
@@ -361,7 +386,7 @@
                           <pic:cNvPicPr/>
                         </pic:nvPicPr>
                         <pic:blipFill rotWithShape="1">
-                          <a:blip r:embed="rId14" cstate="print">
+                          <a:blip r:embed="rId16" cstate="print">
                             <a:extLst>
                               <a:ext uri="{28A0092B-C50C-407E-A947-70E740481C1C}">
                                 <a14:useLocalDpi xmlns:a14="http://schemas.microsoft.com/office/drawing/2010/main" val="0"/>
@@ -422,7 +447,7 @@
                 <w:noProof/>
               </w:rPr>
               <w:drawing>
-                <wp:anchor distT="0" distB="0" distL="114300" distR="114300" simplePos="0" relativeHeight="251670567" behindDoc="0" locked="0" layoutInCell="1" allowOverlap="1" wp14:anchorId="0C0DAC7E" wp14:editId="741C1D84">
+                <wp:anchor distT="0" distB="0" distL="114300" distR="114300" simplePos="0" relativeHeight="251658249" behindDoc="0" locked="0" layoutInCell="1" allowOverlap="1" wp14:anchorId="0C0DAC7E" wp14:editId="741C1D84">
                   <wp:simplePos x="0" y="0"/>
                   <wp:positionH relativeFrom="column">
                     <wp:posOffset>20542</wp:posOffset>
@@ -445,7 +470,7 @@
                           <pic:cNvPicPr/>
                         </pic:nvPicPr>
                         <pic:blipFill rotWithShape="1">
-                          <a:blip r:embed="rId15" cstate="print">
+                          <a:blip r:embed="rId17" cstate="print">
                             <a:extLst>
                               <a:ext uri="{28A0092B-C50C-407E-A947-70E740481C1C}">
                                 <a14:useLocalDpi xmlns:a14="http://schemas.microsoft.com/office/drawing/2010/main" val="0"/>
@@ -644,13 +669,12 @@
     <w:tbl>
       <w:tblPr>
         <w:tblStyle w:val="TableGrid"/>
-        <w:tblW w:w="9493" w:type="dxa"/>
-        <w:tblLayout w:type="fixed"/>
+        <w:tblW w:w="5000" w:type="pct"/>
         <w:tblLook w:val="06A0" w:firstRow="1" w:lastRow="0" w:firstColumn="1" w:lastColumn="0" w:noHBand="1" w:noVBand="1"/>
       </w:tblPr>
       <w:tblGrid>
-        <w:gridCol w:w="4227"/>
-        <w:gridCol w:w="5266"/>
+        <w:gridCol w:w="4673"/>
+        <w:gridCol w:w="4677"/>
       </w:tblGrid>
       <w:tr>
         <w:trPr>
@@ -658,7 +682,7 @@
         </w:trPr>
         <w:tc>
           <w:tcPr>
-            <w:tcW w:w="4215" w:type="dxa"/>
+            <w:tcW w:w="2499" w:type="pct"/>
           </w:tcPr>
           <w:p>
             <w:pPr>
@@ -677,7 +701,21 @@
                 <w:sz w:val="24"/>
                 <w:szCs w:val="24"/>
               </w:rPr>
-              <w:t>To start, locate the bottom of the penguin and the large plastic compartment. You will notice this compartment has a zip tie holding it in place</w:t>
+              <w:t xml:space="preserve">To start, locate the bottom of the penguin and the large plastic compartment. You will notice this compartment has a </w:t>
+            </w:r>
+            <w:r>
+              <w:rPr>
+                <w:sz w:val="24"/>
+                <w:szCs w:val="24"/>
+              </w:rPr>
+              <w:t>cable</w:t>
+            </w:r>
+            <w:r>
+              <w:rPr>
+                <w:sz w:val="24"/>
+                <w:szCs w:val="24"/>
+              </w:rPr>
+              <w:t xml:space="preserve"> tie holding it in place</w:t>
             </w:r>
           </w:p>
           <w:p>
@@ -702,7 +740,21 @@
                 <w:sz w:val="24"/>
                 <w:szCs w:val="24"/>
               </w:rPr>
-              <w:t xml:space="preserve">Locate the zip tie. It will be in the seam of the fabric going around the plastic compartment. </w:t>
+              <w:t xml:space="preserve">Locate the </w:t>
+            </w:r>
+            <w:r>
+              <w:rPr>
+                <w:sz w:val="24"/>
+                <w:szCs w:val="24"/>
+              </w:rPr>
+              <w:t>cable</w:t>
+            </w:r>
+            <w:r>
+              <w:rPr>
+                <w:sz w:val="24"/>
+                <w:szCs w:val="24"/>
+              </w:rPr>
+              <w:t xml:space="preserve"> tie. It will be in the seam of the fabric going around the plastic compartment. </w:t>
             </w:r>
           </w:p>
           <w:p>
@@ -727,23 +779,47 @@
                 <w:sz w:val="24"/>
                 <w:szCs w:val="24"/>
               </w:rPr>
-              <w:t xml:space="preserve">Find an opening (you may have to snip a bit of fabric) to then snip the zip tie. When this happens, the plastic will be free from the fabric </w:t>
+              <w:t xml:space="preserve">Find an opening (you may have to snip a bit of fabric) to then snip the </w:t>
+            </w:r>
+            <w:r>
+              <w:rPr>
+                <w:sz w:val="24"/>
+                <w:szCs w:val="24"/>
+              </w:rPr>
+              <w:t>cable</w:t>
+            </w:r>
+            <w:r>
+              <w:rPr>
+                <w:sz w:val="24"/>
+                <w:szCs w:val="24"/>
+              </w:rPr>
+              <w:t xml:space="preserve"> tie. When this happens, the plastic will be free from the fabric</w:t>
+            </w:r>
+            <w:r>
+              <w:rPr>
+                <w:sz w:val="24"/>
+                <w:szCs w:val="24"/>
+              </w:rPr>
+              <w:t>.</w:t>
             </w:r>
           </w:p>
         </w:tc>
         <w:tc>
           <w:tcPr>
-            <w:tcW w:w="5250" w:type="dxa"/>
+            <w:tcW w:w="2501" w:type="pct"/>
           </w:tcPr>
           <w:p>
+            <w:pPr>
+              <w:jc w:val="center"/>
+            </w:pPr>
             <w:r>
               <w:rPr>
                 <w:noProof/>
               </w:rPr>
               <w:drawing>
-                <wp:inline distT="0" distB="0" distL="0" distR="0" wp14:anchorId="124F548F" wp14:editId="781CF684">
-                  <wp:extent cx="2400300" cy="3200400"/>
-                  <wp:effectExtent l="0" t="0" r="0" b="0"/>
+                <wp:inline distT="0" distB="0" distL="0" distR="0" wp14:anchorId="124F548F" wp14:editId="40AA5578">
+                  <wp:extent cx="2303060" cy="3070746"/>
+                  <wp:effectExtent l="0" t="0" r="2540" b="0"/>
                   <wp:docPr id="1873333525" name="Picture 1873333525"/>
                   <wp:cNvGraphicFramePr>
                     <a:graphicFrameLocks xmlns:a="http://schemas.openxmlformats.org/drawingml/2006/main" noChangeAspect="1"/>
@@ -756,7 +832,7 @@
                           <pic:cNvPicPr/>
                         </pic:nvPicPr>
                         <pic:blipFill>
-                          <a:blip r:embed="rId16" cstate="print">
+                          <a:blip r:embed="rId18" cstate="print">
                             <a:extLst>
                               <a:ext uri="{28A0092B-C50C-407E-A947-70E740481C1C}">
                                 <a14:useLocalDpi xmlns:a14="http://schemas.microsoft.com/office/drawing/2010/main" val="0"/>
@@ -770,7 +846,7 @@
                         <pic:spPr>
                           <a:xfrm>
                             <a:off x="0" y="0"/>
-                            <a:ext cx="2400300" cy="3200400"/>
+                            <a:ext cx="2304427" cy="3072569"/>
                           </a:xfrm>
                           <a:prstGeom prst="rect">
                             <a:avLst/>
@@ -786,197 +862,7 @@
         </w:tc>
       </w:tr>
     </w:tbl>
-    <w:p>
-      <w:pPr>
-        <w:rPr>
-          <w:sz w:val="24"/>
-        </w:rPr>
-      </w:pPr>
-      <w:r>
-        <w:rPr>
-          <w:sz w:val="24"/>
-        </w:rPr>
-        <w:t xml:space="preserve"> </w:t>
-      </w:r>
-    </w:p>
-    <w:tbl>
-      <w:tblPr>
-        <w:tblStyle w:val="TableGrid"/>
-        <w:tblW w:w="0" w:type="auto"/>
-        <w:tblLook w:val="04A0" w:firstRow="1" w:lastRow="0" w:firstColumn="1" w:lastColumn="0" w:noHBand="0" w:noVBand="1"/>
-      </w:tblPr>
-      <w:tblGrid>
-        <w:gridCol w:w="9350"/>
-      </w:tblGrid>
-      <w:tr>
-        <w:tc>
-          <w:tcPr>
-            <w:tcW w:w="9350" w:type="dxa"/>
-            <w:tcBorders>
-              <w:top w:val="nil"/>
-              <w:left w:val="nil"/>
-              <w:bottom w:val="nil"/>
-              <w:right w:val="nil"/>
-            </w:tcBorders>
-          </w:tcPr>
-          <w:p>
-            <w:r>
-              <w:rPr>
-                <w:noProof/>
-              </w:rPr>
-              <mc:AlternateContent>
-                <mc:Choice Requires="wps">
-                  <w:drawing>
-                    <wp:inline distT="0" distB="0" distL="0" distR="0" wp14:anchorId="68E8E31D" wp14:editId="1C7C13CA">
-                      <wp:extent cx="304800" cy="304800"/>
-                      <wp:effectExtent l="0" t="0" r="0" b="0"/>
-                      <wp:docPr id="1314701488" name="Rectangle 2"/>
-                      <wp:cNvGraphicFramePr>
-                        <a:graphicFrameLocks xmlns:a="http://schemas.openxmlformats.org/drawingml/2006/main" noChangeAspect="1"/>
-                      </wp:cNvGraphicFramePr>
-                      <a:graphic xmlns:a="http://schemas.openxmlformats.org/drawingml/2006/main">
-                        <a:graphicData uri="http://schemas.microsoft.com/office/word/2010/wordprocessingShape">
-                          <wps:wsp>
-                            <wps:cNvSpPr>
-                              <a:spLocks noChangeAspect="1" noChangeArrowheads="1"/>
-                            </wps:cNvSpPr>
-                            <wps:spPr bwMode="auto">
-                              <a:xfrm>
-                                <a:off x="0" y="0"/>
-                                <a:ext cx="304800" cy="304800"/>
-                              </a:xfrm>
-                              <a:prstGeom prst="rect">
-                                <a:avLst/>
-                              </a:prstGeom>
-                              <a:noFill/>
-                              <a:ln>
-                                <a:noFill/>
-                              </a:ln>
-                              <a:extLst>
-                                <a:ext uri="{909E8E84-426E-40DD-AFC4-6F175D3DCCD1}">
-                                  <a14:hiddenFill xmlns:a14="http://schemas.microsoft.com/office/drawing/2010/main">
-                                    <a:solidFill>
-                                      <a:srgbClr val="FFFFFF"/>
-                                    </a:solidFill>
-                                  </a14:hiddenFill>
-                                </a:ext>
-                                <a:ext uri="{91240B29-F687-4F45-9708-019B960494DF}">
-                                  <a14:hiddenLine xmlns:a14="http://schemas.microsoft.com/office/drawing/2010/main" w="9525">
-                                    <a:solidFill>
-                                      <a:srgbClr val="000000"/>
-                                    </a:solidFill>
-                                    <a:miter lim="800000"/>
-                                    <a:headEnd/>
-                                    <a:tailEnd/>
-                                  </a14:hiddenLine>
-                                </a:ext>
-                              </a:extLst>
-                            </wps:spPr>
-                            <wps:bodyPr rot="0" vert="horz" wrap="square" lIns="91440" tIns="45720" rIns="91440" bIns="45720" anchor="t" anchorCtr="0" upright="1">
-                              <a:noAutofit/>
-                            </wps:bodyPr>
-                          </wps:wsp>
-                        </a:graphicData>
-                      </a:graphic>
-                    </wp:inline>
-                  </w:drawing>
-                </mc:Choice>
-                <mc:Fallback xmlns:adec="http://schemas.microsoft.com/office/drawing/2017/decorative" xmlns:a14="http://schemas.microsoft.com/office/drawing/2010/main" xmlns:pic="http://schemas.openxmlformats.org/drawingml/2006/picture" xmlns:a="http://schemas.openxmlformats.org/drawingml/2006/main">
-                  <w:pict w14:anchorId="51BC57BE">
-                    <v:rect id="Rectangle 2" style="width:24pt;height:24pt;visibility:visible;mso-wrap-style:square;mso-left-percent:-10001;mso-top-percent:-10001;mso-position-horizontal:absolute;mso-position-horizontal-relative:char;mso-position-vertical:absolute;mso-position-vertical-relative:line;mso-left-percent:-10001;mso-top-percent:-10001;v-text-anchor:top" o:spid="_x0000_s1026" filled="f" stroked="f" w14:anchorId="5591C136" o:gfxdata="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">
-                      <o:lock v:ext="edit" aspectratio="t"/>
-                      <w10:anchorlock/>
-                    </v:rect>
-                  </w:pict>
-                </mc:Fallback>
-              </mc:AlternateContent>
-            </w:r>
-            <w:r>
-              <w:t xml:space="preserve"> </w:t>
-            </w:r>
-            <w:r>
-              <w:rPr>
-                <w:noProof/>
-              </w:rPr>
-              <mc:AlternateContent>
-                <mc:Choice Requires="wps">
-                  <w:drawing>
-                    <wp:inline distT="0" distB="0" distL="0" distR="0" wp14:anchorId="19078CCE" wp14:editId="72DD9206">
-                      <wp:extent cx="304800" cy="304800"/>
-                      <wp:effectExtent l="0" t="0" r="0" b="0"/>
-                      <wp:docPr id="1895051638" name="Rectangle 4" descr="Image preview"/>
-                      <wp:cNvGraphicFramePr>
-                        <a:graphicFrameLocks xmlns:a="http://schemas.openxmlformats.org/drawingml/2006/main" noChangeAspect="1"/>
-                      </wp:cNvGraphicFramePr>
-                      <a:graphic xmlns:a="http://schemas.openxmlformats.org/drawingml/2006/main">
-                        <a:graphicData uri="http://schemas.microsoft.com/office/word/2010/wordprocessingShape">
-                          <wps:wsp>
-                            <wps:cNvSpPr>
-                              <a:spLocks noChangeAspect="1" noChangeArrowheads="1"/>
-                            </wps:cNvSpPr>
-                            <wps:spPr bwMode="auto">
-                              <a:xfrm>
-                                <a:off x="0" y="0"/>
-                                <a:ext cx="304800" cy="304800"/>
-                              </a:xfrm>
-                              <a:prstGeom prst="rect">
-                                <a:avLst/>
-                              </a:prstGeom>
-                              <a:noFill/>
-                              <a:ln>
-                                <a:noFill/>
-                              </a:ln>
-                              <a:extLst>
-                                <a:ext uri="{909E8E84-426E-40DD-AFC4-6F175D3DCCD1}">
-                                  <a14:hiddenFill xmlns:a14="http://schemas.microsoft.com/office/drawing/2010/main">
-                                    <a:solidFill>
-                                      <a:srgbClr val="FFFFFF"/>
-                                    </a:solidFill>
-                                  </a14:hiddenFill>
-                                </a:ext>
-                                <a:ext uri="{91240B29-F687-4F45-9708-019B960494DF}">
-                                  <a14:hiddenLine xmlns:a14="http://schemas.microsoft.com/office/drawing/2010/main" w="9525">
-                                    <a:solidFill>
-                                      <a:srgbClr val="000000"/>
-                                    </a:solidFill>
-                                    <a:miter lim="800000"/>
-                                    <a:headEnd/>
-                                    <a:tailEnd/>
-                                  </a14:hiddenLine>
-                                </a:ext>
-                              </a:extLst>
-                            </wps:spPr>
-                            <wps:bodyPr rot="0" vert="horz" wrap="square" lIns="91440" tIns="45720" rIns="91440" bIns="45720" anchor="t" anchorCtr="0" upright="1">
-                              <a:noAutofit/>
-                            </wps:bodyPr>
-                          </wps:wsp>
-                        </a:graphicData>
-                      </a:graphic>
-                    </wp:inline>
-                  </w:drawing>
-                </mc:Choice>
-                <mc:Fallback xmlns:adec="http://schemas.microsoft.com/office/drawing/2017/decorative" xmlns:a14="http://schemas.microsoft.com/office/drawing/2010/main" xmlns:pic="http://schemas.openxmlformats.org/drawingml/2006/picture" xmlns:a="http://schemas.openxmlformats.org/drawingml/2006/main">
-                  <w:pict w14:anchorId="225C7616">
-                    <v:rect id="Rectangle 4" style="width:24pt;height:24pt;visibility:visible;mso-wrap-style:square;mso-left-percent:-10001;mso-top-percent:-10001;mso-position-horizontal:absolute;mso-position-horizontal-relative:char;mso-position-vertical:absolute;mso-position-vertical-relative:line;mso-left-percent:-10001;mso-top-percent:-10001;v-text-anchor:top" alt="Image preview" o:spid="_x0000_s1026" filled="f" stroked="f" w14:anchorId="6124A8FE" o:gfxdata="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">
-                      <o:lock v:ext="edit" aspectratio="t"/>
-                      <w10:anchorlock/>
-                    </v:rect>
-                  </w:pict>
-                </mc:Fallback>
-              </mc:AlternateContent>
-            </w:r>
-            <w:r>
-              <w:t xml:space="preserve"> </w:t>
-            </w:r>
-          </w:p>
-        </w:tc>
-      </w:tr>
-    </w:tbl>
-    <w:p>
-      <w:r>
-        <w:t xml:space="preserve"> </w:t>
-      </w:r>
-    </w:p>
+    <w:p/>
     <w:p>
       <w:pPr>
         <w:pStyle w:val="Heading2"/>
@@ -996,525 +882,500 @@
     <w:tbl>
       <w:tblPr>
         <w:tblStyle w:val="TableGrid"/>
-        <w:tblW w:w="9374" w:type="dxa"/>
-        <w:tblLook w:val="04A0" w:firstRow="1" w:lastRow="0" w:firstColumn="1" w:lastColumn="0" w:noHBand="0" w:noVBand="1"/>
+        <w:tblW w:w="5000" w:type="pct"/>
+        <w:tblLook w:val="06A0" w:firstRow="1" w:lastRow="0" w:firstColumn="1" w:lastColumn="0" w:noHBand="1" w:noVBand="1"/>
       </w:tblPr>
       <w:tblGrid>
-        <w:gridCol w:w="9138"/>
-        <w:gridCol w:w="236"/>
+        <w:gridCol w:w="4711"/>
+        <w:gridCol w:w="4639"/>
       </w:tblGrid>
       <w:tr>
+        <w:trPr>
+          <w:trHeight w:val="300"/>
+        </w:trPr>
         <w:tc>
           <w:tcPr>
-            <w:tcW w:w="9138" w:type="dxa"/>
-            <w:tcBorders>
-              <w:top w:val="nil"/>
-              <w:left w:val="nil"/>
-              <w:bottom w:val="nil"/>
-              <w:right w:val="nil"/>
-            </w:tcBorders>
+            <w:tcW w:w="2519" w:type="pct"/>
           </w:tcPr>
-          <w:tbl>
-            <w:tblPr>
-              <w:tblStyle w:val="TableGrid"/>
-              <w:tblW w:w="8390" w:type="dxa"/>
-              <w:tblLayout w:type="fixed"/>
-              <w:tblLook w:val="06A0" w:firstRow="1" w:lastRow="0" w:firstColumn="1" w:lastColumn="0" w:noHBand="1" w:noVBand="1"/>
-            </w:tblPr>
-            <w:tblGrid>
-              <w:gridCol w:w="4227"/>
-              <w:gridCol w:w="4163"/>
-            </w:tblGrid>
-            <w:tr>
-              <w:trPr>
-                <w:trHeight w:val="300"/>
-              </w:trPr>
-              <w:tc>
-                <w:tcPr>
-                  <w:tcW w:w="4227" w:type="dxa"/>
-                </w:tcPr>
-                <w:bookmarkEnd w:id="0"/>
-                <w:p>
-                  <w:pPr>
-                    <w:pStyle w:val="ListParagraph"/>
-                    <w:numPr>
-                      <w:ilvl w:val="0"/>
-                      <w:numId w:val="13"/>
-                    </w:numPr>
-                    <w:rPr>
-                      <w:sz w:val="24"/>
-                      <w:szCs w:val="24"/>
-                    </w:rPr>
-                  </w:pPr>
-                  <w:r>
-                    <w:rPr>
-                      <w:sz w:val="24"/>
-                      <w:szCs w:val="24"/>
-                    </w:rPr>
-                    <w:t xml:space="preserve">Gently pull the inside plastic compartment out as much as you can – the compartment will not come all the way out. </w:t>
-                  </w:r>
-                </w:p>
-                <w:p>
-                  <w:pPr>
-                    <w:rPr>
-                      <w:sz w:val="24"/>
-                      <w:szCs w:val="24"/>
-                    </w:rPr>
-                  </w:pPr>
-                </w:p>
-                <w:p>
-                  <w:pPr>
-                    <w:pStyle w:val="ListParagraph"/>
-                    <w:numPr>
-                      <w:ilvl w:val="0"/>
-                      <w:numId w:val="13"/>
-                    </w:numPr>
-                    <w:rPr>
-                      <w:sz w:val="24"/>
-                      <w:szCs w:val="24"/>
-                    </w:rPr>
-                  </w:pPr>
-                  <w:r>
-                    <w:rPr>
-                      <w:sz w:val="24"/>
-                      <w:szCs w:val="24"/>
-                    </w:rPr>
-                    <w:t xml:space="preserve">Locate the 4 screws – circled red – and loosen the screws. Set the screws aside in a safe place. </w:t>
-                  </w:r>
-                </w:p>
-                <w:p>
-                  <w:pPr>
-                    <w:pStyle w:val="ListParagraph"/>
-                    <w:rPr>
-                      <w:sz w:val="24"/>
-                      <w:szCs w:val="24"/>
-                    </w:rPr>
-                  </w:pPr>
-                </w:p>
-                <w:p>
-                  <w:pPr>
-                    <w:pStyle w:val="ListParagraph"/>
-                    <w:numPr>
-                      <w:ilvl w:val="0"/>
-                      <w:numId w:val="13"/>
-                    </w:numPr>
-                    <w:rPr>
-                      <w:sz w:val="24"/>
-                      <w:szCs w:val="24"/>
-                    </w:rPr>
-                  </w:pPr>
-                  <w:r>
-                    <w:rPr>
-                      <w:sz w:val="24"/>
-                      <w:szCs w:val="24"/>
-                    </w:rPr>
-                    <w:t xml:space="preserve">This internal part of the toy will not come completely apart, but you can have the grey bottom come loose. </w:t>
-                  </w:r>
-                </w:p>
-                <w:p>
-                  <w:pPr>
-                    <w:ind w:left="360"/>
-                    <w:rPr>
-                      <w:sz w:val="24"/>
-                      <w:szCs w:val="24"/>
-                    </w:rPr>
-                  </w:pPr>
-                </w:p>
-              </w:tc>
-              <w:tc>
-                <w:tcPr>
-                  <w:tcW w:w="4163" w:type="dxa"/>
-                </w:tcPr>
-                <w:p>
-                  <w:r>
-                    <w:rPr>
-                      <w:noProof/>
-                    </w:rPr>
-                    <mc:AlternateContent>
-                      <mc:Choice Requires="wps">
-                        <w:drawing>
-                          <wp:anchor distT="0" distB="0" distL="114300" distR="114300" simplePos="0" relativeHeight="251665447" behindDoc="0" locked="0" layoutInCell="1" allowOverlap="1" wp14:anchorId="514BAD61" wp14:editId="27396F3B">
-                            <wp:simplePos x="0" y="0"/>
-                            <wp:positionH relativeFrom="column">
-                              <wp:posOffset>287020</wp:posOffset>
-                            </wp:positionH>
-                            <wp:positionV relativeFrom="paragraph">
-                              <wp:posOffset>1673860</wp:posOffset>
-                            </wp:positionV>
-                            <wp:extent cx="171450" cy="241300"/>
-                            <wp:effectExtent l="0" t="0" r="19050" b="25400"/>
-                            <wp:wrapNone/>
-                            <wp:docPr id="871331638" name="Flowchart: Connector 4"/>
-                            <wp:cNvGraphicFramePr/>
-                            <a:graphic xmlns:a="http://schemas.openxmlformats.org/drawingml/2006/main">
-                              <a:graphicData uri="http://schemas.microsoft.com/office/word/2010/wordprocessingShape">
-                                <wps:wsp>
-                                  <wps:cNvSpPr/>
-                                  <wps:spPr>
-                                    <a:xfrm>
-                                      <a:off x="0" y="0"/>
-                                      <a:ext cx="171450" cy="241300"/>
-                                    </a:xfrm>
-                                    <a:prstGeom prst="flowChartConnector">
-                                      <a:avLst/>
-                                    </a:prstGeom>
-                                    <a:noFill/>
-                                    <a:ln w="19050">
-                                      <a:solidFill>
-                                        <a:srgbClr val="FF0000"/>
-                                      </a:solidFill>
-                                    </a:ln>
-                                  </wps:spPr>
-                                  <wps:style>
-                                    <a:lnRef idx="2">
-                                      <a:schemeClr val="accent1">
-                                        <a:shade val="15000"/>
-                                      </a:schemeClr>
-                                    </a:lnRef>
-                                    <a:fillRef idx="1">
-                                      <a:schemeClr val="accent1"/>
-                                    </a:fillRef>
-                                    <a:effectRef idx="0">
-                                      <a:schemeClr val="accent1"/>
-                                    </a:effectRef>
-                                    <a:fontRef idx="minor">
-                                      <a:schemeClr val="lt1"/>
-                                    </a:fontRef>
-                                  </wps:style>
-                                  <wps:bodyPr rot="0" spcFirstLastPara="0" vertOverflow="overflow" horzOverflow="overflow" vert="horz" wrap="square" lIns="91440" tIns="45720" rIns="91440" bIns="45720" numCol="1" spcCol="0" rtlCol="0" fromWordArt="0" anchor="ctr" anchorCtr="0" forceAA="0" compatLnSpc="1">
-                                    <a:prstTxWarp prst="textNoShape">
-                                      <a:avLst/>
-                                    </a:prstTxWarp>
-                                    <a:noAutofit/>
-                                  </wps:bodyPr>
-                                </wps:wsp>
-                              </a:graphicData>
-                            </a:graphic>
-                          </wp:anchor>
-                        </w:drawing>
-                      </mc:Choice>
-                      <mc:Fallback xmlns:a="http://schemas.openxmlformats.org/drawingml/2006/main" xmlns:pic="http://schemas.openxmlformats.org/drawingml/2006/picture" xmlns:a14="http://schemas.microsoft.com/office/drawing/2010/main">
-                        <w:pict w14:anchorId="4AAB16DC">
-                          <v:shapetype id="_x0000_t120" coordsize="21600,21600" o:spt="120" path="m10800,qx,10800,10800,21600,21600,10800,10800,xe" w14:anchorId="59CFCD8A">
-                            <v:path textboxrect="3163,3163,18437,18437" gradientshapeok="t" o:connecttype="custom" o:connectlocs="10800,0;3163,3163;0,10800;3163,18437;10800,21600;18437,18437;21600,10800;18437,3163"/>
-                          </v:shapetype>
-                          <v:shape id="Flowchart: Connector 4" style="position:absolute;margin-left:22.6pt;margin-top:131.8pt;width:13.5pt;height:19pt;z-index:251665447;visibility:visible;mso-wrap-style:square;mso-wrap-distance-left:9pt;mso-wrap-distance-top:0;mso-wrap-distance-right:9pt;mso-wrap-distance-bottom:0;mso-position-horizontal:absolute;mso-position-horizontal-relative:text;mso-position-vertical:absolute;mso-position-vertical-relative:text;v-text-anchor:middle" o:spid="_x0000_s1026" filled="f" strokecolor="red" strokeweight="1.5pt" type="#_x0000_t120" o:gfxdata="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">
-                            <v:stroke joinstyle="miter"/>
-                          </v:shape>
-                        </w:pict>
-                      </mc:Fallback>
-                    </mc:AlternateContent>
-                  </w:r>
-                  <w:r>
-                    <w:rPr>
-                      <w:noProof/>
-                    </w:rPr>
-                    <mc:AlternateContent>
-                      <mc:Choice Requires="wps">
-                        <w:drawing>
-                          <wp:anchor distT="0" distB="0" distL="114300" distR="114300" simplePos="0" relativeHeight="251664423" behindDoc="0" locked="0" layoutInCell="1" allowOverlap="1" wp14:anchorId="22D97FF0" wp14:editId="6CE720BD">
-                            <wp:simplePos x="0" y="0"/>
-                            <wp:positionH relativeFrom="column">
-                              <wp:posOffset>1506220</wp:posOffset>
-                            </wp:positionH>
-                            <wp:positionV relativeFrom="paragraph">
-                              <wp:posOffset>1642110</wp:posOffset>
-                            </wp:positionV>
-                            <wp:extent cx="158750" cy="209550"/>
-                            <wp:effectExtent l="0" t="0" r="12700" b="19050"/>
-                            <wp:wrapNone/>
-                            <wp:docPr id="1794062482" name="Flowchart: Connector 3"/>
-                            <wp:cNvGraphicFramePr/>
-                            <a:graphic xmlns:a="http://schemas.openxmlformats.org/drawingml/2006/main">
-                              <a:graphicData uri="http://schemas.microsoft.com/office/word/2010/wordprocessingShape">
-                                <wps:wsp>
-                                  <wps:cNvSpPr/>
-                                  <wps:spPr>
-                                    <a:xfrm>
-                                      <a:off x="0" y="0"/>
-                                      <a:ext cx="158750" cy="209550"/>
-                                    </a:xfrm>
-                                    <a:prstGeom prst="flowChartConnector">
-                                      <a:avLst/>
-                                    </a:prstGeom>
-                                    <a:noFill/>
-                                    <a:ln w="19050">
-                                      <a:solidFill>
-                                        <a:srgbClr val="FF0000"/>
-                                      </a:solidFill>
-                                    </a:ln>
-                                  </wps:spPr>
-                                  <wps:style>
-                                    <a:lnRef idx="2">
-                                      <a:schemeClr val="accent1">
-                                        <a:shade val="15000"/>
-                                      </a:schemeClr>
-                                    </a:lnRef>
-                                    <a:fillRef idx="1">
-                                      <a:schemeClr val="accent1"/>
-                                    </a:fillRef>
-                                    <a:effectRef idx="0">
-                                      <a:schemeClr val="accent1"/>
-                                    </a:effectRef>
-                                    <a:fontRef idx="minor">
-                                      <a:schemeClr val="lt1"/>
-                                    </a:fontRef>
-                                  </wps:style>
-                                  <wps:bodyPr rot="0" spcFirstLastPara="0" vertOverflow="overflow" horzOverflow="overflow" vert="horz" wrap="square" lIns="91440" tIns="45720" rIns="91440" bIns="45720" numCol="1" spcCol="0" rtlCol="0" fromWordArt="0" anchor="ctr" anchorCtr="0" forceAA="0" compatLnSpc="1">
-                                    <a:prstTxWarp prst="textNoShape">
-                                      <a:avLst/>
-                                    </a:prstTxWarp>
-                                    <a:noAutofit/>
-                                  </wps:bodyPr>
-                                </wps:wsp>
-                              </a:graphicData>
-                            </a:graphic>
-                          </wp:anchor>
-                        </w:drawing>
-                      </mc:Choice>
-                      <mc:Fallback xmlns:a="http://schemas.openxmlformats.org/drawingml/2006/main" xmlns:pic="http://schemas.openxmlformats.org/drawingml/2006/picture" xmlns:a14="http://schemas.microsoft.com/office/drawing/2010/main">
-                        <w:pict w14:anchorId="6C7EEF91">
-                          <v:shape id="Flowchart: Connector 3" style="position:absolute;margin-left:118.6pt;margin-top:129.3pt;width:12.5pt;height:16.5pt;z-index:251664423;visibility:visible;mso-wrap-style:square;mso-wrap-distance-left:9pt;mso-wrap-distance-top:0;mso-wrap-distance-right:9pt;mso-wrap-distance-bottom:0;mso-position-horizontal:absolute;mso-position-horizontal-relative:text;mso-position-vertical:absolute;mso-position-vertical-relative:text;v-text-anchor:middle" o:spid="_x0000_s1026" filled="f" strokecolor="red" strokeweight="1.5pt" type="#_x0000_t120" o:gfxdata="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" w14:anchorId="41BA858F">
-                            <v:stroke joinstyle="miter"/>
-                          </v:shape>
-                        </w:pict>
-                      </mc:Fallback>
-                    </mc:AlternateContent>
-                  </w:r>
-                  <w:r>
-                    <w:rPr>
-                      <w:noProof/>
-                    </w:rPr>
-                    <mc:AlternateContent>
-                      <mc:Choice Requires="wps">
-                        <w:drawing>
-                          <wp:anchor distT="0" distB="0" distL="114300" distR="114300" simplePos="0" relativeHeight="251663399" behindDoc="0" locked="0" layoutInCell="1" allowOverlap="1" wp14:anchorId="688623B2" wp14:editId="2914C47D">
-                            <wp:simplePos x="0" y="0"/>
-                            <wp:positionH relativeFrom="column">
-                              <wp:posOffset>1690370</wp:posOffset>
-                            </wp:positionH>
-                            <wp:positionV relativeFrom="paragraph">
-                              <wp:posOffset>695960</wp:posOffset>
-                            </wp:positionV>
-                            <wp:extent cx="209550" cy="215900"/>
-                            <wp:effectExtent l="0" t="0" r="19050" b="12700"/>
-                            <wp:wrapNone/>
-                            <wp:docPr id="450269851" name="Flowchart: Connector 2"/>
-                            <wp:cNvGraphicFramePr/>
-                            <a:graphic xmlns:a="http://schemas.openxmlformats.org/drawingml/2006/main">
-                              <a:graphicData uri="http://schemas.microsoft.com/office/word/2010/wordprocessingShape">
-                                <wps:wsp>
-                                  <wps:cNvSpPr/>
-                                  <wps:spPr>
-                                    <a:xfrm>
-                                      <a:off x="0" y="0"/>
-                                      <a:ext cx="209550" cy="215900"/>
-                                    </a:xfrm>
-                                    <a:prstGeom prst="flowChartConnector">
-                                      <a:avLst/>
-                                    </a:prstGeom>
-                                    <a:noFill/>
-                                    <a:ln w="19050">
-                                      <a:solidFill>
-                                        <a:srgbClr val="FF0000"/>
-                                      </a:solidFill>
-                                    </a:ln>
-                                  </wps:spPr>
-                                  <wps:style>
-                                    <a:lnRef idx="2">
-                                      <a:schemeClr val="accent1">
-                                        <a:shade val="15000"/>
-                                      </a:schemeClr>
-                                    </a:lnRef>
-                                    <a:fillRef idx="1">
-                                      <a:schemeClr val="accent1"/>
-                                    </a:fillRef>
-                                    <a:effectRef idx="0">
-                                      <a:schemeClr val="accent1"/>
-                                    </a:effectRef>
-                                    <a:fontRef idx="minor">
-                                      <a:schemeClr val="lt1"/>
-                                    </a:fontRef>
-                                  </wps:style>
-                                  <wps:bodyPr rot="0" spcFirstLastPara="0" vertOverflow="overflow" horzOverflow="overflow" vert="horz" wrap="square" lIns="91440" tIns="45720" rIns="91440" bIns="45720" numCol="1" spcCol="0" rtlCol="0" fromWordArt="0" anchor="ctr" anchorCtr="0" forceAA="0" compatLnSpc="1">
-                                    <a:prstTxWarp prst="textNoShape">
-                                      <a:avLst/>
-                                    </a:prstTxWarp>
-                                    <a:noAutofit/>
-                                  </wps:bodyPr>
-                                </wps:wsp>
-                              </a:graphicData>
-                            </a:graphic>
-                            <wp14:sizeRelH relativeFrom="margin">
-                              <wp14:pctWidth>0</wp14:pctWidth>
-                            </wp14:sizeRelH>
-                            <wp14:sizeRelV relativeFrom="margin">
-                              <wp14:pctHeight>0</wp14:pctHeight>
-                            </wp14:sizeRelV>
-                          </wp:anchor>
-                        </w:drawing>
-                      </mc:Choice>
-                      <mc:Fallback xmlns:a="http://schemas.openxmlformats.org/drawingml/2006/main" xmlns:pic="http://schemas.openxmlformats.org/drawingml/2006/picture" xmlns:a14="http://schemas.microsoft.com/office/drawing/2010/main">
-                        <w:pict w14:anchorId="63ABB1A7">
-                          <v:shape id="Flowchart: Connector 2" style="position:absolute;margin-left:133.1pt;margin-top:54.8pt;width:16.5pt;height:17pt;z-index:251663399;visibility:visible;mso-wrap-style:square;mso-width-percent:0;mso-height-percent:0;mso-wrap-distance-left:9pt;mso-wrap-distance-top:0;mso-wrap-distance-right:9pt;mso-wrap-distance-bottom:0;mso-position-horizontal:absolute;mso-position-horizontal-relative:text;mso-position-vertical:absolute;mso-position-vertical-relative:text;mso-width-percent:0;mso-height-percent:0;mso-width-relative:margin;mso-height-relative:margin;v-text-anchor:middle" o:spid="_x0000_s1026" filled="f" strokecolor="red" strokeweight="1.5pt" type="#_x0000_t120" o:gfxdata="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" w14:anchorId="467FFE84">
-                            <v:stroke joinstyle="miter"/>
-                          </v:shape>
-                        </w:pict>
-                      </mc:Fallback>
-                    </mc:AlternateContent>
-                  </w:r>
-                  <w:r>
-                    <w:rPr>
-                      <w:noProof/>
-                    </w:rPr>
-                    <mc:AlternateContent>
-                      <mc:Choice Requires="wps">
-                        <w:drawing>
-                          <wp:anchor distT="0" distB="0" distL="114300" distR="114300" simplePos="0" relativeHeight="251662375" behindDoc="0" locked="0" layoutInCell="1" allowOverlap="1" wp14:anchorId="7356E836" wp14:editId="21CEE0D5">
-                            <wp:simplePos x="0" y="0"/>
-                            <wp:positionH relativeFrom="column">
-                              <wp:posOffset>26670</wp:posOffset>
-                            </wp:positionH>
-                            <wp:positionV relativeFrom="paragraph">
-                              <wp:posOffset>1026160</wp:posOffset>
-                            </wp:positionV>
-                            <wp:extent cx="184150" cy="196850"/>
-                            <wp:effectExtent l="0" t="0" r="25400" b="12700"/>
-                            <wp:wrapNone/>
-                            <wp:docPr id="893870164" name="Flowchart: Connector 1"/>
-                            <wp:cNvGraphicFramePr/>
-                            <a:graphic xmlns:a="http://schemas.openxmlformats.org/drawingml/2006/main">
-                              <a:graphicData uri="http://schemas.microsoft.com/office/word/2010/wordprocessingShape">
-                                <wps:wsp>
-                                  <wps:cNvSpPr/>
-                                  <wps:spPr>
-                                    <a:xfrm>
-                                      <a:off x="0" y="0"/>
-                                      <a:ext cx="184150" cy="196850"/>
-                                    </a:xfrm>
-                                    <a:prstGeom prst="flowChartConnector">
-                                      <a:avLst/>
-                                    </a:prstGeom>
-                                    <a:noFill/>
-                                    <a:ln w="19050">
-                                      <a:solidFill>
-                                        <a:srgbClr val="FF0000"/>
-                                      </a:solidFill>
-                                    </a:ln>
-                                  </wps:spPr>
-                                  <wps:style>
-                                    <a:lnRef idx="2">
-                                      <a:schemeClr val="accent1">
-                                        <a:shade val="15000"/>
-                                      </a:schemeClr>
-                                    </a:lnRef>
-                                    <a:fillRef idx="1">
-                                      <a:schemeClr val="accent1"/>
-                                    </a:fillRef>
-                                    <a:effectRef idx="0">
-                                      <a:schemeClr val="accent1"/>
-                                    </a:effectRef>
-                                    <a:fontRef idx="minor">
-                                      <a:schemeClr val="lt1"/>
-                                    </a:fontRef>
-                                  </wps:style>
-                                  <wps:bodyPr rot="0" spcFirstLastPara="0" vertOverflow="overflow" horzOverflow="overflow" vert="horz" wrap="square" lIns="91440" tIns="45720" rIns="91440" bIns="45720" numCol="1" spcCol="0" rtlCol="0" fromWordArt="0" anchor="ctr" anchorCtr="0" forceAA="0" compatLnSpc="1">
-                                    <a:prstTxWarp prst="textNoShape">
-                                      <a:avLst/>
-                                    </a:prstTxWarp>
-                                    <a:noAutofit/>
-                                  </wps:bodyPr>
-                                </wps:wsp>
-                              </a:graphicData>
-                            </a:graphic>
-                            <wp14:sizeRelH relativeFrom="margin">
-                              <wp14:pctWidth>0</wp14:pctWidth>
-                            </wp14:sizeRelH>
-                            <wp14:sizeRelV relativeFrom="margin">
-                              <wp14:pctHeight>0</wp14:pctHeight>
-                            </wp14:sizeRelV>
-                          </wp:anchor>
-                        </w:drawing>
-                      </mc:Choice>
-                      <mc:Fallback xmlns:a="http://schemas.openxmlformats.org/drawingml/2006/main" xmlns:pic="http://schemas.openxmlformats.org/drawingml/2006/picture" xmlns:a14="http://schemas.microsoft.com/office/drawing/2010/main">
-                        <w:pict w14:anchorId="198E6E15">
-                          <v:shape id="Flowchart: Connector 1" style="position:absolute;margin-left:2.1pt;margin-top:80.8pt;width:14.5pt;height:15.5pt;z-index:251662375;visibility:visible;mso-wrap-style:square;mso-width-percent:0;mso-height-percent:0;mso-wrap-distance-left:9pt;mso-wrap-distance-top:0;mso-wrap-distance-right:9pt;mso-wrap-distance-bottom:0;mso-position-horizontal:absolute;mso-position-horizontal-relative:text;mso-position-vertical:absolute;mso-position-vertical-relative:text;mso-width-percent:0;mso-height-percent:0;mso-width-relative:margin;mso-height-relative:margin;v-text-anchor:middle" o:spid="_x0000_s1026" filled="f" strokecolor="red" strokeweight="1.5pt" type="#_x0000_t120" o:gfxdata="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" w14:anchorId="38043581">
-                            <v:stroke joinstyle="miter"/>
-                          </v:shape>
-                        </w:pict>
-                      </mc:Fallback>
-                    </mc:AlternateContent>
-                  </w:r>
-                  <w:r>
-                    <w:rPr>
-                      <w:noProof/>
-                    </w:rPr>
-                    <w:drawing>
-                      <wp:inline distT="0" distB="0" distL="0" distR="0" wp14:anchorId="5407F24E" wp14:editId="4F11C770">
-                        <wp:extent cx="1876425" cy="2495550"/>
-                        <wp:effectExtent l="0" t="0" r="0" b="0"/>
-                        <wp:docPr id="154398497" name="Picture 154398497"/>
-                        <wp:cNvGraphicFramePr>
-                          <a:graphicFrameLocks xmlns:a="http://schemas.openxmlformats.org/drawingml/2006/main" noChangeAspect="1"/>
-                        </wp:cNvGraphicFramePr>
-                        <a:graphic xmlns:a="http://schemas.openxmlformats.org/drawingml/2006/main">
-                          <a:graphicData uri="http://schemas.openxmlformats.org/drawingml/2006/picture">
-                            <pic:pic xmlns:pic="http://schemas.openxmlformats.org/drawingml/2006/picture">
-                              <pic:nvPicPr>
-                                <pic:cNvPr id="0" name=""/>
-                                <pic:cNvPicPr/>
-                              </pic:nvPicPr>
-                              <pic:blipFill>
-                                <a:blip r:embed="rId17" cstate="print">
-                                  <a:extLst>
-                                    <a:ext uri="{28A0092B-C50C-407E-A947-70E740481C1C}">
-                                      <a14:useLocalDpi xmlns:a14="http://schemas.microsoft.com/office/drawing/2010/main" val="0"/>
-                                    </a:ext>
-                                  </a:extLst>
-                                </a:blip>
-                                <a:stretch>
-                                  <a:fillRect/>
-                                </a:stretch>
-                              </pic:blipFill>
-                              <pic:spPr>
-                                <a:xfrm>
-                                  <a:off x="0" y="0"/>
-                                  <a:ext cx="1876425" cy="2495550"/>
-                                </a:xfrm>
-                                <a:prstGeom prst="rect">
-                                  <a:avLst/>
-                                </a:prstGeom>
-                              </pic:spPr>
-                            </pic:pic>
-                          </a:graphicData>
-                        </a:graphic>
-                      </wp:inline>
-                    </w:drawing>
-                  </w:r>
-                </w:p>
-              </w:tc>
-            </w:tr>
-          </w:tbl>
-          <w:p/>
+          <w:p>
+            <w:pPr>
+              <w:pStyle w:val="ListParagraph"/>
+              <w:numPr>
+                <w:ilvl w:val="0"/>
+                <w:numId w:val="13"/>
+              </w:numPr>
+              <w:rPr>
+                <w:sz w:val="24"/>
+                <w:szCs w:val="24"/>
+              </w:rPr>
+            </w:pPr>
+            <w:r>
+              <w:rPr>
+                <w:sz w:val="24"/>
+                <w:szCs w:val="24"/>
+              </w:rPr>
+              <w:t xml:space="preserve">Gently pull the inside plastic compartment out as much as you can – the compartment will not come all the way out. </w:t>
+            </w:r>
+          </w:p>
+          <w:p>
+            <w:pPr>
+              <w:rPr>
+                <w:sz w:val="24"/>
+                <w:szCs w:val="24"/>
+              </w:rPr>
+            </w:pPr>
+          </w:p>
+          <w:p>
+            <w:pPr>
+              <w:pStyle w:val="ListParagraph"/>
+              <w:numPr>
+                <w:ilvl w:val="0"/>
+                <w:numId w:val="13"/>
+              </w:numPr>
+              <w:rPr>
+                <w:sz w:val="24"/>
+                <w:szCs w:val="24"/>
+              </w:rPr>
+            </w:pPr>
+            <w:r>
+              <w:rPr>
+                <w:sz w:val="24"/>
+                <w:szCs w:val="24"/>
+              </w:rPr>
+              <w:t xml:space="preserve">Locate the 4 screws – circled </w:t>
+            </w:r>
+            <w:r>
+              <w:rPr>
+                <w:sz w:val="24"/>
+                <w:szCs w:val="24"/>
+              </w:rPr>
+              <w:t xml:space="preserve">in </w:t>
+            </w:r>
+            <w:r>
+              <w:rPr>
+                <w:sz w:val="24"/>
+                <w:szCs w:val="24"/>
+              </w:rPr>
+              <w:t xml:space="preserve">red – and loosen the screws. Set the screws aside in a safe place. </w:t>
+            </w:r>
+          </w:p>
+          <w:p>
+            <w:pPr>
+              <w:pStyle w:val="ListParagraph"/>
+              <w:rPr>
+                <w:sz w:val="24"/>
+                <w:szCs w:val="24"/>
+              </w:rPr>
+            </w:pPr>
+          </w:p>
+          <w:p>
+            <w:pPr>
+              <w:pStyle w:val="ListParagraph"/>
+              <w:numPr>
+                <w:ilvl w:val="0"/>
+                <w:numId w:val="13"/>
+              </w:numPr>
+              <w:rPr>
+                <w:sz w:val="24"/>
+                <w:szCs w:val="24"/>
+              </w:rPr>
+            </w:pPr>
+            <w:r>
+              <w:rPr>
+                <w:sz w:val="24"/>
+                <w:szCs w:val="24"/>
+              </w:rPr>
+              <w:t xml:space="preserve">This internal part of the toy will not come completely apart, but you can have the grey bottom come loose. </w:t>
+            </w:r>
+          </w:p>
+          <w:p>
+            <w:pPr>
+              <w:ind w:left="360"/>
+              <w:rPr>
+                <w:sz w:val="24"/>
+                <w:szCs w:val="24"/>
+              </w:rPr>
+            </w:pPr>
+          </w:p>
         </w:tc>
         <w:tc>
           <w:tcPr>
-            <w:tcW w:w="236" w:type="dxa"/>
-            <w:tcBorders>
-              <w:top w:val="nil"/>
-              <w:left w:val="nil"/>
-              <w:bottom w:val="nil"/>
-              <w:right w:val="nil"/>
-            </w:tcBorders>
+            <w:tcW w:w="2481" w:type="pct"/>
           </w:tcPr>
           <w:p>
             <w:pPr>
               <w:jc w:val="center"/>
             </w:pPr>
+            <w:r>
+              <w:rPr>
+                <w:noProof/>
+              </w:rPr>
+              <mc:AlternateContent>
+                <mc:Choice Requires="wps">
+                  <w:drawing>
+                    <wp:anchor distT="0" distB="0" distL="114300" distR="114300" simplePos="0" relativeHeight="251668490" behindDoc="0" locked="0" layoutInCell="1" allowOverlap="1" wp14:anchorId="101BE1B0" wp14:editId="71D8031D">
+                      <wp:simplePos x="0" y="0"/>
+                      <wp:positionH relativeFrom="column">
+                        <wp:posOffset>737870</wp:posOffset>
+                      </wp:positionH>
+                      <wp:positionV relativeFrom="paragraph">
+                        <wp:posOffset>1665605</wp:posOffset>
+                      </wp:positionV>
+                      <wp:extent cx="171450" cy="241300"/>
+                      <wp:effectExtent l="0" t="0" r="19050" b="25400"/>
+                      <wp:wrapNone/>
+                      <wp:docPr id="177033496" name="Flowchart: Connector 4"/>
+                      <wp:cNvGraphicFramePr/>
+                      <a:graphic xmlns:a="http://schemas.openxmlformats.org/drawingml/2006/main">
+                        <a:graphicData uri="http://schemas.microsoft.com/office/word/2010/wordprocessingShape">
+                          <wps:wsp>
+                            <wps:cNvSpPr/>
+                            <wps:spPr>
+                              <a:xfrm>
+                                <a:off x="0" y="0"/>
+                                <a:ext cx="171450" cy="241300"/>
+                              </a:xfrm>
+                              <a:prstGeom prst="flowChartConnector">
+                                <a:avLst/>
+                              </a:prstGeom>
+                              <a:noFill/>
+                              <a:ln w="19050">
+                                <a:solidFill>
+                                  <a:srgbClr val="FF0000"/>
+                                </a:solidFill>
+                              </a:ln>
+                            </wps:spPr>
+                            <wps:style>
+                              <a:lnRef idx="2">
+                                <a:schemeClr val="accent1">
+                                  <a:shade val="15000"/>
+                                </a:schemeClr>
+                              </a:lnRef>
+                              <a:fillRef idx="1">
+                                <a:schemeClr val="accent1"/>
+                              </a:fillRef>
+                              <a:effectRef idx="0">
+                                <a:schemeClr val="accent1"/>
+                              </a:effectRef>
+                              <a:fontRef idx="minor">
+                                <a:schemeClr val="lt1"/>
+                              </a:fontRef>
+                            </wps:style>
+                            <wps:bodyPr rot="0" spcFirstLastPara="0" vertOverflow="overflow" horzOverflow="overflow" vert="horz" wrap="square" lIns="91440" tIns="45720" rIns="91440" bIns="45720" numCol="1" spcCol="0" rtlCol="0" fromWordArt="0" anchor="ctr" anchorCtr="0" forceAA="0" compatLnSpc="1">
+                              <a:prstTxWarp prst="textNoShape">
+                                <a:avLst/>
+                              </a:prstTxWarp>
+                              <a:noAutofit/>
+                            </wps:bodyPr>
+                          </wps:wsp>
+                        </a:graphicData>
+                      </a:graphic>
+                    </wp:anchor>
+                  </w:drawing>
+                </mc:Choice>
+                <mc:Fallback>
+                  <w:pict>
+                    <v:shapetype w14:anchorId="2D856245" id="_x0000_t120" coordsize="21600,21600" o:spt="120" path="m10800,qx,10800,10800,21600,21600,10800,10800,xe">
+                      <v:path gradientshapeok="t" o:connecttype="custom" o:connectlocs="10800,0;3163,3163;0,10800;3163,18437;10800,21600;18437,18437;21600,10800;18437,3163" textboxrect="3163,3163,18437,18437"/>
+                    </v:shapetype>
+                    <v:shape id="Flowchart: Connector 4" o:spid="_x0000_s1026" type="#_x0000_t120" style="position:absolute;margin-left:58.1pt;margin-top:131.15pt;width:13.5pt;height:19pt;z-index:251668490;visibility:visible;mso-wrap-style:square;mso-wrap-distance-left:9pt;mso-wrap-distance-top:0;mso-wrap-distance-right:9pt;mso-wrap-distance-bottom:0;mso-position-horizontal:absolute;mso-position-horizontal-relative:text;mso-position-vertical:absolute;mso-position-vertical-relative:text;v-text-anchor:middle" o:gfxdata="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" filled="f" strokecolor="red" strokeweight="1.5pt">
+                      <v:stroke joinstyle="miter"/>
+                    </v:shape>
+                  </w:pict>
+                </mc:Fallback>
+              </mc:AlternateContent>
+            </w:r>
+            <w:r>
+              <w:rPr>
+                <w:noProof/>
+              </w:rPr>
+              <mc:AlternateContent>
+                <mc:Choice Requires="wps">
+                  <w:drawing>
+                    <wp:anchor distT="0" distB="0" distL="114300" distR="114300" simplePos="0" relativeHeight="251667466" behindDoc="0" locked="0" layoutInCell="1" allowOverlap="1" wp14:anchorId="6026D869" wp14:editId="4273DC52">
+                      <wp:simplePos x="0" y="0"/>
+                      <wp:positionH relativeFrom="column">
+                        <wp:posOffset>1957070</wp:posOffset>
+                      </wp:positionH>
+                      <wp:positionV relativeFrom="paragraph">
+                        <wp:posOffset>1633855</wp:posOffset>
+                      </wp:positionV>
+                      <wp:extent cx="158750" cy="209550"/>
+                      <wp:effectExtent l="0" t="0" r="12700" b="19050"/>
+                      <wp:wrapNone/>
+                      <wp:docPr id="1914503512" name="Flowchart: Connector 3"/>
+                      <wp:cNvGraphicFramePr/>
+                      <a:graphic xmlns:a="http://schemas.openxmlformats.org/drawingml/2006/main">
+                        <a:graphicData uri="http://schemas.microsoft.com/office/word/2010/wordprocessingShape">
+                          <wps:wsp>
+                            <wps:cNvSpPr/>
+                            <wps:spPr>
+                              <a:xfrm>
+                                <a:off x="0" y="0"/>
+                                <a:ext cx="158750" cy="209550"/>
+                              </a:xfrm>
+                              <a:prstGeom prst="flowChartConnector">
+                                <a:avLst/>
+                              </a:prstGeom>
+                              <a:noFill/>
+                              <a:ln w="19050">
+                                <a:solidFill>
+                                  <a:srgbClr val="FF0000"/>
+                                </a:solidFill>
+                              </a:ln>
+                            </wps:spPr>
+                            <wps:style>
+                              <a:lnRef idx="2">
+                                <a:schemeClr val="accent1">
+                                  <a:shade val="15000"/>
+                                </a:schemeClr>
+                              </a:lnRef>
+                              <a:fillRef idx="1">
+                                <a:schemeClr val="accent1"/>
+                              </a:fillRef>
+                              <a:effectRef idx="0">
+                                <a:schemeClr val="accent1"/>
+                              </a:effectRef>
+                              <a:fontRef idx="minor">
+                                <a:schemeClr val="lt1"/>
+                              </a:fontRef>
+                            </wps:style>
+                            <wps:bodyPr rot="0" spcFirstLastPara="0" vertOverflow="overflow" horzOverflow="overflow" vert="horz" wrap="square" lIns="91440" tIns="45720" rIns="91440" bIns="45720" numCol="1" spcCol="0" rtlCol="0" fromWordArt="0" anchor="ctr" anchorCtr="0" forceAA="0" compatLnSpc="1">
+                              <a:prstTxWarp prst="textNoShape">
+                                <a:avLst/>
+                              </a:prstTxWarp>
+                              <a:noAutofit/>
+                            </wps:bodyPr>
+                          </wps:wsp>
+                        </a:graphicData>
+                      </a:graphic>
+                    </wp:anchor>
+                  </w:drawing>
+                </mc:Choice>
+                <mc:Fallback>
+                  <w:pict>
+                    <v:shape w14:anchorId="0727FC1F" id="Flowchart: Connector 3" o:spid="_x0000_s1026" type="#_x0000_t120" style="position:absolute;margin-left:154.1pt;margin-top:128.65pt;width:12.5pt;height:16.5pt;z-index:251667466;visibility:visible;mso-wrap-style:square;mso-wrap-distance-left:9pt;mso-wrap-distance-top:0;mso-wrap-distance-right:9pt;mso-wrap-distance-bottom:0;mso-position-horizontal:absolute;mso-position-horizontal-relative:text;mso-position-vertical:absolute;mso-position-vertical-relative:text;v-text-anchor:middle" o:gfxdata="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" filled="f" strokecolor="red" strokeweight="1.5pt">
+                      <v:stroke joinstyle="miter"/>
+                    </v:shape>
+                  </w:pict>
+                </mc:Fallback>
+              </mc:AlternateContent>
+            </w:r>
+            <w:r>
+              <w:rPr>
+                <w:noProof/>
+              </w:rPr>
+              <mc:AlternateContent>
+                <mc:Choice Requires="wps">
+                  <w:drawing>
+                    <wp:anchor distT="0" distB="0" distL="114300" distR="114300" simplePos="0" relativeHeight="251666442" behindDoc="0" locked="0" layoutInCell="1" allowOverlap="1" wp14:anchorId="07E3A020" wp14:editId="3A53F892">
+                      <wp:simplePos x="0" y="0"/>
+                      <wp:positionH relativeFrom="column">
+                        <wp:posOffset>2141220</wp:posOffset>
+                      </wp:positionH>
+                      <wp:positionV relativeFrom="paragraph">
+                        <wp:posOffset>687705</wp:posOffset>
+                      </wp:positionV>
+                      <wp:extent cx="209550" cy="215900"/>
+                      <wp:effectExtent l="0" t="0" r="19050" b="12700"/>
+                      <wp:wrapNone/>
+                      <wp:docPr id="732644896" name="Flowchart: Connector 2"/>
+                      <wp:cNvGraphicFramePr/>
+                      <a:graphic xmlns:a="http://schemas.openxmlformats.org/drawingml/2006/main">
+                        <a:graphicData uri="http://schemas.microsoft.com/office/word/2010/wordprocessingShape">
+                          <wps:wsp>
+                            <wps:cNvSpPr/>
+                            <wps:spPr>
+                              <a:xfrm>
+                                <a:off x="0" y="0"/>
+                                <a:ext cx="209550" cy="215900"/>
+                              </a:xfrm>
+                              <a:prstGeom prst="flowChartConnector">
+                                <a:avLst/>
+                              </a:prstGeom>
+                              <a:noFill/>
+                              <a:ln w="19050">
+                                <a:solidFill>
+                                  <a:srgbClr val="FF0000"/>
+                                </a:solidFill>
+                              </a:ln>
+                            </wps:spPr>
+                            <wps:style>
+                              <a:lnRef idx="2">
+                                <a:schemeClr val="accent1">
+                                  <a:shade val="15000"/>
+                                </a:schemeClr>
+                              </a:lnRef>
+                              <a:fillRef idx="1">
+                                <a:schemeClr val="accent1"/>
+                              </a:fillRef>
+                              <a:effectRef idx="0">
+                                <a:schemeClr val="accent1"/>
+                              </a:effectRef>
+                              <a:fontRef idx="minor">
+                                <a:schemeClr val="lt1"/>
+                              </a:fontRef>
+                            </wps:style>
+                            <wps:bodyPr rot="0" spcFirstLastPara="0" vertOverflow="overflow" horzOverflow="overflow" vert="horz" wrap="square" lIns="91440" tIns="45720" rIns="91440" bIns="45720" numCol="1" spcCol="0" rtlCol="0" fromWordArt="0" anchor="ctr" anchorCtr="0" forceAA="0" compatLnSpc="1">
+                              <a:prstTxWarp prst="textNoShape">
+                                <a:avLst/>
+                              </a:prstTxWarp>
+                              <a:noAutofit/>
+                            </wps:bodyPr>
+                          </wps:wsp>
+                        </a:graphicData>
+                      </a:graphic>
+                      <wp14:sizeRelH relativeFrom="margin">
+                        <wp14:pctWidth>0</wp14:pctWidth>
+                      </wp14:sizeRelH>
+                      <wp14:sizeRelV relativeFrom="margin">
+                        <wp14:pctHeight>0</wp14:pctHeight>
+                      </wp14:sizeRelV>
+                    </wp:anchor>
+                  </w:drawing>
+                </mc:Choice>
+                <mc:Fallback>
+                  <w:pict>
+                    <v:shape w14:anchorId="57AF8FFC" id="Flowchart: Connector 2" o:spid="_x0000_s1026" type="#_x0000_t120" style="position:absolute;margin-left:168.6pt;margin-top:54.15pt;width:16.5pt;height:17pt;z-index:251666442;visibility:visible;mso-wrap-style:square;mso-width-percent:0;mso-height-percent:0;mso-wrap-distance-left:9pt;mso-wrap-distance-top:0;mso-wrap-distance-right:9pt;mso-wrap-distance-bottom:0;mso-position-horizontal:absolute;mso-position-horizontal-relative:text;mso-position-vertical:absolute;mso-position-vertical-relative:text;mso-width-percent:0;mso-height-percent:0;mso-width-relative:margin;mso-height-relative:margin;v-text-anchor:middle" o:gfxdata="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" filled="f" strokecolor="red" strokeweight="1.5pt">
+                      <v:stroke joinstyle="miter"/>
+                    </v:shape>
+                  </w:pict>
+                </mc:Fallback>
+              </mc:AlternateContent>
+            </w:r>
+            <w:r>
+              <w:rPr>
+                <w:noProof/>
+              </w:rPr>
+              <mc:AlternateContent>
+                <mc:Choice Requires="wps">
+                  <w:drawing>
+                    <wp:anchor distT="0" distB="0" distL="114300" distR="114300" simplePos="0" relativeHeight="251665418" behindDoc="0" locked="0" layoutInCell="1" allowOverlap="1" wp14:anchorId="29B987A0" wp14:editId="0ADC45EB">
+                      <wp:simplePos x="0" y="0"/>
+                      <wp:positionH relativeFrom="column">
+                        <wp:posOffset>477994</wp:posOffset>
+                      </wp:positionH>
+                      <wp:positionV relativeFrom="paragraph">
+                        <wp:posOffset>1017905</wp:posOffset>
+                      </wp:positionV>
+                      <wp:extent cx="184150" cy="196850"/>
+                      <wp:effectExtent l="0" t="0" r="25400" b="12700"/>
+                      <wp:wrapNone/>
+                      <wp:docPr id="571273183" name="Flowchart: Connector 1"/>
+                      <wp:cNvGraphicFramePr/>
+                      <a:graphic xmlns:a="http://schemas.openxmlformats.org/drawingml/2006/main">
+                        <a:graphicData uri="http://schemas.microsoft.com/office/word/2010/wordprocessingShape">
+                          <wps:wsp>
+                            <wps:cNvSpPr/>
+                            <wps:spPr>
+                              <a:xfrm>
+                                <a:off x="0" y="0"/>
+                                <a:ext cx="184150" cy="196850"/>
+                              </a:xfrm>
+                              <a:prstGeom prst="flowChartConnector">
+                                <a:avLst/>
+                              </a:prstGeom>
+                              <a:noFill/>
+                              <a:ln w="19050">
+                                <a:solidFill>
+                                  <a:srgbClr val="FF0000"/>
+                                </a:solidFill>
+                              </a:ln>
+                            </wps:spPr>
+                            <wps:style>
+                              <a:lnRef idx="2">
+                                <a:schemeClr val="accent1">
+                                  <a:shade val="15000"/>
+                                </a:schemeClr>
+                              </a:lnRef>
+                              <a:fillRef idx="1">
+                                <a:schemeClr val="accent1"/>
+                              </a:fillRef>
+                              <a:effectRef idx="0">
+                                <a:schemeClr val="accent1"/>
+                              </a:effectRef>
+                              <a:fontRef idx="minor">
+                                <a:schemeClr val="lt1"/>
+                              </a:fontRef>
+                            </wps:style>
+                            <wps:bodyPr rot="0" spcFirstLastPara="0" vertOverflow="overflow" horzOverflow="overflow" vert="horz" wrap="square" lIns="91440" tIns="45720" rIns="91440" bIns="45720" numCol="1" spcCol="0" rtlCol="0" fromWordArt="0" anchor="ctr" anchorCtr="0" forceAA="0" compatLnSpc="1">
+                              <a:prstTxWarp prst="textNoShape">
+                                <a:avLst/>
+                              </a:prstTxWarp>
+                              <a:noAutofit/>
+                            </wps:bodyPr>
+                          </wps:wsp>
+                        </a:graphicData>
+                      </a:graphic>
+                      <wp14:sizeRelH relativeFrom="margin">
+                        <wp14:pctWidth>0</wp14:pctWidth>
+                      </wp14:sizeRelH>
+                      <wp14:sizeRelV relativeFrom="margin">
+                        <wp14:pctHeight>0</wp14:pctHeight>
+                      </wp14:sizeRelV>
+                    </wp:anchor>
+                  </w:drawing>
+                </mc:Choice>
+                <mc:Fallback>
+                  <w:pict>
+                    <v:shape w14:anchorId="4EB5EE27" id="Flowchart: Connector 1" o:spid="_x0000_s1026" type="#_x0000_t120" style="position:absolute;margin-left:37.65pt;margin-top:80.15pt;width:14.5pt;height:15.5pt;z-index:251665418;visibility:visible;mso-wrap-style:square;mso-width-percent:0;mso-height-percent:0;mso-wrap-distance-left:9pt;mso-wrap-distance-top:0;mso-wrap-distance-right:9pt;mso-wrap-distance-bottom:0;mso-position-horizontal:absolute;mso-position-horizontal-relative:text;mso-position-vertical:absolute;mso-position-vertical-relative:text;mso-width-percent:0;mso-height-percent:0;mso-width-relative:margin;mso-height-relative:margin;v-text-anchor:middle" o:gfxdata="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" filled="f" strokecolor="red" strokeweight="1.5pt">
+                      <v:stroke joinstyle="miter"/>
+                    </v:shape>
+                  </w:pict>
+                </mc:Fallback>
+              </mc:AlternateContent>
+            </w:r>
+            <w:r>
+              <w:rPr>
+                <w:noProof/>
+              </w:rPr>
+              <w:drawing>
+                <wp:inline distT="0" distB="0" distL="0" distR="0" wp14:anchorId="6115741A" wp14:editId="0F13F6B2">
+                  <wp:extent cx="1876425" cy="2495550"/>
+                  <wp:effectExtent l="0" t="0" r="0" b="0"/>
+                  <wp:docPr id="221290188" name="Picture 221290188"/>
+                  <wp:cNvGraphicFramePr>
+                    <a:graphicFrameLocks xmlns:a="http://schemas.openxmlformats.org/drawingml/2006/main" noChangeAspect="1"/>
+                  </wp:cNvGraphicFramePr>
+                  <a:graphic xmlns:a="http://schemas.openxmlformats.org/drawingml/2006/main">
+                    <a:graphicData uri="http://schemas.openxmlformats.org/drawingml/2006/picture">
+                      <pic:pic xmlns:pic="http://schemas.openxmlformats.org/drawingml/2006/picture">
+                        <pic:nvPicPr>
+                          <pic:cNvPr id="0" name=""/>
+                          <pic:cNvPicPr/>
+                        </pic:nvPicPr>
+                        <pic:blipFill>
+                          <a:blip r:embed="rId19" cstate="print">
+                            <a:extLst>
+                              <a:ext uri="{28A0092B-C50C-407E-A947-70E740481C1C}">
+                                <a14:useLocalDpi xmlns:a14="http://schemas.microsoft.com/office/drawing/2010/main" val="0"/>
+                              </a:ext>
+                            </a:extLst>
+                          </a:blip>
+                          <a:stretch>
+                            <a:fillRect/>
+                          </a:stretch>
+                        </pic:blipFill>
+                        <pic:spPr>
+                          <a:xfrm>
+                            <a:off x="0" y="0"/>
+                            <a:ext cx="1876425" cy="2495550"/>
+                          </a:xfrm>
+                          <a:prstGeom prst="rect">
+                            <a:avLst/>
+                          </a:prstGeom>
+                        </pic:spPr>
+                      </pic:pic>
+                    </a:graphicData>
+                  </a:graphic>
+                </wp:inline>
+              </w:drawing>
+            </w:r>
           </w:p>
         </w:tc>
       </w:tr>
     </w:tbl>
+    <w:bookmarkEnd w:id="0"/>
     <w:bookmarkEnd w:id="1"/>
     <w:p>
       <w:pPr>
@@ -1528,17 +1389,1330 @@
     <w:tbl>
       <w:tblPr>
         <w:tblStyle w:val="TableGrid"/>
-        <w:tblW w:w="9374" w:type="dxa"/>
+        <w:tblW w:w="5000" w:type="pct"/>
+        <w:tblLook w:val="06A0" w:firstRow="1" w:lastRow="0" w:firstColumn="1" w:lastColumn="0" w:noHBand="1" w:noVBand="1"/>
+      </w:tblPr>
+      <w:tblGrid>
+        <w:gridCol w:w="4711"/>
+        <w:gridCol w:w="4639"/>
+      </w:tblGrid>
+      <w:tr>
+        <w:trPr>
+          <w:trHeight w:val="300"/>
+        </w:trPr>
+        <w:tc>
+          <w:tcPr>
+            <w:tcW w:w="2519" w:type="pct"/>
+          </w:tcPr>
+          <w:p>
+            <w:pPr>
+              <w:numPr>
+                <w:ilvl w:val="0"/>
+                <w:numId w:val="13"/>
+              </w:numPr>
+              <w:spacing w:after="200" w:line="276" w:lineRule="auto"/>
+              <w:rPr>
+                <w:sz w:val="24"/>
+                <w:szCs w:val="24"/>
+              </w:rPr>
+            </w:pPr>
+            <w:r>
+              <w:rPr>
+                <w:sz w:val="24"/>
+                <w:szCs w:val="24"/>
+              </w:rPr>
+              <w:t xml:space="preserve">This part is difficult, as you will need to separate the grey bottom from the toy by prying the plastic apart. </w:t>
+            </w:r>
+          </w:p>
+          <w:p>
+            <w:pPr>
+              <w:numPr>
+                <w:ilvl w:val="0"/>
+                <w:numId w:val="13"/>
+              </w:numPr>
+              <w:spacing w:after="200" w:line="276" w:lineRule="auto"/>
+            </w:pPr>
+            <w:r>
+              <w:rPr>
+                <w:sz w:val="24"/>
+                <w:szCs w:val="24"/>
+              </w:rPr>
+              <w:t>Using a screwdriver, you will wedge the screwdriver between the grey plastic bottom and white plastic compartment. While doing this, try to wiggle the grey plastic bottom free, moving the screwdriver around all sides.</w:t>
+            </w:r>
+            <w:r>
+              <w:t xml:space="preserve"> </w:t>
+            </w:r>
+          </w:p>
+        </w:tc>
+        <w:tc>
+          <w:tcPr>
+            <w:tcW w:w="2481" w:type="pct"/>
+          </w:tcPr>
+          <w:p>
+            <w:pPr>
+              <w:spacing w:after="200" w:line="276" w:lineRule="auto"/>
+              <w:jc w:val="center"/>
+            </w:pPr>
+            <w:r>
+              <w:rPr>
+                <w:noProof/>
+              </w:rPr>
+              <w:drawing>
+                <wp:inline distT="0" distB="0" distL="0" distR="0" wp14:anchorId="5C12AC4A" wp14:editId="53687AA8">
+                  <wp:extent cx="2058698" cy="2745105"/>
+                  <wp:effectExtent l="0" t="0" r="0" b="0"/>
+                  <wp:docPr id="295052315" name="Picture 5" descr="A close up of a device&#10;&#10;Description automatically generated"/>
+                  <wp:cNvGraphicFramePr>
+                    <a:graphicFrameLocks xmlns:a="http://schemas.openxmlformats.org/drawingml/2006/main" noChangeAspect="1"/>
+                  </wp:cNvGraphicFramePr>
+                  <a:graphic xmlns:a="http://schemas.openxmlformats.org/drawingml/2006/main">
+                    <a:graphicData uri="http://schemas.openxmlformats.org/drawingml/2006/picture">
+                      <pic:pic xmlns:pic="http://schemas.openxmlformats.org/drawingml/2006/picture">
+                        <pic:nvPicPr>
+                          <pic:cNvPr id="144161822" name="Picture 5" descr="A close up of a device&#10;&#10;Description automatically generated"/>
+                          <pic:cNvPicPr/>
+                        </pic:nvPicPr>
+                        <pic:blipFill>
+                          <a:blip r:embed="rId20" cstate="print">
+                            <a:extLst>
+                              <a:ext uri="{28A0092B-C50C-407E-A947-70E740481C1C}">
+                                <a14:useLocalDpi xmlns:a14="http://schemas.microsoft.com/office/drawing/2010/main" val="0"/>
+                              </a:ext>
+                            </a:extLst>
+                          </a:blip>
+                          <a:stretch>
+                            <a:fillRect/>
+                          </a:stretch>
+                        </pic:blipFill>
+                        <pic:spPr>
+                          <a:xfrm>
+                            <a:off x="0" y="0"/>
+                            <a:ext cx="2060752" cy="2747844"/>
+                          </a:xfrm>
+                          <a:prstGeom prst="rect">
+                            <a:avLst/>
+                          </a:prstGeom>
+                        </pic:spPr>
+                      </pic:pic>
+                    </a:graphicData>
+                  </a:graphic>
+                </wp:inline>
+              </w:drawing>
+            </w:r>
+          </w:p>
+        </w:tc>
+      </w:tr>
+    </w:tbl>
+    <w:p>
+      <w:pPr>
+        <w:pStyle w:val="Heading2"/>
+      </w:pPr>
+      <w:r>
+        <w:t>Step 4</w:t>
+      </w:r>
+    </w:p>
+    <w:tbl>
+      <w:tblPr>
+        <w:tblStyle w:val="TableGrid"/>
+        <w:tblW w:w="5000" w:type="pct"/>
+        <w:tblLook w:val="06A0" w:firstRow="1" w:lastRow="0" w:firstColumn="1" w:lastColumn="0" w:noHBand="1" w:noVBand="1"/>
+      </w:tblPr>
+      <w:tblGrid>
+        <w:gridCol w:w="4711"/>
+        <w:gridCol w:w="4639"/>
+      </w:tblGrid>
+      <w:tr>
+        <w:trPr>
+          <w:trHeight w:val="300"/>
+        </w:trPr>
+        <w:tc>
+          <w:tcPr>
+            <w:tcW w:w="2519" w:type="pct"/>
+          </w:tcPr>
+          <w:p>
+            <w:pPr>
+              <w:pStyle w:val="ListParagraph"/>
+              <w:numPr>
+                <w:ilvl w:val="0"/>
+                <w:numId w:val="13"/>
+              </w:numPr>
+            </w:pPr>
+            <w:r>
+              <w:t>This toy is adapted by a cable, so must make an entry point for the cable and thread it through, before we solder it onto the board</w:t>
+            </w:r>
+          </w:p>
+          <w:p>
+            <w:pPr>
+              <w:numPr>
+                <w:ilvl w:val="0"/>
+                <w:numId w:val="13"/>
+              </w:numPr>
+              <w:spacing w:after="200" w:line="276" w:lineRule="auto"/>
+            </w:pPr>
+            <w:r>
+              <w:t xml:space="preserve">Drill a hole into the plastic to thread the cable through. The hole can be made at the back of the toy, just above and to the side of the square hole. Make sure to be about 2 </w:t>
+            </w:r>
+            <w:proofErr w:type="spellStart"/>
+            <w:r>
+              <w:t>cms</w:t>
+            </w:r>
+            <w:proofErr w:type="spellEnd"/>
+            <w:r>
+              <w:t xml:space="preserve"> from the bottom of the toy so the cable does not interfere with the plastic parts when reassembled </w:t>
+            </w:r>
+          </w:p>
+        </w:tc>
+        <w:tc>
+          <w:tcPr>
+            <w:tcW w:w="2481" w:type="pct"/>
+          </w:tcPr>
+          <w:p>
+            <w:pPr>
+              <w:spacing w:after="200" w:line="276" w:lineRule="auto"/>
+              <w:jc w:val="center"/>
+            </w:pPr>
+            <w:r>
+              <w:rPr>
+                <w:noProof/>
+              </w:rPr>
+              <w:drawing>
+                <wp:inline distT="0" distB="0" distL="0" distR="0" wp14:anchorId="3A5DE5B3" wp14:editId="3F41DE77">
+                  <wp:extent cx="2506345" cy="3342005"/>
+                  <wp:effectExtent l="0" t="0" r="8255" b="0"/>
+                  <wp:docPr id="30299131" name="Picture 4" descr="A close up of a stuffed animal&#10;&#10;Description automatically generated"/>
+                  <wp:cNvGraphicFramePr>
+                    <a:graphicFrameLocks xmlns:a="http://schemas.openxmlformats.org/drawingml/2006/main" noChangeAspect="1"/>
+                  </wp:cNvGraphicFramePr>
+                  <a:graphic xmlns:a="http://schemas.openxmlformats.org/drawingml/2006/main">
+                    <a:graphicData uri="http://schemas.openxmlformats.org/drawingml/2006/picture">
+                      <pic:pic xmlns:pic="http://schemas.openxmlformats.org/drawingml/2006/picture">
+                        <pic:nvPicPr>
+                          <pic:cNvPr id="16857078" name="Picture 4" descr="A close up of a stuffed animal&#10;&#10;Description automatically generated"/>
+                          <pic:cNvPicPr/>
+                        </pic:nvPicPr>
+                        <pic:blipFill>
+                          <a:blip r:embed="rId21" cstate="print">
+                            <a:extLst>
+                              <a:ext uri="{28A0092B-C50C-407E-A947-70E740481C1C}">
+                                <a14:useLocalDpi xmlns:a14="http://schemas.microsoft.com/office/drawing/2010/main" val="0"/>
+                              </a:ext>
+                            </a:extLst>
+                          </a:blip>
+                          <a:stretch>
+                            <a:fillRect/>
+                          </a:stretch>
+                        </pic:blipFill>
+                        <pic:spPr>
+                          <a:xfrm>
+                            <a:off x="0" y="0"/>
+                            <a:ext cx="2506345" cy="3342005"/>
+                          </a:xfrm>
+                          <a:prstGeom prst="rect">
+                            <a:avLst/>
+                          </a:prstGeom>
+                        </pic:spPr>
+                      </pic:pic>
+                    </a:graphicData>
+                  </a:graphic>
+                </wp:inline>
+              </w:drawing>
+            </w:r>
+          </w:p>
+        </w:tc>
+      </w:tr>
+    </w:tbl>
+    <w:p/>
+    <w:p/>
+    <w:p>
+      <w:pPr>
+        <w:pStyle w:val="Heading2"/>
+      </w:pPr>
+      <w:r>
+        <w:lastRenderedPageBreak/>
+        <w:t>Step 5</w:t>
+      </w:r>
+    </w:p>
+    <w:tbl>
+      <w:tblPr>
+        <w:tblStyle w:val="TableGrid"/>
+        <w:tblW w:w="5000" w:type="pct"/>
+        <w:tblLook w:val="06A0" w:firstRow="1" w:lastRow="0" w:firstColumn="1" w:lastColumn="0" w:noHBand="1" w:noVBand="1"/>
+      </w:tblPr>
+      <w:tblGrid>
+        <w:gridCol w:w="4711"/>
+        <w:gridCol w:w="4639"/>
+      </w:tblGrid>
+      <w:tr>
+        <w:trPr>
+          <w:trHeight w:val="300"/>
+        </w:trPr>
+        <w:tc>
+          <w:tcPr>
+            <w:tcW w:w="2519" w:type="pct"/>
+          </w:tcPr>
+          <w:p>
+            <w:pPr>
+              <w:numPr>
+                <w:ilvl w:val="0"/>
+                <w:numId w:val="13"/>
+              </w:numPr>
+              <w:rPr>
+                <w:sz w:val="24"/>
+                <w:szCs w:val="24"/>
+              </w:rPr>
+            </w:pPr>
+            <w:r>
+              <w:rPr>
+                <w:sz w:val="24"/>
+                <w:szCs w:val="24"/>
+              </w:rPr>
+              <w:t xml:space="preserve">You can lay the penguin on its side, leaving the grey bottom flat on the table which will give you space to work with the circuit board. </w:t>
+            </w:r>
+          </w:p>
+          <w:p>
+            <w:pPr>
+              <w:numPr>
+                <w:ilvl w:val="0"/>
+                <w:numId w:val="13"/>
+              </w:numPr>
+            </w:pPr>
+            <w:r>
+              <w:rPr>
+                <w:sz w:val="24"/>
+                <w:szCs w:val="24"/>
+              </w:rPr>
+              <w:t xml:space="preserve">The cable is threaded through the hole, and you can now add some solder to the ends of your internal cable wires. This will make it easier to attach to the board </w:t>
+            </w:r>
+          </w:p>
+        </w:tc>
+        <w:tc>
+          <w:tcPr>
+            <w:tcW w:w="2481" w:type="pct"/>
+          </w:tcPr>
+          <w:p>
+            <w:pPr>
+              <w:spacing w:line="276" w:lineRule="auto"/>
+              <w:jc w:val="center"/>
+            </w:pPr>
+            <w:r>
+              <w:rPr>
+                <w:noProof/>
+              </w:rPr>
+              <w:drawing>
+                <wp:inline distT="0" distB="0" distL="0" distR="0" wp14:anchorId="0BB563EF" wp14:editId="6E862328">
+                  <wp:extent cx="1995805" cy="2490647"/>
+                  <wp:effectExtent l="0" t="0" r="4445" b="5080"/>
+                  <wp:docPr id="424736635" name="Picture 3" descr="A round object with wires and wires&#10;&#10;Description automatically generated"/>
+                  <wp:cNvGraphicFramePr>
+                    <a:graphicFrameLocks xmlns:a="http://schemas.openxmlformats.org/drawingml/2006/main" noChangeAspect="1"/>
+                  </wp:cNvGraphicFramePr>
+                  <a:graphic xmlns:a="http://schemas.openxmlformats.org/drawingml/2006/main">
+                    <a:graphicData uri="http://schemas.openxmlformats.org/drawingml/2006/picture">
+                      <pic:pic xmlns:pic="http://schemas.openxmlformats.org/drawingml/2006/picture">
+                        <pic:nvPicPr>
+                          <pic:cNvPr id="1104802732" name="Picture 3" descr="A round object with wires and wires&#10;&#10;Description automatically generated"/>
+                          <pic:cNvPicPr/>
+                        </pic:nvPicPr>
+                        <pic:blipFill rotWithShape="1">
+                          <a:blip r:embed="rId22" cstate="print">
+                            <a:extLst>
+                              <a:ext uri="{28A0092B-C50C-407E-A947-70E740481C1C}">
+                                <a14:useLocalDpi xmlns:a14="http://schemas.microsoft.com/office/drawing/2010/main" val="0"/>
+                              </a:ext>
+                            </a:extLst>
+                          </a:blip>
+                          <a:srcRect t="6411"/>
+                          <a:stretch>
+                            <a:fillRect/>
+                          </a:stretch>
+                        </pic:blipFill>
+                        <pic:spPr bwMode="auto">
+                          <a:xfrm>
+                            <a:off x="0" y="0"/>
+                            <a:ext cx="2011775" cy="2510577"/>
+                          </a:xfrm>
+                          <a:prstGeom prst="rect">
+                            <a:avLst/>
+                          </a:prstGeom>
+                          <a:ln>
+                            <a:noFill/>
+                          </a:ln>
+                          <a:extLst>
+                            <a:ext uri="{53640926-AAD7-44D8-BBD7-CCE9431645EC}">
+                              <a14:shadowObscured xmlns:a14="http://schemas.microsoft.com/office/drawing/2010/main"/>
+                            </a:ext>
+                          </a:extLst>
+                        </pic:spPr>
+                      </pic:pic>
+                    </a:graphicData>
+                  </a:graphic>
+                </wp:inline>
+              </w:drawing>
+            </w:r>
+          </w:p>
+        </w:tc>
+      </w:tr>
+    </w:tbl>
+    <w:p>
+      <w:pPr>
+        <w:pStyle w:val="Heading2"/>
+      </w:pPr>
+      <w:r>
+        <w:t>Step 6</w:t>
+      </w:r>
+    </w:p>
+    <w:tbl>
+      <w:tblPr>
+        <w:tblStyle w:val="TableGrid"/>
+        <w:tblW w:w="5000" w:type="pct"/>
+        <w:tblLook w:val="06A0" w:firstRow="1" w:lastRow="0" w:firstColumn="1" w:lastColumn="0" w:noHBand="1" w:noVBand="1"/>
+      </w:tblPr>
+      <w:tblGrid>
+        <w:gridCol w:w="5098"/>
+        <w:gridCol w:w="4252"/>
+      </w:tblGrid>
+      <w:tr>
+        <w:trPr>
+          <w:trHeight w:val="300"/>
+        </w:trPr>
+        <w:tc>
+          <w:tcPr>
+            <w:tcW w:w="2726" w:type="pct"/>
+          </w:tcPr>
+          <w:p>
+            <w:pPr>
+              <w:numPr>
+                <w:ilvl w:val="0"/>
+                <w:numId w:val="13"/>
+              </w:numPr>
+            </w:pPr>
+            <w:r>
+              <w:t xml:space="preserve">Your internal cable wires will now be soldered onto the board. </w:t>
+            </w:r>
+          </w:p>
+          <w:p>
+            <w:pPr>
+              <w:numPr>
+                <w:ilvl w:val="0"/>
+                <w:numId w:val="13"/>
+              </w:numPr>
+            </w:pPr>
+            <w:r>
+              <w:t xml:space="preserve">Connect one wire to each spot on the board – circled in red. </w:t>
+            </w:r>
+          </w:p>
+          <w:p>
+            <w:pPr>
+              <w:numPr>
+                <w:ilvl w:val="0"/>
+                <w:numId w:val="13"/>
+              </w:numPr>
+            </w:pPr>
+            <w:r>
+              <w:t xml:space="preserve">It does not matter what wire is attached to what spot but make sure the original wires also stay in that spot </w:t>
+            </w:r>
+          </w:p>
+          <w:p>
+            <w:pPr>
+              <w:numPr>
+                <w:ilvl w:val="0"/>
+                <w:numId w:val="13"/>
+              </w:numPr>
+            </w:pPr>
+            <w:r>
+              <w:t>Each spot on the board – circled in red – will have one new wire from the cable and one original wire</w:t>
+            </w:r>
+          </w:p>
+          <w:p>
+            <w:pPr>
+              <w:numPr>
+                <w:ilvl w:val="0"/>
+                <w:numId w:val="13"/>
+              </w:numPr>
+              <w:jc w:val="both"/>
+            </w:pPr>
+            <w:r>
+              <w:t xml:space="preserve">Make sure to keep the solder on each spot, and not to connect any of the spots on the board together </w:t>
+            </w:r>
+          </w:p>
+          <w:p>
+            <w:pPr>
+              <w:pStyle w:val="ListParagraph"/>
+              <w:numPr>
+                <w:ilvl w:val="0"/>
+                <w:numId w:val="13"/>
+              </w:numPr>
+            </w:pPr>
+            <w:r>
+              <w:t>When complete, use an assistive switch to test the toy (you will also need to add batteries for testing)</w:t>
+            </w:r>
+          </w:p>
+        </w:tc>
+        <w:tc>
+          <w:tcPr>
+            <w:tcW w:w="2274" w:type="pct"/>
+          </w:tcPr>
+          <w:p>
+            <w:pPr>
+              <w:spacing w:after="200" w:line="276" w:lineRule="auto"/>
+            </w:pPr>
+            <w:r>
+              <w:rPr>
+                <w:noProof/>
+              </w:rPr>
+              <w:drawing>
+                <wp:anchor distT="0" distB="0" distL="114300" distR="114300" simplePos="0" relativeHeight="251670538" behindDoc="1" locked="0" layoutInCell="1" allowOverlap="1" wp14:anchorId="34AF24CD" wp14:editId="57144BBC">
+                  <wp:simplePos x="0" y="0"/>
+                  <wp:positionH relativeFrom="column">
+                    <wp:posOffset>14605</wp:posOffset>
+                  </wp:positionH>
+                  <wp:positionV relativeFrom="paragraph">
+                    <wp:posOffset>199390</wp:posOffset>
+                  </wp:positionV>
+                  <wp:extent cx="2506345" cy="1879600"/>
+                  <wp:effectExtent l="0" t="0" r="8255" b="6350"/>
+                  <wp:wrapTight wrapText="bothSides">
+                    <wp:wrapPolygon edited="0">
+                      <wp:start x="0" y="0"/>
+                      <wp:lineTo x="0" y="21454"/>
+                      <wp:lineTo x="21507" y="21454"/>
+                      <wp:lineTo x="21507" y="0"/>
+                      <wp:lineTo x="0" y="0"/>
+                    </wp:wrapPolygon>
+                  </wp:wrapTight>
+                  <wp:docPr id="383155736" name="Picture 2" descr="A green circuit board with black wires&#10;&#10;Description automatically generated"/>
+                  <wp:cNvGraphicFramePr>
+                    <a:graphicFrameLocks xmlns:a="http://schemas.openxmlformats.org/drawingml/2006/main" noChangeAspect="1"/>
+                  </wp:cNvGraphicFramePr>
+                  <a:graphic xmlns:a="http://schemas.openxmlformats.org/drawingml/2006/main">
+                    <a:graphicData uri="http://schemas.openxmlformats.org/drawingml/2006/picture">
+                      <pic:pic xmlns:pic="http://schemas.openxmlformats.org/drawingml/2006/picture">
+                        <pic:nvPicPr>
+                          <pic:cNvPr id="1339848966" name="Picture 2" descr="A green circuit board with black wires&#10;&#10;Description automatically generated"/>
+                          <pic:cNvPicPr/>
+                        </pic:nvPicPr>
+                        <pic:blipFill>
+                          <a:blip r:embed="rId23" cstate="print">
+                            <a:extLst>
+                              <a:ext uri="{28A0092B-C50C-407E-A947-70E740481C1C}">
+                                <a14:useLocalDpi xmlns:a14="http://schemas.microsoft.com/office/drawing/2010/main" val="0"/>
+                              </a:ext>
+                            </a:extLst>
+                          </a:blip>
+                          <a:stretch>
+                            <a:fillRect/>
+                          </a:stretch>
+                        </pic:blipFill>
+                        <pic:spPr>
+                          <a:xfrm>
+                            <a:off x="0" y="0"/>
+                            <a:ext cx="2506345" cy="1879600"/>
+                          </a:xfrm>
+                          <a:prstGeom prst="rect">
+                            <a:avLst/>
+                          </a:prstGeom>
+                        </pic:spPr>
+                      </pic:pic>
+                    </a:graphicData>
+                  </a:graphic>
+                </wp:anchor>
+              </w:drawing>
+            </w:r>
+            <w:r>
+              <w:rPr>
+                <w:noProof/>
+              </w:rPr>
+              <mc:AlternateContent>
+                <mc:Choice Requires="wps">
+                  <w:drawing>
+                    <wp:anchor distT="0" distB="0" distL="114300" distR="114300" simplePos="0" relativeHeight="251671562" behindDoc="0" locked="0" layoutInCell="1" allowOverlap="1" wp14:anchorId="230DF043" wp14:editId="244A726B">
+                      <wp:simplePos x="0" y="0"/>
+                      <wp:positionH relativeFrom="column">
+                        <wp:posOffset>738505</wp:posOffset>
+                      </wp:positionH>
+                      <wp:positionV relativeFrom="paragraph">
+                        <wp:posOffset>712470</wp:posOffset>
+                      </wp:positionV>
+                      <wp:extent cx="158750" cy="196850"/>
+                      <wp:effectExtent l="0" t="0" r="12700" b="12700"/>
+                      <wp:wrapNone/>
+                      <wp:docPr id="1662915266" name="Flowchart: Connector 6"/>
+                      <wp:cNvGraphicFramePr/>
+                      <a:graphic xmlns:a="http://schemas.openxmlformats.org/drawingml/2006/main">
+                        <a:graphicData uri="http://schemas.microsoft.com/office/word/2010/wordprocessingShape">
+                          <wps:wsp>
+                            <wps:cNvSpPr/>
+                            <wps:spPr>
+                              <a:xfrm>
+                                <a:off x="0" y="0"/>
+                                <a:ext cx="158750" cy="196850"/>
+                              </a:xfrm>
+                              <a:prstGeom prst="flowChartConnector">
+                                <a:avLst/>
+                              </a:prstGeom>
+                              <a:noFill/>
+                              <a:ln w="19050">
+                                <a:solidFill>
+                                  <a:srgbClr val="FF0000"/>
+                                </a:solidFill>
+                              </a:ln>
+                            </wps:spPr>
+                            <wps:style>
+                              <a:lnRef idx="2">
+                                <a:schemeClr val="accent1">
+                                  <a:shade val="15000"/>
+                                </a:schemeClr>
+                              </a:lnRef>
+                              <a:fillRef idx="1">
+                                <a:schemeClr val="accent1"/>
+                              </a:fillRef>
+                              <a:effectRef idx="0">
+                                <a:schemeClr val="accent1"/>
+                              </a:effectRef>
+                              <a:fontRef idx="minor">
+                                <a:schemeClr val="lt1"/>
+                              </a:fontRef>
+                            </wps:style>
+                            <wps:bodyPr rot="0" spcFirstLastPara="0" vertOverflow="overflow" horzOverflow="overflow" vert="horz" wrap="square" lIns="91440" tIns="45720" rIns="91440" bIns="45720" numCol="1" spcCol="0" rtlCol="0" fromWordArt="0" anchor="ctr" anchorCtr="0" forceAA="0" compatLnSpc="1">
+                              <a:prstTxWarp prst="textNoShape">
+                                <a:avLst/>
+                              </a:prstTxWarp>
+                              <a:noAutofit/>
+                            </wps:bodyPr>
+                          </wps:wsp>
+                        </a:graphicData>
+                      </a:graphic>
+                    </wp:anchor>
+                  </w:drawing>
+                </mc:Choice>
+                <mc:Fallback>
+                  <w:pict>
+                    <v:shape w14:anchorId="28C86A81" id="Flowchart: Connector 6" o:spid="_x0000_s1026" type="#_x0000_t120" style="position:absolute;margin-left:58.15pt;margin-top:56.1pt;width:12.5pt;height:15.5pt;z-index:251671562;visibility:visible;mso-wrap-style:square;mso-wrap-distance-left:9pt;mso-wrap-distance-top:0;mso-wrap-distance-right:9pt;mso-wrap-distance-bottom:0;mso-position-horizontal:absolute;mso-position-horizontal-relative:text;mso-position-vertical:absolute;mso-position-vertical-relative:text;v-text-anchor:middle" o:gfxdata="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" filled="f" strokecolor="red" strokeweight="1.5pt">
+                      <v:stroke joinstyle="miter"/>
+                    </v:shape>
+                  </w:pict>
+                </mc:Fallback>
+              </mc:AlternateContent>
+            </w:r>
+            <w:r>
+              <w:rPr>
+                <w:noProof/>
+              </w:rPr>
+              <mc:AlternateContent>
+                <mc:Choice Requires="wps">
+                  <w:drawing>
+                    <wp:anchor distT="0" distB="0" distL="114300" distR="114300" simplePos="0" relativeHeight="251672586" behindDoc="0" locked="0" layoutInCell="1" allowOverlap="1" wp14:anchorId="48BF89F7" wp14:editId="08366422">
+                      <wp:simplePos x="0" y="0"/>
+                      <wp:positionH relativeFrom="column">
+                        <wp:posOffset>891208</wp:posOffset>
+                      </wp:positionH>
+                      <wp:positionV relativeFrom="paragraph">
+                        <wp:posOffset>737983</wp:posOffset>
+                      </wp:positionV>
+                      <wp:extent cx="114300" cy="209550"/>
+                      <wp:effectExtent l="0" t="0" r="19050" b="19050"/>
+                      <wp:wrapNone/>
+                      <wp:docPr id="421654340" name="Flowchart: Connector 7"/>
+                      <wp:cNvGraphicFramePr/>
+                      <a:graphic xmlns:a="http://schemas.openxmlformats.org/drawingml/2006/main">
+                        <a:graphicData uri="http://schemas.microsoft.com/office/word/2010/wordprocessingShape">
+                          <wps:wsp>
+                            <wps:cNvSpPr/>
+                            <wps:spPr>
+                              <a:xfrm>
+                                <a:off x="0" y="0"/>
+                                <a:ext cx="114300" cy="209550"/>
+                              </a:xfrm>
+                              <a:prstGeom prst="flowChartConnector">
+                                <a:avLst/>
+                              </a:prstGeom>
+                              <a:noFill/>
+                              <a:ln w="19050">
+                                <a:solidFill>
+                                  <a:srgbClr val="FF0000"/>
+                                </a:solidFill>
+                              </a:ln>
+                            </wps:spPr>
+                            <wps:style>
+                              <a:lnRef idx="2">
+                                <a:schemeClr val="accent1">
+                                  <a:shade val="15000"/>
+                                </a:schemeClr>
+                              </a:lnRef>
+                              <a:fillRef idx="1">
+                                <a:schemeClr val="accent1"/>
+                              </a:fillRef>
+                              <a:effectRef idx="0">
+                                <a:schemeClr val="accent1"/>
+                              </a:effectRef>
+                              <a:fontRef idx="minor">
+                                <a:schemeClr val="lt1"/>
+                              </a:fontRef>
+                            </wps:style>
+                            <wps:bodyPr rot="0" spcFirstLastPara="0" vertOverflow="overflow" horzOverflow="overflow" vert="horz" wrap="square" lIns="91440" tIns="45720" rIns="91440" bIns="45720" numCol="1" spcCol="0" rtlCol="0" fromWordArt="0" anchor="ctr" anchorCtr="0" forceAA="0" compatLnSpc="1">
+                              <a:prstTxWarp prst="textNoShape">
+                                <a:avLst/>
+                              </a:prstTxWarp>
+                              <a:noAutofit/>
+                            </wps:bodyPr>
+                          </wps:wsp>
+                        </a:graphicData>
+                      </a:graphic>
+                    </wp:anchor>
+                  </w:drawing>
+                </mc:Choice>
+                <mc:Fallback>
+                  <w:pict>
+                    <v:shape w14:anchorId="37590267" id="Flowchart: Connector 7" o:spid="_x0000_s1026" type="#_x0000_t120" style="position:absolute;margin-left:70.15pt;margin-top:58.1pt;width:9pt;height:16.5pt;z-index:251672586;visibility:visible;mso-wrap-style:square;mso-wrap-distance-left:9pt;mso-wrap-distance-top:0;mso-wrap-distance-right:9pt;mso-wrap-distance-bottom:0;mso-position-horizontal:absolute;mso-position-horizontal-relative:text;mso-position-vertical:absolute;mso-position-vertical-relative:text;v-text-anchor:middle" o:gfxdata="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" filled="f" strokecolor="red" strokeweight="1.5pt">
+                      <v:stroke joinstyle="miter"/>
+                    </v:shape>
+                  </w:pict>
+                </mc:Fallback>
+              </mc:AlternateContent>
+            </w:r>
+          </w:p>
+        </w:tc>
+      </w:tr>
+    </w:tbl>
+    <w:p>
+      <w:pPr>
+        <w:pStyle w:val="Heading2"/>
+      </w:pPr>
+      <w:r>
+        <w:t>Step 7</w:t>
+      </w:r>
+    </w:p>
+    <w:tbl>
+      <w:tblPr>
+        <w:tblStyle w:val="TableGrid"/>
+        <w:tblW w:w="5000" w:type="pct"/>
+        <w:tblLook w:val="06A0" w:firstRow="1" w:lastRow="0" w:firstColumn="1" w:lastColumn="0" w:noHBand="1" w:noVBand="1"/>
+      </w:tblPr>
+      <w:tblGrid>
+        <w:gridCol w:w="4711"/>
+        <w:gridCol w:w="4639"/>
+      </w:tblGrid>
+      <w:tr>
+        <w:trPr>
+          <w:trHeight w:val="300"/>
+        </w:trPr>
+        <w:tc>
+          <w:tcPr>
+            <w:tcW w:w="2519" w:type="pct"/>
+          </w:tcPr>
+          <w:p>
+            <w:pPr>
+              <w:pStyle w:val="ListParagraph"/>
+              <w:numPr>
+                <w:ilvl w:val="0"/>
+                <w:numId w:val="13"/>
+              </w:numPr>
+              <w:rPr>
+                <w:sz w:val="24"/>
+                <w:szCs w:val="24"/>
+              </w:rPr>
+            </w:pPr>
+            <w:r>
+              <w:rPr>
+                <w:sz w:val="24"/>
+                <w:szCs w:val="24"/>
+              </w:rPr>
+              <w:t xml:space="preserve">Before reassembling, secure the small </w:t>
+            </w:r>
+            <w:r>
+              <w:rPr>
+                <w:sz w:val="24"/>
+                <w:szCs w:val="24"/>
+              </w:rPr>
+              <w:t>cable</w:t>
+            </w:r>
+            <w:r>
+              <w:rPr>
+                <w:sz w:val="24"/>
+                <w:szCs w:val="24"/>
+              </w:rPr>
+              <w:t xml:space="preserve"> tie around the cable inside the plastic compartment. This is to keep the cable from being pulled out and staying in place inside of the toy. </w:t>
+            </w:r>
+          </w:p>
+          <w:p/>
+        </w:tc>
+        <w:tc>
+          <w:tcPr>
+            <w:tcW w:w="2481" w:type="pct"/>
+          </w:tcPr>
+          <w:p>
+            <w:pPr>
+              <w:spacing w:line="276" w:lineRule="auto"/>
+              <w:jc w:val="center"/>
+            </w:pPr>
+            <w:r>
+              <w:rPr>
+                <w:noProof/>
+              </w:rPr>
+              <w:drawing>
+                <wp:inline distT="0" distB="0" distL="0" distR="0" wp14:anchorId="6D42A0A3" wp14:editId="22C4B0D9">
+                  <wp:extent cx="2423027" cy="1842448"/>
+                  <wp:effectExtent l="0" t="0" r="0" b="5715"/>
+                  <wp:docPr id="125071968" name="Picture 1" descr="A close up of a circuit board&#10;&#10;Description automatically generated"/>
+                  <wp:cNvGraphicFramePr>
+                    <a:graphicFrameLocks xmlns:a="http://schemas.openxmlformats.org/drawingml/2006/main" noChangeAspect="1"/>
+                  </wp:cNvGraphicFramePr>
+                  <a:graphic xmlns:a="http://schemas.openxmlformats.org/drawingml/2006/main">
+                    <a:graphicData uri="http://schemas.openxmlformats.org/drawingml/2006/picture">
+                      <pic:pic xmlns:pic="http://schemas.openxmlformats.org/drawingml/2006/picture">
+                        <pic:nvPicPr>
+                          <pic:cNvPr id="1044829317" name="Picture 1" descr="A close up of a circuit board&#10;&#10;Description automatically generated"/>
+                          <pic:cNvPicPr/>
+                        </pic:nvPicPr>
+                        <pic:blipFill rotWithShape="1">
+                          <a:blip r:embed="rId24" cstate="print">
+                            <a:extLst>
+                              <a:ext uri="{28A0092B-C50C-407E-A947-70E740481C1C}">
+                                <a14:useLocalDpi xmlns:a14="http://schemas.microsoft.com/office/drawing/2010/main" val="0"/>
+                              </a:ext>
+                            </a:extLst>
+                          </a:blip>
+                          <a:srcRect t="16975" b="26000"/>
+                          <a:stretch>
+                            <a:fillRect/>
+                          </a:stretch>
+                        </pic:blipFill>
+                        <pic:spPr bwMode="auto">
+                          <a:xfrm>
+                            <a:off x="0" y="0"/>
+                            <a:ext cx="2426497" cy="1845087"/>
+                          </a:xfrm>
+                          <a:prstGeom prst="rect">
+                            <a:avLst/>
+                          </a:prstGeom>
+                          <a:ln>
+                            <a:noFill/>
+                          </a:ln>
+                          <a:extLst>
+                            <a:ext uri="{53640926-AAD7-44D8-BBD7-CCE9431645EC}">
+                              <a14:shadowObscured xmlns:a14="http://schemas.microsoft.com/office/drawing/2010/main"/>
+                            </a:ext>
+                          </a:extLst>
+                        </pic:spPr>
+                      </pic:pic>
+                    </a:graphicData>
+                  </a:graphic>
+                </wp:inline>
+              </w:drawing>
+            </w:r>
+          </w:p>
+        </w:tc>
+      </w:tr>
+    </w:tbl>
+    <w:p>
+      <w:pPr>
+        <w:pStyle w:val="Heading2"/>
+      </w:pPr>
+      <w:r>
+        <w:lastRenderedPageBreak/>
+        <w:t>Step 8</w:t>
+      </w:r>
+    </w:p>
+    <w:tbl>
+      <w:tblPr>
+        <w:tblStyle w:val="TableGrid"/>
+        <w:tblW w:w="0" w:type="auto"/>
         <w:tblLook w:val="04A0" w:firstRow="1" w:lastRow="0" w:firstColumn="1" w:lastColumn="0" w:noHBand="0" w:noVBand="1"/>
       </w:tblPr>
       <w:tblGrid>
-        <w:gridCol w:w="11342"/>
-        <w:gridCol w:w="222"/>
+        <w:gridCol w:w="4675"/>
+        <w:gridCol w:w="4675"/>
       </w:tblGrid>
       <w:tr>
         <w:tc>
           <w:tcPr>
-            <w:tcW w:w="9138" w:type="dxa"/>
+            <w:tcW w:w="4675" w:type="dxa"/>
+          </w:tcPr>
+          <w:p>
+            <w:pPr>
+              <w:pStyle w:val="ListParagraph"/>
+              <w:numPr>
+                <w:ilvl w:val="0"/>
+                <w:numId w:val="13"/>
+              </w:numPr>
+              <w:rPr>
+                <w:sz w:val="24"/>
+                <w:szCs w:val="24"/>
+              </w:rPr>
+            </w:pPr>
+            <w:r>
+              <w:rPr>
+                <w:sz w:val="24"/>
+                <w:szCs w:val="24"/>
+              </w:rPr>
+              <w:t>The toy can now be reassembled. The grey plastic bottom can be reattached to the main plastic compartment. If this is difficult, make sure you have the c</w:t>
+            </w:r>
+            <w:r>
+              <w:rPr>
+                <w:sz w:val="24"/>
+                <w:szCs w:val="24"/>
+              </w:rPr>
+              <w:t>orrect</w:t>
+            </w:r>
+            <w:r>
+              <w:rPr>
+                <w:sz w:val="24"/>
+                <w:szCs w:val="24"/>
+              </w:rPr>
+              <w:t xml:space="preserve"> orientation of the grey part, and you can do this by </w:t>
+            </w:r>
+            <w:r>
+              <w:rPr>
+                <w:sz w:val="24"/>
+                <w:szCs w:val="24"/>
+              </w:rPr>
+              <w:t>lining</w:t>
+            </w:r>
+            <w:r>
+              <w:rPr>
+                <w:sz w:val="24"/>
+                <w:szCs w:val="24"/>
+              </w:rPr>
+              <w:t xml:space="preserve"> up the square cut outs in the back of the toy.  </w:t>
+            </w:r>
+          </w:p>
+        </w:tc>
+        <w:tc>
+          <w:tcPr>
+            <w:tcW w:w="4675" w:type="dxa"/>
+          </w:tcPr>
+          <w:p>
+            <w:pPr>
+              <w:jc w:val="center"/>
+            </w:pPr>
+            <w:r>
+              <w:rPr>
+                <w:noProof/>
+              </w:rPr>
+              <w:drawing>
+                <wp:inline distT="0" distB="0" distL="0" distR="0" wp14:anchorId="1ABEF0C6" wp14:editId="2A48BF5B">
+                  <wp:extent cx="2021224" cy="2231985"/>
+                  <wp:effectExtent l="0" t="0" r="0" b="0"/>
+                  <wp:docPr id="447758152" name="Picture 8" descr="A close up of a white object&#10;&#10;Description automatically generated"/>
+                  <wp:cNvGraphicFramePr>
+                    <a:graphicFrameLocks xmlns:a="http://schemas.openxmlformats.org/drawingml/2006/main" noChangeAspect="1"/>
+                  </wp:cNvGraphicFramePr>
+                  <a:graphic xmlns:a="http://schemas.openxmlformats.org/drawingml/2006/main">
+                    <a:graphicData uri="http://schemas.openxmlformats.org/drawingml/2006/picture">
+                      <pic:pic xmlns:pic="http://schemas.openxmlformats.org/drawingml/2006/picture">
+                        <pic:nvPicPr>
+                          <pic:cNvPr id="995798288" name="Picture 8" descr="A close up of a white object&#10;&#10;Description automatically generated"/>
+                          <pic:cNvPicPr/>
+                        </pic:nvPicPr>
+                        <pic:blipFill rotWithShape="1">
+                          <a:blip r:embed="rId25" cstate="print">
+                            <a:extLst>
+                              <a:ext uri="{28A0092B-C50C-407E-A947-70E740481C1C}">
+                                <a14:useLocalDpi xmlns:a14="http://schemas.microsoft.com/office/drawing/2010/main" val="0"/>
+                              </a:ext>
+                            </a:extLst>
+                          </a:blip>
+                          <a:srcRect b="17185"/>
+                          <a:stretch>
+                            <a:fillRect/>
+                          </a:stretch>
+                        </pic:blipFill>
+                        <pic:spPr bwMode="auto">
+                          <a:xfrm>
+                            <a:off x="0" y="0"/>
+                            <a:ext cx="2026589" cy="2237910"/>
+                          </a:xfrm>
+                          <a:prstGeom prst="rect">
+                            <a:avLst/>
+                          </a:prstGeom>
+                          <a:ln>
+                            <a:noFill/>
+                          </a:ln>
+                          <a:extLst>
+                            <a:ext uri="{53640926-AAD7-44D8-BBD7-CCE9431645EC}">
+                              <a14:shadowObscured xmlns:a14="http://schemas.microsoft.com/office/drawing/2010/main"/>
+                            </a:ext>
+                          </a:extLst>
+                        </pic:spPr>
+                      </pic:pic>
+                    </a:graphicData>
+                  </a:graphic>
+                </wp:inline>
+              </w:drawing>
+            </w:r>
+          </w:p>
+        </w:tc>
+      </w:tr>
+    </w:tbl>
+    <w:p>
+      <w:pPr>
+        <w:pStyle w:val="Heading2"/>
+      </w:pPr>
+      <w:r>
+        <w:t>Step 9</w:t>
+      </w:r>
+    </w:p>
+    <w:tbl>
+      <w:tblPr>
+        <w:tblStyle w:val="TableGrid"/>
+        <w:tblW w:w="5000" w:type="pct"/>
+        <w:tblLook w:val="06A0" w:firstRow="1" w:lastRow="0" w:firstColumn="1" w:lastColumn="0" w:noHBand="1" w:noVBand="1"/>
+      </w:tblPr>
+      <w:tblGrid>
+        <w:gridCol w:w="4957"/>
+        <w:gridCol w:w="4393"/>
+      </w:tblGrid>
+      <w:tr>
+        <w:trPr>
+          <w:trHeight w:val="300"/>
+        </w:trPr>
+        <w:tc>
+          <w:tcPr>
+            <w:tcW w:w="2651" w:type="pct"/>
+          </w:tcPr>
+          <w:p>
+            <w:pPr>
+              <w:pStyle w:val="ListParagraph"/>
+              <w:numPr>
+                <w:ilvl w:val="0"/>
+                <w:numId w:val="13"/>
+              </w:numPr>
+              <w:rPr>
+                <w:sz w:val="24"/>
+                <w:szCs w:val="24"/>
+              </w:rPr>
+            </w:pPr>
+            <w:r>
+              <w:rPr>
+                <w:sz w:val="24"/>
+                <w:szCs w:val="24"/>
+              </w:rPr>
+              <w:t xml:space="preserve">Secure the screws back in place </w:t>
+            </w:r>
+          </w:p>
+          <w:p>
+            <w:pPr>
+              <w:pStyle w:val="ListParagraph"/>
+              <w:numPr>
+                <w:ilvl w:val="0"/>
+                <w:numId w:val="13"/>
+              </w:numPr>
+              <w:rPr>
+                <w:sz w:val="24"/>
+                <w:szCs w:val="24"/>
+              </w:rPr>
+            </w:pPr>
+            <w:r>
+              <w:rPr>
+                <w:sz w:val="24"/>
+                <w:szCs w:val="24"/>
+              </w:rPr>
+              <w:t xml:space="preserve">Push the plastic compartment back inside the toy to the original position </w:t>
+            </w:r>
+          </w:p>
+          <w:p>
+            <w:pPr>
+              <w:pStyle w:val="ListParagraph"/>
+              <w:numPr>
+                <w:ilvl w:val="0"/>
+                <w:numId w:val="13"/>
+              </w:numPr>
+              <w:rPr>
+                <w:sz w:val="24"/>
+                <w:szCs w:val="24"/>
+              </w:rPr>
+            </w:pPr>
+            <w:r>
+              <w:rPr>
+                <w:sz w:val="24"/>
+                <w:szCs w:val="24"/>
+              </w:rPr>
+              <w:t xml:space="preserve">Use your new </w:t>
+            </w:r>
+            <w:r>
+              <w:rPr>
+                <w:sz w:val="24"/>
+                <w:szCs w:val="24"/>
+              </w:rPr>
+              <w:t>cable</w:t>
+            </w:r>
+            <w:r>
+              <w:rPr>
+                <w:sz w:val="24"/>
+                <w:szCs w:val="24"/>
+              </w:rPr>
+              <w:t xml:space="preserve"> tie, thread the </w:t>
+            </w:r>
+            <w:r>
+              <w:rPr>
+                <w:sz w:val="24"/>
+                <w:szCs w:val="24"/>
+              </w:rPr>
+              <w:t>cable</w:t>
+            </w:r>
+            <w:r>
+              <w:rPr>
+                <w:sz w:val="24"/>
+                <w:szCs w:val="24"/>
+              </w:rPr>
+              <w:t xml:space="preserve"> tie through the seam (if the original </w:t>
+            </w:r>
+            <w:r>
+              <w:rPr>
+                <w:sz w:val="24"/>
+                <w:szCs w:val="24"/>
+              </w:rPr>
+              <w:t>cable</w:t>
+            </w:r>
+            <w:r>
+              <w:rPr>
+                <w:sz w:val="24"/>
+                <w:szCs w:val="24"/>
+              </w:rPr>
+              <w:t xml:space="preserve"> tie is still there, remove it) and secure it around the plastic compartment to hold it in place. </w:t>
+            </w:r>
+          </w:p>
+          <w:p>
+            <w:pPr>
+              <w:pStyle w:val="ListParagraph"/>
+              <w:numPr>
+                <w:ilvl w:val="0"/>
+                <w:numId w:val="13"/>
+              </w:numPr>
+              <w:rPr>
+                <w:sz w:val="24"/>
+                <w:szCs w:val="24"/>
+              </w:rPr>
+            </w:pPr>
+            <w:r>
+              <w:rPr>
+                <w:sz w:val="24"/>
+                <w:szCs w:val="24"/>
+              </w:rPr>
+              <w:t xml:space="preserve">Make sure you cable </w:t>
+            </w:r>
+            <w:proofErr w:type="gramStart"/>
+            <w:r>
+              <w:rPr>
+                <w:sz w:val="24"/>
+                <w:szCs w:val="24"/>
+              </w:rPr>
+              <w:t>is able to</w:t>
+            </w:r>
+            <w:proofErr w:type="gramEnd"/>
+            <w:r>
+              <w:rPr>
+                <w:sz w:val="24"/>
+                <w:szCs w:val="24"/>
+              </w:rPr>
+              <w:t xml:space="preserve"> be accessed and outside of the toy before securing the </w:t>
+            </w:r>
+            <w:r>
+              <w:rPr>
+                <w:sz w:val="24"/>
+                <w:szCs w:val="24"/>
+              </w:rPr>
+              <w:t>cable</w:t>
+            </w:r>
+            <w:r>
+              <w:rPr>
+                <w:sz w:val="24"/>
+                <w:szCs w:val="24"/>
+              </w:rPr>
+              <w:t xml:space="preserve"> tie  </w:t>
+            </w:r>
+          </w:p>
+          <w:p/>
+        </w:tc>
+        <w:tc>
+          <w:tcPr>
+            <w:tcW w:w="2349" w:type="pct"/>
+          </w:tcPr>
+          <w:p>
+            <w:pPr>
+              <w:spacing w:line="276" w:lineRule="auto"/>
+            </w:pPr>
+            <w:r>
+              <w:rPr>
+                <w:noProof/>
+              </w:rPr>
+              <w:drawing>
+                <wp:inline distT="0" distB="0" distL="0" distR="0" wp14:anchorId="45784A15" wp14:editId="32BEEBA9">
+                  <wp:extent cx="2506345" cy="1879600"/>
+                  <wp:effectExtent l="0" t="0" r="8255" b="6350"/>
+                  <wp:docPr id="786610587" name="Picture 5" descr="A person holding a plastic object&#10;&#10;Description automatically generated"/>
+                  <wp:cNvGraphicFramePr>
+                    <a:graphicFrameLocks xmlns:a="http://schemas.openxmlformats.org/drawingml/2006/main" noChangeAspect="1"/>
+                  </wp:cNvGraphicFramePr>
+                  <a:graphic xmlns:a="http://schemas.openxmlformats.org/drawingml/2006/main">
+                    <a:graphicData uri="http://schemas.openxmlformats.org/drawingml/2006/picture">
+                      <pic:pic xmlns:pic="http://schemas.openxmlformats.org/drawingml/2006/picture">
+                        <pic:nvPicPr>
+                          <pic:cNvPr id="916306708" name="Picture 5" descr="A person holding a plastic object&#10;&#10;Description automatically generated"/>
+                          <pic:cNvPicPr/>
+                        </pic:nvPicPr>
+                        <pic:blipFill>
+                          <a:blip r:embed="rId26" cstate="print">
+                            <a:extLst>
+                              <a:ext uri="{28A0092B-C50C-407E-A947-70E740481C1C}">
+                                <a14:useLocalDpi xmlns:a14="http://schemas.microsoft.com/office/drawing/2010/main" val="0"/>
+                              </a:ext>
+                            </a:extLst>
+                          </a:blip>
+                          <a:stretch>
+                            <a:fillRect/>
+                          </a:stretch>
+                        </pic:blipFill>
+                        <pic:spPr>
+                          <a:xfrm>
+                            <a:off x="0" y="0"/>
+                            <a:ext cx="2506345" cy="1879600"/>
+                          </a:xfrm>
+                          <a:prstGeom prst="rect">
+                            <a:avLst/>
+                          </a:prstGeom>
+                        </pic:spPr>
+                      </pic:pic>
+                    </a:graphicData>
+                  </a:graphic>
+                </wp:inline>
+              </w:drawing>
+            </w:r>
+          </w:p>
+        </w:tc>
+      </w:tr>
+    </w:tbl>
+    <w:p>
+      <w:pPr>
+        <w:pStyle w:val="Heading2"/>
+      </w:pPr>
+      <w:r>
+        <w:t xml:space="preserve">Step </w:t>
+      </w:r>
+      <w:r>
+        <w:t>10</w:t>
+      </w:r>
+    </w:p>
+    <w:tbl>
+      <w:tblPr>
+        <w:tblStyle w:val="TableGrid"/>
+        <w:tblW w:w="5000" w:type="pct"/>
+        <w:tblLook w:val="06A0" w:firstRow="1" w:lastRow="0" w:firstColumn="1" w:lastColumn="0" w:noHBand="1" w:noVBand="1"/>
+      </w:tblPr>
+      <w:tblGrid>
+        <w:gridCol w:w="4619"/>
+        <w:gridCol w:w="4731"/>
+      </w:tblGrid>
+      <w:tr>
+        <w:trPr>
+          <w:trHeight w:val="300"/>
+        </w:trPr>
+        <w:tc>
+          <w:tcPr>
+            <w:tcW w:w="2470" w:type="pct"/>
+          </w:tcPr>
+          <w:p>
+            <w:pPr>
+              <w:pStyle w:val="ListParagraph"/>
+              <w:numPr>
+                <w:ilvl w:val="0"/>
+                <w:numId w:val="13"/>
+              </w:numPr>
+            </w:pPr>
+            <w:r>
+              <w:rPr>
+                <w:color w:val="000000"/>
+              </w:rPr>
+              <w:t>Test the toy again</w:t>
+            </w:r>
+            <w:r>
+              <w:rPr>
+                <w:color w:val="000000"/>
+              </w:rPr>
+              <w:t xml:space="preserve"> with an assistive switch</w:t>
+            </w:r>
+            <w:r>
+              <w:rPr>
+                <w:color w:val="000000"/>
+              </w:rPr>
+              <w:t xml:space="preserve">. If it is still working properly, repackage the toy and the adapted toy is complete! </w:t>
+            </w:r>
+          </w:p>
+        </w:tc>
+        <w:tc>
+          <w:tcPr>
+            <w:tcW w:w="2530" w:type="pct"/>
+          </w:tcPr>
+          <w:p>
+            <w:pPr>
+              <w:spacing w:line="276" w:lineRule="auto"/>
+              <w:jc w:val="center"/>
+            </w:pPr>
+            <w:r>
+              <w:rPr>
+                <w:noProof/>
+              </w:rPr>
+              <w:drawing>
+                <wp:inline distT="0" distB="0" distL="0" distR="0" wp14:anchorId="116D32A2" wp14:editId="52B95041">
+                  <wp:extent cx="2130153" cy="2129050"/>
+                  <wp:effectExtent l="0" t="0" r="3810" b="5080"/>
+                  <wp:docPr id="1159242944" name="Picture 7"/>
+                  <wp:cNvGraphicFramePr>
+                    <a:graphicFrameLocks xmlns:a="http://schemas.openxmlformats.org/drawingml/2006/main" noChangeAspect="1"/>
+                  </wp:cNvGraphicFramePr>
+                  <a:graphic xmlns:a="http://schemas.openxmlformats.org/drawingml/2006/main">
+                    <a:graphicData uri="http://schemas.openxmlformats.org/drawingml/2006/picture">
+                      <pic:pic xmlns:pic="http://schemas.openxmlformats.org/drawingml/2006/picture">
+                        <pic:nvPicPr>
+                          <pic:cNvPr id="561719198" name="Picture 561719198"/>
+                          <pic:cNvPicPr/>
+                        </pic:nvPicPr>
+                        <pic:blipFill rotWithShape="1">
+                          <a:blip r:embed="rId27" cstate="print">
+                            <a:extLst>
+                              <a:ext uri="{28A0092B-C50C-407E-A947-70E740481C1C}">
+                                <a14:useLocalDpi xmlns:a14="http://schemas.microsoft.com/office/drawing/2010/main" val="0"/>
+                              </a:ext>
+                            </a:extLst>
+                          </a:blip>
+                          <a:srcRect t="13185" b="11871"/>
+                          <a:stretch>
+                            <a:fillRect/>
+                          </a:stretch>
+                        </pic:blipFill>
+                        <pic:spPr bwMode="auto">
+                          <a:xfrm>
+                            <a:off x="0" y="0"/>
+                            <a:ext cx="2144248" cy="2143138"/>
+                          </a:xfrm>
+                          <a:prstGeom prst="rect">
+                            <a:avLst/>
+                          </a:prstGeom>
+                          <a:ln>
+                            <a:noFill/>
+                          </a:ln>
+                          <a:extLst>
+                            <a:ext uri="{53640926-AAD7-44D8-BBD7-CCE9431645EC}">
+                              <a14:shadowObscured xmlns:a14="http://schemas.microsoft.com/office/drawing/2010/main"/>
+                            </a:ext>
+                          </a:extLst>
+                        </pic:spPr>
+                      </pic:pic>
+                    </a:graphicData>
+                  </a:graphic>
+                </wp:inline>
+              </w:drawing>
+            </w:r>
+          </w:p>
+        </w:tc>
+      </w:tr>
+      <w:tr>
+        <w:tblPrEx>
+          <w:tblLook w:val="04A0" w:firstRow="1" w:lastRow="0" w:firstColumn="1" w:lastColumn="0" w:noHBand="0" w:noVBand="1"/>
+        </w:tblPrEx>
+        <w:tc>
+          <w:tcPr>
+            <w:tcW w:w="2470" w:type="pct"/>
             <w:tcBorders>
               <w:top w:val="nil"/>
               <w:left w:val="nil"/>
@@ -1546,1398 +2720,11 @@
               <w:right w:val="nil"/>
             </w:tcBorders>
           </w:tcPr>
-          <w:tbl>
-            <w:tblPr>
-              <w:tblStyle w:val="TableGrid"/>
-              <w:tblW w:w="8390" w:type="dxa"/>
-              <w:tblLayout w:type="fixed"/>
-              <w:tblLook w:val="06A0" w:firstRow="1" w:lastRow="0" w:firstColumn="1" w:lastColumn="0" w:noHBand="1" w:noVBand="1"/>
-            </w:tblPr>
-            <w:tblGrid>
-              <w:gridCol w:w="4227"/>
-              <w:gridCol w:w="4163"/>
-            </w:tblGrid>
-            <w:tr>
-              <w:trPr>
-                <w:trHeight w:val="300"/>
-              </w:trPr>
-              <w:tc>
-                <w:tcPr>
-                  <w:tcW w:w="4227" w:type="dxa"/>
-                </w:tcPr>
-                <w:p>
-                  <w:pPr>
-                    <w:numPr>
-                      <w:ilvl w:val="0"/>
-                      <w:numId w:val="13"/>
-                    </w:numPr>
-                    <w:spacing w:after="200" w:line="276" w:lineRule="auto"/>
-                  </w:pPr>
-                  <w:r>
-                    <w:t>This part is difficult, as you will need to separate the</w:t>
-                  </w:r>
-                  <w:r>
-                    <w:t xml:space="preserve"> grey bottom </w:t>
-                  </w:r>
-                  <w:r>
-                    <w:t xml:space="preserve">from the toy by prying the plastic apart. </w:t>
-                  </w:r>
-                </w:p>
-                <w:p>
-                  <w:pPr>
-                    <w:numPr>
-                      <w:ilvl w:val="0"/>
-                      <w:numId w:val="13"/>
-                    </w:numPr>
-                    <w:spacing w:after="200" w:line="276" w:lineRule="auto"/>
-                  </w:pPr>
-                  <w:r>
-                    <w:t xml:space="preserve">Using a screwdriver, you will wedge the screwdriver between the grey plastic bottom and </w:t>
-                  </w:r>
-                  <w:r>
-                    <w:t>white plastic compartment. While doing this</w:t>
-                  </w:r>
-                  <w:r>
-                    <w:t>,</w:t>
-                  </w:r>
-                  <w:r>
-                    <w:t xml:space="preserve"> try to wiggle the grey plastic bottom free, moving the screwdriver around all sides. </w:t>
-                  </w:r>
-                </w:p>
-              </w:tc>
-              <w:tc>
-                <w:tcPr>
-                  <w:tcW w:w="4163" w:type="dxa"/>
-                </w:tcPr>
-                <w:p>
-                  <w:pPr>
-                    <w:spacing w:after="200" w:line="276" w:lineRule="auto"/>
-                  </w:pPr>
-                  <w:r>
-                    <w:rPr>
-                      <w:noProof/>
-                    </w:rPr>
-                    <w:drawing>
-                      <wp:inline distT="0" distB="0" distL="0" distR="0" wp14:anchorId="199808F7" wp14:editId="24856071">
-                        <wp:extent cx="2058698" cy="2745105"/>
-                        <wp:effectExtent l="0" t="0" r="0" b="0"/>
-                        <wp:docPr id="144161822" name="Picture 5" descr="A close up of a device&#10;&#10;Description automatically generated"/>
-                        <wp:cNvGraphicFramePr>
-                          <a:graphicFrameLocks xmlns:a="http://schemas.openxmlformats.org/drawingml/2006/main" noChangeAspect="1"/>
-                        </wp:cNvGraphicFramePr>
-                        <a:graphic xmlns:a="http://schemas.openxmlformats.org/drawingml/2006/main">
-                          <a:graphicData uri="http://schemas.openxmlformats.org/drawingml/2006/picture">
-                            <pic:pic xmlns:pic="http://schemas.openxmlformats.org/drawingml/2006/picture">
-                              <pic:nvPicPr>
-                                <pic:cNvPr id="144161822" name="Picture 5" descr="A close up of a device&#10;&#10;Description automatically generated"/>
-                                <pic:cNvPicPr/>
-                              </pic:nvPicPr>
-                              <pic:blipFill>
-                                <a:blip r:embed="rId18" cstate="print">
-                                  <a:extLst>
-                                    <a:ext uri="{28A0092B-C50C-407E-A947-70E740481C1C}">
-                                      <a14:useLocalDpi xmlns:a14="http://schemas.microsoft.com/office/drawing/2010/main" val="0"/>
-                                    </a:ext>
-                                  </a:extLst>
-                                </a:blip>
-                                <a:stretch>
-                                  <a:fillRect/>
-                                </a:stretch>
-                              </pic:blipFill>
-                              <pic:spPr>
-                                <a:xfrm>
-                                  <a:off x="0" y="0"/>
-                                  <a:ext cx="2060752" cy="2747844"/>
-                                </a:xfrm>
-                                <a:prstGeom prst="rect">
-                                  <a:avLst/>
-                                </a:prstGeom>
-                              </pic:spPr>
-                            </pic:pic>
-                          </a:graphicData>
-                        </a:graphic>
-                      </wp:inline>
-                    </w:drawing>
-                  </w:r>
-                </w:p>
-              </w:tc>
-            </w:tr>
-          </w:tbl>
-          <w:p>
-            <w:pPr>
-              <w:spacing w:after="200" w:line="276" w:lineRule="auto"/>
-            </w:pPr>
-          </w:p>
-          <w:p>
-            <w:pPr>
-              <w:pStyle w:val="Heading2"/>
-            </w:pPr>
-            <w:r>
-              <w:t>Step 4</w:t>
-            </w:r>
-          </w:p>
-          <w:tbl>
-            <w:tblPr>
-              <w:tblStyle w:val="TableGrid"/>
-              <w:tblW w:w="9374" w:type="dxa"/>
-              <w:tblLook w:val="04A0" w:firstRow="1" w:lastRow="0" w:firstColumn="1" w:lastColumn="0" w:noHBand="0" w:noVBand="1"/>
-            </w:tblPr>
-            <w:tblGrid>
-              <w:gridCol w:w="9138"/>
-              <w:gridCol w:w="236"/>
-            </w:tblGrid>
-            <w:tr>
-              <w:tc>
-                <w:tcPr>
-                  <w:tcW w:w="9138" w:type="dxa"/>
-                  <w:tcBorders>
-                    <w:top w:val="nil"/>
-                    <w:left w:val="nil"/>
-                    <w:bottom w:val="nil"/>
-                    <w:right w:val="nil"/>
-                  </w:tcBorders>
-                </w:tcPr>
-                <w:tbl>
-                  <w:tblPr>
-                    <w:tblStyle w:val="TableGrid"/>
-                    <w:tblW w:w="8390" w:type="dxa"/>
-                    <w:tblLayout w:type="fixed"/>
-                    <w:tblLook w:val="06A0" w:firstRow="1" w:lastRow="0" w:firstColumn="1" w:lastColumn="0" w:noHBand="1" w:noVBand="1"/>
-                  </w:tblPr>
-                  <w:tblGrid>
-                    <w:gridCol w:w="4214"/>
-                    <w:gridCol w:w="4176"/>
-                  </w:tblGrid>
-                  <w:tr>
-                    <w:trPr>
-                      <w:trHeight w:val="300"/>
-                    </w:trPr>
-                    <w:tc>
-                      <w:tcPr>
-                        <w:tcW w:w="4227" w:type="dxa"/>
-                      </w:tcPr>
-                      <w:p>
-                        <w:pPr>
-                          <w:pStyle w:val="ListParagraph"/>
-                          <w:numPr>
-                            <w:ilvl w:val="0"/>
-                            <w:numId w:val="13"/>
-                          </w:numPr>
-                        </w:pPr>
-                        <w:r>
-                          <w:t>This toy is adapted by a cable</w:t>
-                        </w:r>
-                        <w:r>
-                          <w:t>,</w:t>
-                        </w:r>
-                        <w:r>
-                          <w:t xml:space="preserve"> so must make an entry point for the cable and thread it through, before we solder it onto the board</w:t>
-                        </w:r>
-                      </w:p>
-                      <w:p>
-                        <w:pPr>
-                          <w:numPr>
-                            <w:ilvl w:val="0"/>
-                            <w:numId w:val="13"/>
-                          </w:numPr>
-                          <w:spacing w:after="200" w:line="276" w:lineRule="auto"/>
-                        </w:pPr>
-                        <w:r>
-                          <w:t xml:space="preserve">Drill a hole into the plastic to thread the cable through. The hole can be made at the back of the toy, just above and to the side </w:t>
-                        </w:r>
-                        <w:r>
-                          <w:t xml:space="preserve">of the square hole. Make sure to be about 2 </w:t>
-                        </w:r>
-                        <w:proofErr w:type="spellStart"/>
-                        <w:r>
-                          <w:t>cms</w:t>
-                        </w:r>
-                        <w:proofErr w:type="spellEnd"/>
-                        <w:r>
-                          <w:t xml:space="preserve"> from the bottom of the toy so the cable does not interfere with the plastic parts when reassembled </w:t>
-                        </w:r>
-                      </w:p>
-                    </w:tc>
-                    <w:tc>
-                      <w:tcPr>
-                        <w:tcW w:w="4163" w:type="dxa"/>
-                      </w:tcPr>
-                      <w:p>
-                        <w:pPr>
-                          <w:spacing w:after="200" w:line="276" w:lineRule="auto"/>
-                        </w:pPr>
-                        <w:r>
-                          <w:rPr>
-                            <w:noProof/>
-                          </w:rPr>
-                          <w:drawing>
-                            <wp:inline distT="0" distB="0" distL="0" distR="0" wp14:anchorId="53869F6F" wp14:editId="4477019B">
-                              <wp:extent cx="2506345" cy="3342005"/>
-                              <wp:effectExtent l="0" t="0" r="8255" b="0"/>
-                              <wp:docPr id="16857078" name="Picture 4" descr="A close up of a stuffed animal&#10;&#10;Description automatically generated"/>
-                              <wp:cNvGraphicFramePr>
-                                <a:graphicFrameLocks xmlns:a="http://schemas.openxmlformats.org/drawingml/2006/main" noChangeAspect="1"/>
-                              </wp:cNvGraphicFramePr>
-                              <a:graphic xmlns:a="http://schemas.openxmlformats.org/drawingml/2006/main">
-                                <a:graphicData uri="http://schemas.openxmlformats.org/drawingml/2006/picture">
-                                  <pic:pic xmlns:pic="http://schemas.openxmlformats.org/drawingml/2006/picture">
-                                    <pic:nvPicPr>
-                                      <pic:cNvPr id="16857078" name="Picture 4" descr="A close up of a stuffed animal&#10;&#10;Description automatically generated"/>
-                                      <pic:cNvPicPr/>
-                                    </pic:nvPicPr>
-                                    <pic:blipFill>
-                                      <a:blip r:embed="rId19" cstate="print">
-                                        <a:extLst>
-                                          <a:ext uri="{28A0092B-C50C-407E-A947-70E740481C1C}">
-                                            <a14:useLocalDpi xmlns:a14="http://schemas.microsoft.com/office/drawing/2010/main" val="0"/>
-                                          </a:ext>
-                                        </a:extLst>
-                                      </a:blip>
-                                      <a:stretch>
-                                        <a:fillRect/>
-                                      </a:stretch>
-                                    </pic:blipFill>
-                                    <pic:spPr>
-                                      <a:xfrm>
-                                        <a:off x="0" y="0"/>
-                                        <a:ext cx="2506345" cy="3342005"/>
-                                      </a:xfrm>
-                                      <a:prstGeom prst="rect">
-                                        <a:avLst/>
-                                      </a:prstGeom>
-                                    </pic:spPr>
-                                  </pic:pic>
-                                </a:graphicData>
-                              </a:graphic>
-                            </wp:inline>
-                          </w:drawing>
-                        </w:r>
-                      </w:p>
-                    </w:tc>
-                  </w:tr>
-                </w:tbl>
-                <w:p>
-                  <w:pPr>
-                    <w:spacing w:after="200" w:line="276" w:lineRule="auto"/>
-                  </w:pPr>
-                </w:p>
-              </w:tc>
-              <w:tc>
-                <w:tcPr>
-                  <w:tcW w:w="236" w:type="dxa"/>
-                  <w:tcBorders>
-                    <w:top w:val="nil"/>
-                    <w:left w:val="nil"/>
-                    <w:bottom w:val="nil"/>
-                    <w:right w:val="nil"/>
-                  </w:tcBorders>
-                </w:tcPr>
-                <w:p>
-                  <w:pPr>
-                    <w:spacing w:after="200" w:line="276" w:lineRule="auto"/>
-                  </w:pPr>
-                </w:p>
-              </w:tc>
-            </w:tr>
-          </w:tbl>
-          <w:p>
-            <w:pPr>
-              <w:spacing w:after="200" w:line="276" w:lineRule="auto"/>
-            </w:pPr>
-          </w:p>
-          <w:p>
-            <w:pPr>
-              <w:pStyle w:val="Heading2"/>
-            </w:pPr>
-            <w:r>
-              <w:lastRenderedPageBreak/>
-              <w:t xml:space="preserve">Step </w:t>
-            </w:r>
-            <w:r>
-              <w:t>5</w:t>
-            </w:r>
-          </w:p>
-          <w:tbl>
-            <w:tblPr>
-              <w:tblStyle w:val="TableGrid"/>
-              <w:tblW w:w="9374" w:type="dxa"/>
-              <w:tblLook w:val="04A0" w:firstRow="1" w:lastRow="0" w:firstColumn="1" w:lastColumn="0" w:noHBand="0" w:noVBand="1"/>
-            </w:tblPr>
-            <w:tblGrid>
-              <w:gridCol w:w="10904"/>
-              <w:gridCol w:w="222"/>
-            </w:tblGrid>
-            <w:tr>
-              <w:tc>
-                <w:tcPr>
-                  <w:tcW w:w="9138" w:type="dxa"/>
-                  <w:tcBorders>
-                    <w:top w:val="nil"/>
-                    <w:left w:val="nil"/>
-                    <w:bottom w:val="nil"/>
-                    <w:right w:val="nil"/>
-                  </w:tcBorders>
-                </w:tcPr>
-                <w:tbl>
-                  <w:tblPr>
-                    <w:tblStyle w:val="TableGrid"/>
-                    <w:tblW w:w="8390" w:type="dxa"/>
-                    <w:tblLayout w:type="fixed"/>
-                    <w:tblLook w:val="06A0" w:firstRow="1" w:lastRow="0" w:firstColumn="1" w:lastColumn="0" w:noHBand="1" w:noVBand="1"/>
-                  </w:tblPr>
-                  <w:tblGrid>
-                    <w:gridCol w:w="4214"/>
-                    <w:gridCol w:w="4176"/>
-                  </w:tblGrid>
-                  <w:tr>
-                    <w:trPr>
-                      <w:trHeight w:val="300"/>
-                    </w:trPr>
-                    <w:tc>
-                      <w:tcPr>
-                        <w:tcW w:w="4227" w:type="dxa"/>
-                      </w:tcPr>
-                      <w:p>
-                        <w:pPr>
-                          <w:numPr>
-                            <w:ilvl w:val="0"/>
-                            <w:numId w:val="13"/>
-                          </w:numPr>
-                        </w:pPr>
-                        <w:r>
-                          <w:t>Y</w:t>
-                        </w:r>
-                        <w:r>
-                          <w:t xml:space="preserve">ou can lay the penguin on its side, leaving the grey bottom flat on the table which will give you space to work with the circuit board. </w:t>
-                        </w:r>
-                      </w:p>
-                      <w:p>
-                        <w:pPr>
-                          <w:numPr>
-                            <w:ilvl w:val="0"/>
-                            <w:numId w:val="13"/>
-                          </w:numPr>
-                        </w:pPr>
-                        <w:r>
-                          <w:t xml:space="preserve">The cable is threaded through the </w:t>
-                        </w:r>
-                        <w:r>
-                          <w:t>hole,</w:t>
-                        </w:r>
-                        <w:r>
-                          <w:t xml:space="preserve"> and you can now add some solder to the ends of your internal cable wires. This will make it easier to attach to the board </w:t>
-                        </w:r>
-                      </w:p>
-                    </w:tc>
-                    <w:tc>
-                      <w:tcPr>
-                        <w:tcW w:w="4163" w:type="dxa"/>
-                      </w:tcPr>
-                      <w:p>
-                        <w:pPr>
-                          <w:spacing w:after="200" w:line="276" w:lineRule="auto"/>
-                        </w:pPr>
-                        <w:r>
-                          <w:rPr>
-                            <w:noProof/>
-                          </w:rPr>
-                          <w:drawing>
-                            <wp:inline distT="0" distB="0" distL="0" distR="0" wp14:anchorId="0280097E" wp14:editId="1D82F829">
-                              <wp:extent cx="2506345" cy="3342005"/>
-                              <wp:effectExtent l="0" t="0" r="8255" b="0"/>
-                              <wp:docPr id="1104802732" name="Picture 3" descr="A round object with wires and wires&#10;&#10;Description automatically generated"/>
-                              <wp:cNvGraphicFramePr>
-                                <a:graphicFrameLocks xmlns:a="http://schemas.openxmlformats.org/drawingml/2006/main" noChangeAspect="1"/>
-                              </wp:cNvGraphicFramePr>
-                              <a:graphic xmlns:a="http://schemas.openxmlformats.org/drawingml/2006/main">
-                                <a:graphicData uri="http://schemas.openxmlformats.org/drawingml/2006/picture">
-                                  <pic:pic xmlns:pic="http://schemas.openxmlformats.org/drawingml/2006/picture">
-                                    <pic:nvPicPr>
-                                      <pic:cNvPr id="1104802732" name="Picture 3" descr="A round object with wires and wires&#10;&#10;Description automatically generated"/>
-                                      <pic:cNvPicPr/>
-                                    </pic:nvPicPr>
-                                    <pic:blipFill>
-                                      <a:blip r:embed="rId20" cstate="print">
-                                        <a:extLst>
-                                          <a:ext uri="{28A0092B-C50C-407E-A947-70E740481C1C}">
-                                            <a14:useLocalDpi xmlns:a14="http://schemas.microsoft.com/office/drawing/2010/main" val="0"/>
-                                          </a:ext>
-                                        </a:extLst>
-                                      </a:blip>
-                                      <a:stretch>
-                                        <a:fillRect/>
-                                      </a:stretch>
-                                    </pic:blipFill>
-                                    <pic:spPr>
-                                      <a:xfrm>
-                                        <a:off x="0" y="0"/>
-                                        <a:ext cx="2506345" cy="3342005"/>
-                                      </a:xfrm>
-                                      <a:prstGeom prst="rect">
-                                        <a:avLst/>
-                                      </a:prstGeom>
-                                    </pic:spPr>
-                                  </pic:pic>
-                                </a:graphicData>
-                              </a:graphic>
-                            </wp:inline>
-                          </w:drawing>
-                        </w:r>
-                      </w:p>
-                    </w:tc>
-                  </w:tr>
-                </w:tbl>
-                <w:p>
-                  <w:pPr>
-                    <w:spacing w:after="200" w:line="276" w:lineRule="auto"/>
-                  </w:pPr>
-                </w:p>
-                <w:p>
-                  <w:pPr>
-                    <w:pStyle w:val="Heading2"/>
-                  </w:pPr>
-                  <w:r>
-                    <w:t>Step 6</w:t>
-                  </w:r>
-                </w:p>
-                <w:tbl>
-                  <w:tblPr>
-                    <w:tblStyle w:val="TableGrid"/>
-                    <w:tblW w:w="9374" w:type="dxa"/>
-                    <w:tblLook w:val="04A0" w:firstRow="1" w:lastRow="0" w:firstColumn="1" w:lastColumn="0" w:noHBand="0" w:noVBand="1"/>
-                  </w:tblPr>
-                  <w:tblGrid>
-                    <w:gridCol w:w="10466"/>
-                    <w:gridCol w:w="222"/>
-                  </w:tblGrid>
-                  <w:tr>
-                    <w:tc>
-                      <w:tcPr>
-                        <w:tcW w:w="9138" w:type="dxa"/>
-                        <w:tcBorders>
-                          <w:top w:val="nil"/>
-                          <w:left w:val="nil"/>
-                          <w:bottom w:val="nil"/>
-                          <w:right w:val="nil"/>
-                        </w:tcBorders>
-                      </w:tcPr>
-                      <w:tbl>
-                        <w:tblPr>
-                          <w:tblStyle w:val="TableGrid"/>
-                          <w:tblW w:w="8390" w:type="dxa"/>
-                          <w:tblLayout w:type="fixed"/>
-                          <w:tblLook w:val="06A0" w:firstRow="1" w:lastRow="0" w:firstColumn="1" w:lastColumn="0" w:noHBand="1" w:noVBand="1"/>
-                        </w:tblPr>
-                        <w:tblGrid>
-                          <w:gridCol w:w="4214"/>
-                          <w:gridCol w:w="4176"/>
-                        </w:tblGrid>
-                        <w:tr>
-                          <w:trPr>
-                            <w:trHeight w:val="300"/>
-                          </w:trPr>
-                          <w:tc>
-                            <w:tcPr>
-                              <w:tcW w:w="4227" w:type="dxa"/>
-                            </w:tcPr>
-                            <w:p>
-                              <w:pPr>
-                                <w:numPr>
-                                  <w:ilvl w:val="0"/>
-                                  <w:numId w:val="13"/>
-                                </w:numPr>
-                              </w:pPr>
-                              <w:r>
-                                <w:t xml:space="preserve">Your internal cable wires will now be soldered onto the board. </w:t>
-                              </w:r>
-                            </w:p>
-                            <w:p>
-                              <w:pPr>
-                                <w:numPr>
-                                  <w:ilvl w:val="0"/>
-                                  <w:numId w:val="13"/>
-                                </w:numPr>
-                              </w:pPr>
-                              <w:r>
-                                <w:t xml:space="preserve">Connect one wire to each spot on the board – circled in red. </w:t>
-                              </w:r>
-                            </w:p>
-                            <w:p>
-                              <w:pPr>
-                                <w:numPr>
-                                  <w:ilvl w:val="0"/>
-                                  <w:numId w:val="13"/>
-                                </w:numPr>
-                              </w:pPr>
-                              <w:r>
-                                <w:t xml:space="preserve">It does not matter what wire is attached to what spot but make sure the original wires also stay in that spot </w:t>
-                              </w:r>
-                            </w:p>
-                            <w:p>
-                              <w:pPr>
-                                <w:numPr>
-                                  <w:ilvl w:val="0"/>
-                                  <w:numId w:val="13"/>
-                                </w:numPr>
-                              </w:pPr>
-                              <w:r>
-                                <w:t>Each spot on the board – circled in red – will have one new wire from the cable and one original wire</w:t>
-                              </w:r>
-                            </w:p>
-                            <w:p>
-                              <w:pPr>
-                                <w:numPr>
-                                  <w:ilvl w:val="0"/>
-                                  <w:numId w:val="13"/>
-                                </w:numPr>
-                                <w:jc w:val="both"/>
-                              </w:pPr>
-                              <w:r>
-                                <w:t xml:space="preserve">Make sure to keep the solder on each spot, and not to connect any of the spots on the board together </w:t>
-                              </w:r>
-                            </w:p>
-                            <w:p>
-                              <w:pPr>
-                                <w:pStyle w:val="ListParagraph"/>
-                                <w:numPr>
-                                  <w:ilvl w:val="0"/>
-                                  <w:numId w:val="13"/>
-                                </w:numPr>
-                              </w:pPr>
-                              <w:r>
-                                <w:t>When complete, use an assistive switch to test the toy (you will also need to add batteries for testing)</w:t>
-                              </w:r>
-                            </w:p>
-                            <w:p/>
-                            <w:p/>
-                          </w:tc>
-                          <w:tc>
-                            <w:tcPr>
-                              <w:tcW w:w="4163" w:type="dxa"/>
-                            </w:tcPr>
-                            <w:p>
-                              <w:pPr>
-                                <w:spacing w:after="200" w:line="276" w:lineRule="auto"/>
-                              </w:pPr>
-                              <w:r>
-                                <w:rPr>
-                                  <w:noProof/>
-                                </w:rPr>
-                                <mc:AlternateContent>
-                                  <mc:Choice Requires="wps">
-                                    <w:drawing>
-                                      <wp:anchor distT="0" distB="0" distL="114300" distR="114300" simplePos="0" relativeHeight="251661351" behindDoc="0" locked="0" layoutInCell="1" allowOverlap="1" wp14:anchorId="45110BDA" wp14:editId="4AE46761">
-                                        <wp:simplePos x="0" y="0"/>
-                                        <wp:positionH relativeFrom="column">
-                                          <wp:posOffset>850265</wp:posOffset>
-                                        </wp:positionH>
-                                        <wp:positionV relativeFrom="paragraph">
-                                          <wp:posOffset>1065530</wp:posOffset>
-                                        </wp:positionV>
-                                        <wp:extent cx="114300" cy="209550"/>
-                                        <wp:effectExtent l="0" t="0" r="19050" b="19050"/>
-                                        <wp:wrapNone/>
-                                        <wp:docPr id="1288913670" name="Flowchart: Connector 7"/>
-                                        <wp:cNvGraphicFramePr/>
-                                        <a:graphic xmlns:a="http://schemas.openxmlformats.org/drawingml/2006/main">
-                                          <a:graphicData uri="http://schemas.microsoft.com/office/word/2010/wordprocessingShape">
-                                            <wps:wsp>
-                                              <wps:cNvSpPr/>
-                                              <wps:spPr>
-                                                <a:xfrm>
-                                                  <a:off x="0" y="0"/>
-                                                  <a:ext cx="114300" cy="209550"/>
-                                                </a:xfrm>
-                                                <a:prstGeom prst="flowChartConnector">
-                                                  <a:avLst/>
-                                                </a:prstGeom>
-                                                <a:noFill/>
-                                                <a:ln w="19050">
-                                                  <a:solidFill>
-                                                    <a:srgbClr val="FF0000"/>
-                                                  </a:solidFill>
-                                                </a:ln>
-                                              </wps:spPr>
-                                              <wps:style>
-                                                <a:lnRef idx="2">
-                                                  <a:schemeClr val="accent1">
-                                                    <a:shade val="15000"/>
-                                                  </a:schemeClr>
-                                                </a:lnRef>
-                                                <a:fillRef idx="1">
-                                                  <a:schemeClr val="accent1"/>
-                                                </a:fillRef>
-                                                <a:effectRef idx="0">
-                                                  <a:schemeClr val="accent1"/>
-                                                </a:effectRef>
-                                                <a:fontRef idx="minor">
-                                                  <a:schemeClr val="lt1"/>
-                                                </a:fontRef>
-                                              </wps:style>
-                                              <wps:bodyPr rot="0" spcFirstLastPara="0" vertOverflow="overflow" horzOverflow="overflow" vert="horz" wrap="square" lIns="91440" tIns="45720" rIns="91440" bIns="45720" numCol="1" spcCol="0" rtlCol="0" fromWordArt="0" anchor="ctr" anchorCtr="0" forceAA="0" compatLnSpc="1">
-                                                <a:prstTxWarp prst="textNoShape">
-                                                  <a:avLst/>
-                                                </a:prstTxWarp>
-                                                <a:noAutofit/>
-                                              </wps:bodyPr>
-                                            </wps:wsp>
-                                          </a:graphicData>
-                                        </a:graphic>
-                                      </wp:anchor>
-                                    </w:drawing>
-                                  </mc:Choice>
-                                  <mc:Fallback xmlns:adec="http://schemas.microsoft.com/office/drawing/2017/decorative" xmlns:a14="http://schemas.microsoft.com/office/drawing/2010/main" xmlns:pic="http://schemas.openxmlformats.org/drawingml/2006/picture" xmlns:a="http://schemas.openxmlformats.org/drawingml/2006/main">
-                                    <w:pict w14:anchorId="2305EF9E">
-                                      <v:shapetype id="_x0000_t120" coordsize="21600,21600" o:spt="120" path="m10800,qx,10800,10800,21600,21600,10800,10800,xe" w14:anchorId="75226944">
-                                        <v:path textboxrect="3163,3163,18437,18437" gradientshapeok="t" o:connecttype="custom" o:connectlocs="10800,0;3163,3163;0,10800;3163,18437;10800,21600;18437,18437;21600,10800;18437,3163"/>
-                                      </v:shapetype>
-                                      <v:shape id="Flowchart: Connector 7" style="position:absolute;margin-left:66.95pt;margin-top:83.9pt;width:9pt;height:16.5pt;z-index:251661351;visibility:visible;mso-wrap-style:square;mso-wrap-distance-left:9pt;mso-wrap-distance-top:0;mso-wrap-distance-right:9pt;mso-wrap-distance-bottom:0;mso-position-horizontal:absolute;mso-position-horizontal-relative:text;mso-position-vertical:absolute;mso-position-vertical-relative:text;v-text-anchor:middle" o:spid="_x0000_s1026" filled="f" strokecolor="red" strokeweight="1.5pt" type="#_x0000_t120" o:gfxdata="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">
-                                        <v:stroke joinstyle="miter"/>
-                                      </v:shape>
-                                    </w:pict>
-                                  </mc:Fallback>
-                                </mc:AlternateContent>
-                              </w:r>
-                              <w:r>
-                                <w:rPr>
-                                  <w:noProof/>
-                                </w:rPr>
-                                <mc:AlternateContent>
-                                  <mc:Choice Requires="wps">
-                                    <w:drawing>
-                                      <wp:anchor distT="0" distB="0" distL="114300" distR="114300" simplePos="0" relativeHeight="251660327" behindDoc="0" locked="0" layoutInCell="1" allowOverlap="1" wp14:anchorId="083A60C9" wp14:editId="3BF6A68D">
-                                        <wp:simplePos x="0" y="0"/>
-                                        <wp:positionH relativeFrom="column">
-                                          <wp:posOffset>697865</wp:posOffset>
-                                        </wp:positionH>
-                                        <wp:positionV relativeFrom="paragraph">
-                                          <wp:posOffset>1040130</wp:posOffset>
-                                        </wp:positionV>
-                                        <wp:extent cx="158750" cy="196850"/>
-                                        <wp:effectExtent l="0" t="0" r="12700" b="12700"/>
-                                        <wp:wrapNone/>
-                                        <wp:docPr id="1820781591" name="Flowchart: Connector 6"/>
-                                        <wp:cNvGraphicFramePr/>
-                                        <a:graphic xmlns:a="http://schemas.openxmlformats.org/drawingml/2006/main">
-                                          <a:graphicData uri="http://schemas.microsoft.com/office/word/2010/wordprocessingShape">
-                                            <wps:wsp>
-                                              <wps:cNvSpPr/>
-                                              <wps:spPr>
-                                                <a:xfrm>
-                                                  <a:off x="0" y="0"/>
-                                                  <a:ext cx="158750" cy="196850"/>
-                                                </a:xfrm>
-                                                <a:prstGeom prst="flowChartConnector">
-                                                  <a:avLst/>
-                                                </a:prstGeom>
-                                                <a:noFill/>
-                                                <a:ln w="19050">
-                                                  <a:solidFill>
-                                                    <a:srgbClr val="FF0000"/>
-                                                  </a:solidFill>
-                                                </a:ln>
-                                              </wps:spPr>
-                                              <wps:style>
-                                                <a:lnRef idx="2">
-                                                  <a:schemeClr val="accent1">
-                                                    <a:shade val="15000"/>
-                                                  </a:schemeClr>
-                                                </a:lnRef>
-                                                <a:fillRef idx="1">
-                                                  <a:schemeClr val="accent1"/>
-                                                </a:fillRef>
-                                                <a:effectRef idx="0">
-                                                  <a:schemeClr val="accent1"/>
-                                                </a:effectRef>
-                                                <a:fontRef idx="minor">
-                                                  <a:schemeClr val="lt1"/>
-                                                </a:fontRef>
-                                              </wps:style>
-                                              <wps:bodyPr rot="0" spcFirstLastPara="0" vertOverflow="overflow" horzOverflow="overflow" vert="horz" wrap="square" lIns="91440" tIns="45720" rIns="91440" bIns="45720" numCol="1" spcCol="0" rtlCol="0" fromWordArt="0" anchor="ctr" anchorCtr="0" forceAA="0" compatLnSpc="1">
-                                                <a:prstTxWarp prst="textNoShape">
-                                                  <a:avLst/>
-                                                </a:prstTxWarp>
-                                                <a:noAutofit/>
-                                              </wps:bodyPr>
-                                            </wps:wsp>
-                                          </a:graphicData>
-                                        </a:graphic>
-                                      </wp:anchor>
-                                    </w:drawing>
-                                  </mc:Choice>
-                                  <mc:Fallback xmlns:adec="http://schemas.microsoft.com/office/drawing/2017/decorative" xmlns:a14="http://schemas.microsoft.com/office/drawing/2010/main" xmlns:pic="http://schemas.openxmlformats.org/drawingml/2006/picture" xmlns:a="http://schemas.openxmlformats.org/drawingml/2006/main">
-                                    <w:pict w14:anchorId="0B60F7ED">
-                                      <v:shape id="Flowchart: Connector 6" style="position:absolute;margin-left:54.95pt;margin-top:81.9pt;width:12.5pt;height:15.5pt;z-index:251660327;visibility:visible;mso-wrap-style:square;mso-wrap-distance-left:9pt;mso-wrap-distance-top:0;mso-wrap-distance-right:9pt;mso-wrap-distance-bottom:0;mso-position-horizontal:absolute;mso-position-horizontal-relative:text;mso-position-vertical:absolute;mso-position-vertical-relative:text;v-text-anchor:middle" o:spid="_x0000_s1026" filled="f" strokecolor="red" strokeweight="1.5pt" type="#_x0000_t120" o:gfxdata="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" w14:anchorId="61B660B4">
-                                        <v:stroke joinstyle="miter"/>
-                                      </v:shape>
-                                    </w:pict>
-                                  </mc:Fallback>
-                                </mc:AlternateContent>
-                              </w:r>
-                              <w:r>
-                                <w:rPr>
-                                  <w:noProof/>
-                                </w:rPr>
-                                <w:drawing>
-                                  <wp:anchor distT="0" distB="0" distL="114300" distR="114300" simplePos="0" relativeHeight="251659303" behindDoc="1" locked="0" layoutInCell="1" allowOverlap="1" wp14:anchorId="518C79AA" wp14:editId="4BF1FCFB">
-                                    <wp:simplePos x="0" y="0"/>
-                                    <wp:positionH relativeFrom="column">
-                                      <wp:posOffset>-26035</wp:posOffset>
-                                    </wp:positionH>
-                                    <wp:positionV relativeFrom="paragraph">
-                                      <wp:posOffset>527050</wp:posOffset>
-                                    </wp:positionV>
-                                    <wp:extent cx="2506345" cy="1879600"/>
-                                    <wp:effectExtent l="0" t="0" r="8255" b="6350"/>
-                                    <wp:wrapTight wrapText="bothSides">
-                                      <wp:wrapPolygon edited="0">
-                                        <wp:start x="0" y="0"/>
-                                        <wp:lineTo x="0" y="21454"/>
-                                        <wp:lineTo x="21507" y="21454"/>
-                                        <wp:lineTo x="21507" y="0"/>
-                                        <wp:lineTo x="0" y="0"/>
-                                      </wp:wrapPolygon>
-                                    </wp:wrapTight>
-                                    <wp:docPr id="1339848966" name="Picture 2" descr="A green circuit board with black wires&#10;&#10;Description automatically generated"/>
-                                    <wp:cNvGraphicFramePr>
-                                      <a:graphicFrameLocks xmlns:a="http://schemas.openxmlformats.org/drawingml/2006/main" noChangeAspect="1"/>
-                                    </wp:cNvGraphicFramePr>
-                                    <a:graphic xmlns:a="http://schemas.openxmlformats.org/drawingml/2006/main">
-                                      <a:graphicData uri="http://schemas.openxmlformats.org/drawingml/2006/picture">
-                                        <pic:pic xmlns:pic="http://schemas.openxmlformats.org/drawingml/2006/picture">
-                                          <pic:nvPicPr>
-                                            <pic:cNvPr id="1339848966" name="Picture 2" descr="A green circuit board with black wires&#10;&#10;Description automatically generated"/>
-                                            <pic:cNvPicPr/>
-                                          </pic:nvPicPr>
-                                          <pic:blipFill>
-                                            <a:blip r:embed="rId21" cstate="print">
-                                              <a:extLst>
-                                                <a:ext uri="{28A0092B-C50C-407E-A947-70E740481C1C}">
-                                                  <a14:useLocalDpi xmlns:a14="http://schemas.microsoft.com/office/drawing/2010/main" val="0"/>
-                                                </a:ext>
-                                              </a:extLst>
-                                            </a:blip>
-                                            <a:stretch>
-                                              <a:fillRect/>
-                                            </a:stretch>
-                                          </pic:blipFill>
-                                          <pic:spPr>
-                                            <a:xfrm>
-                                              <a:off x="0" y="0"/>
-                                              <a:ext cx="2506345" cy="1879600"/>
-                                            </a:xfrm>
-                                            <a:prstGeom prst="rect">
-                                              <a:avLst/>
-                                            </a:prstGeom>
-                                          </pic:spPr>
-                                        </pic:pic>
-                                      </a:graphicData>
-                                    </a:graphic>
-                                  </wp:anchor>
-                                </w:drawing>
-                              </w:r>
-                            </w:p>
-                          </w:tc>
-                        </w:tr>
-                      </w:tbl>
-                      <w:p>
-                        <w:pPr>
-                          <w:pStyle w:val="Heading2"/>
-                        </w:pPr>
-                        <w:r>
-                          <w:lastRenderedPageBreak/>
-                          <w:t>Step 7</w:t>
-                        </w:r>
-                      </w:p>
-                      <w:tbl>
-                        <w:tblPr>
-                          <w:tblStyle w:val="TableGrid"/>
-                          <w:tblW w:w="9374" w:type="dxa"/>
-                          <w:tblLook w:val="04A0" w:firstRow="1" w:lastRow="0" w:firstColumn="1" w:lastColumn="0" w:noHBand="0" w:noVBand="1"/>
-                        </w:tblPr>
-                        <w:tblGrid>
-                          <w:gridCol w:w="10028"/>
-                          <w:gridCol w:w="222"/>
-                        </w:tblGrid>
-                        <w:tr>
-                          <w:tc>
-                            <w:tcPr>
-                              <w:tcW w:w="9138" w:type="dxa"/>
-                              <w:tcBorders>
-                                <w:top w:val="nil"/>
-                                <w:left w:val="nil"/>
-                                <w:bottom w:val="nil"/>
-                                <w:right w:val="nil"/>
-                              </w:tcBorders>
-                            </w:tcPr>
-                            <w:tbl>
-                              <w:tblPr>
-                                <w:tblStyle w:val="TableGrid"/>
-                                <w:tblW w:w="8390" w:type="dxa"/>
-                                <w:tblLayout w:type="fixed"/>
-                                <w:tblLook w:val="06A0" w:firstRow="1" w:lastRow="0" w:firstColumn="1" w:lastColumn="0" w:noHBand="1" w:noVBand="1"/>
-                              </w:tblPr>
-                              <w:tblGrid>
-                                <w:gridCol w:w="4214"/>
-                                <w:gridCol w:w="4176"/>
-                              </w:tblGrid>
-                              <w:tr>
-                                <w:trPr>
-                                  <w:trHeight w:val="300"/>
-                                </w:trPr>
-                                <w:tc>
-                                  <w:tcPr>
-                                    <w:tcW w:w="4227" w:type="dxa"/>
-                                  </w:tcPr>
-                                  <w:p>
-                                    <w:pPr>
-                                      <w:pStyle w:val="ListParagraph"/>
-                                      <w:numPr>
-                                        <w:ilvl w:val="0"/>
-                                        <w:numId w:val="13"/>
-                                      </w:numPr>
-                                    </w:pPr>
-                                    <w:r>
-                                      <w:t xml:space="preserve">Before reassembling, </w:t>
-                                    </w:r>
-                                    <w:r>
-                                      <w:t xml:space="preserve">secure the </w:t>
-                                    </w:r>
-                                    <w:r>
-                                      <w:t>small zip tie around the cable</w:t>
-                                    </w:r>
-                                    <w:r>
-                                      <w:t xml:space="preserve"> inside the plastic compartment. This is to keep the cable from being pulled out and staying in place inside of the toy. </w:t>
-                                    </w:r>
-                                  </w:p>
-                                  <w:p/>
-                                </w:tc>
-                                <w:tc>
-                                  <w:tcPr>
-                                    <w:tcW w:w="4163" w:type="dxa"/>
-                                  </w:tcPr>
-                                  <w:p>
-                                    <w:pPr>
-                                      <w:spacing w:after="200" w:line="276" w:lineRule="auto"/>
-                                    </w:pPr>
-                                    <w:r>
-                                      <w:rPr>
-                                        <w:noProof/>
-                                      </w:rPr>
-                                      <w:drawing>
-                                        <wp:inline distT="0" distB="0" distL="0" distR="0" wp14:anchorId="2392C098" wp14:editId="375ED3D9">
-                                          <wp:extent cx="2506345" cy="2986405"/>
-                                          <wp:effectExtent l="0" t="0" r="8255" b="4445"/>
-                                          <wp:docPr id="1044829317" name="Picture 1" descr="A close up of a circuit board&#10;&#10;Description automatically generated"/>
-                                          <wp:cNvGraphicFramePr>
-                                            <a:graphicFrameLocks xmlns:a="http://schemas.openxmlformats.org/drawingml/2006/main" noChangeAspect="1"/>
-                                          </wp:cNvGraphicFramePr>
-                                          <a:graphic xmlns:a="http://schemas.openxmlformats.org/drawingml/2006/main">
-                                            <a:graphicData uri="http://schemas.openxmlformats.org/drawingml/2006/picture">
-                                              <pic:pic xmlns:pic="http://schemas.openxmlformats.org/drawingml/2006/picture">
-                                                <pic:nvPicPr>
-                                                  <pic:cNvPr id="1044829317" name="Picture 1" descr="A close up of a circuit board&#10;&#10;Description automatically generated"/>
-                                                  <pic:cNvPicPr/>
-                                                </pic:nvPicPr>
-                                                <pic:blipFill rotWithShape="1">
-                                                  <a:blip r:embed="rId22" cstate="print">
-                                                    <a:extLst>
-                                                      <a:ext uri="{28A0092B-C50C-407E-A947-70E740481C1C}">
-                                                        <a14:useLocalDpi xmlns:a14="http://schemas.microsoft.com/office/drawing/2010/main" val="0"/>
-                                                      </a:ext>
-                                                    </a:extLst>
-                                                  </a:blip>
-                                                  <a:srcRect t="10641"/>
-                                                  <a:stretch/>
-                                                </pic:blipFill>
-                                                <pic:spPr bwMode="auto">
-                                                  <a:xfrm>
-                                                    <a:off x="0" y="0"/>
-                                                    <a:ext cx="2506345" cy="2986405"/>
-                                                  </a:xfrm>
-                                                  <a:prstGeom prst="rect">
-                                                    <a:avLst/>
-                                                  </a:prstGeom>
-                                                  <a:ln>
-                                                    <a:noFill/>
-                                                  </a:ln>
-                                                  <a:extLst>
-                                                    <a:ext uri="{53640926-AAD7-44D8-BBD7-CCE9431645EC}">
-                                                      <a14:shadowObscured xmlns:a14="http://schemas.microsoft.com/office/drawing/2010/main"/>
-                                                    </a:ext>
-                                                  </a:extLst>
-                                                </pic:spPr>
-                                              </pic:pic>
-                                            </a:graphicData>
-                                          </a:graphic>
-                                        </wp:inline>
-                                      </w:drawing>
-                                    </w:r>
-                                  </w:p>
-                                </w:tc>
-                              </w:tr>
-                            </w:tbl>
-                            <w:p>
-                              <w:pPr>
-                                <w:spacing w:after="200" w:line="276" w:lineRule="auto"/>
-                              </w:pPr>
-                            </w:p>
-                            <w:p>
-                              <w:pPr>
-                                <w:pStyle w:val="Heading2"/>
-                              </w:pPr>
-                              <w:r>
-                                <w:t>Step 8</w:t>
-                              </w:r>
-                            </w:p>
-                            <w:tbl>
-                              <w:tblPr>
-                                <w:tblStyle w:val="TableGrid"/>
-                                <w:tblW w:w="9374" w:type="dxa"/>
-                                <w:tblLook w:val="04A0" w:firstRow="1" w:lastRow="0" w:firstColumn="1" w:lastColumn="0" w:noHBand="0" w:noVBand="1"/>
-                              </w:tblPr>
-                              <w:tblGrid>
-                                <w:gridCol w:w="9590"/>
-                                <w:gridCol w:w="222"/>
-                              </w:tblGrid>
-                              <w:tr>
-                                <w:tc>
-                                  <w:tcPr>
-                                    <w:tcW w:w="9138" w:type="dxa"/>
-                                    <w:tcBorders>
-                                      <w:top w:val="nil"/>
-                                      <w:left w:val="nil"/>
-                                      <w:bottom w:val="nil"/>
-                                      <w:right w:val="nil"/>
-                                    </w:tcBorders>
-                                  </w:tcPr>
-                                  <w:tbl>
-                                    <w:tblPr>
-                                      <w:tblStyle w:val="TableGrid"/>
-                                      <w:tblW w:w="8390" w:type="dxa"/>
-                                      <w:tblLayout w:type="fixed"/>
-                                      <w:tblLook w:val="06A0" w:firstRow="1" w:lastRow="0" w:firstColumn="1" w:lastColumn="0" w:noHBand="1" w:noVBand="1"/>
-                                    </w:tblPr>
-                                    <w:tblGrid>
-                                      <w:gridCol w:w="4227"/>
-                                      <w:gridCol w:w="4163"/>
-                                    </w:tblGrid>
-                                    <w:tr>
-                                      <w:trPr>
-                                        <w:trHeight w:val="300"/>
-                                      </w:trPr>
-                                      <w:tc>
-                                        <w:tcPr>
-                                          <w:tcW w:w="4227" w:type="dxa"/>
-                                        </w:tcPr>
-                                        <w:p>
-                                          <w:pPr>
-                                            <w:pStyle w:val="ListParagraph"/>
-                                            <w:numPr>
-                                              <w:ilvl w:val="0"/>
-                                              <w:numId w:val="13"/>
-                                            </w:numPr>
-                                          </w:pPr>
-                                          <w:r>
-                                            <w:t xml:space="preserve">The toy can now be reassembled. The grey plastic bottom can be reattached to the main plastic compartment. If this is difficult, make sure you have the current orientation of the grey part, and you can do this by making up the square cut outs in the back of the toy.  </w:t>
-                                          </w:r>
-                                        </w:p>
-                                        <w:p/>
-                                      </w:tc>
-                                      <w:tc>
-                                        <w:tcPr>
-                                          <w:tcW w:w="4163" w:type="dxa"/>
-                                        </w:tcPr>
-                                        <w:p>
-                                          <w:pPr>
-                                            <w:spacing w:after="200" w:line="276" w:lineRule="auto"/>
-                                          </w:pPr>
-                                          <w:r>
-                                            <w:rPr>
-                                              <w:noProof/>
-                                            </w:rPr>
-                                            <w:drawing>
-                                              <wp:inline distT="0" distB="0" distL="0" distR="0" wp14:anchorId="0EB3A19F" wp14:editId="367EC923">
-                                                <wp:extent cx="2076450" cy="2768775"/>
-                                                <wp:effectExtent l="0" t="0" r="0" b="0"/>
-                                                <wp:docPr id="995798288" name="Picture 8" descr="A close up of a white object&#10;&#10;Description automatically generated"/>
-                                                <wp:cNvGraphicFramePr>
-                                                  <a:graphicFrameLocks xmlns:a="http://schemas.openxmlformats.org/drawingml/2006/main" noChangeAspect="1"/>
-                                                </wp:cNvGraphicFramePr>
-                                                <a:graphic xmlns:a="http://schemas.openxmlformats.org/drawingml/2006/main">
-                                                  <a:graphicData uri="http://schemas.openxmlformats.org/drawingml/2006/picture">
-                                                    <pic:pic xmlns:pic="http://schemas.openxmlformats.org/drawingml/2006/picture">
-                                                      <pic:nvPicPr>
-                                                        <pic:cNvPr id="995798288" name="Picture 8" descr="A close up of a white object&#10;&#10;Description automatically generated"/>
-                                                        <pic:cNvPicPr/>
-                                                      </pic:nvPicPr>
-                                                      <pic:blipFill>
-                                                        <a:blip r:embed="rId23" cstate="print">
-                                                          <a:extLst>
-                                                            <a:ext uri="{28A0092B-C50C-407E-A947-70E740481C1C}">
-                                                              <a14:useLocalDpi xmlns:a14="http://schemas.microsoft.com/office/drawing/2010/main" val="0"/>
-                                                            </a:ext>
-                                                          </a:extLst>
-                                                        </a:blip>
-                                                        <a:stretch>
-                                                          <a:fillRect/>
-                                                        </a:stretch>
-                                                      </pic:blipFill>
-                                                      <pic:spPr>
-                                                        <a:xfrm>
-                                                          <a:off x="0" y="0"/>
-                                                          <a:ext cx="2079527" cy="2772878"/>
-                                                        </a:xfrm>
-                                                        <a:prstGeom prst="rect">
-                                                          <a:avLst/>
-                                                        </a:prstGeom>
-                                                      </pic:spPr>
-                                                    </pic:pic>
-                                                  </a:graphicData>
-                                                </a:graphic>
-                                              </wp:inline>
-                                            </w:drawing>
-                                          </w:r>
-                                        </w:p>
-                                      </w:tc>
-                                    </w:tr>
-                                  </w:tbl>
-                                  <w:p>
-                                    <w:pPr>
-                                      <w:pStyle w:val="Heading2"/>
-                                      <w:spacing w:after="200" w:line="276" w:lineRule="auto"/>
-                                    </w:pPr>
-                                  </w:p>
-                                  <w:p/>
-                                  <w:p>
-                                    <w:pPr>
-                                      <w:pStyle w:val="Heading2"/>
-                                    </w:pPr>
-                                    <w:r>
-                                      <w:lastRenderedPageBreak/>
-                                      <w:t>Step 9</w:t>
-                                    </w:r>
-                                  </w:p>
-                                  <w:tbl>
-                                    <w:tblPr>
-                                      <w:tblStyle w:val="TableGrid"/>
-                                      <w:tblW w:w="9374" w:type="dxa"/>
-                                      <w:tblLook w:val="04A0" w:firstRow="1" w:lastRow="0" w:firstColumn="1" w:lastColumn="0" w:noHBand="0" w:noVBand="1"/>
-                                    </w:tblPr>
-                                    <w:tblGrid>
-                                      <w:gridCol w:w="9138"/>
-                                      <w:gridCol w:w="236"/>
-                                    </w:tblGrid>
-                                    <w:tr>
-                                      <w:tc>
-                                        <w:tcPr>
-                                          <w:tcW w:w="9138" w:type="dxa"/>
-                                          <w:tcBorders>
-                                            <w:top w:val="nil"/>
-                                            <w:left w:val="nil"/>
-                                            <w:bottom w:val="nil"/>
-                                            <w:right w:val="nil"/>
-                                          </w:tcBorders>
-                                        </w:tcPr>
-                                        <w:tbl>
-                                          <w:tblPr>
-                                            <w:tblStyle w:val="TableGrid"/>
-                                            <w:tblW w:w="8390" w:type="dxa"/>
-                                            <w:tblLayout w:type="fixed"/>
-                                            <w:tblLook w:val="06A0" w:firstRow="1" w:lastRow="0" w:firstColumn="1" w:lastColumn="0" w:noHBand="1" w:noVBand="1"/>
-                                          </w:tblPr>
-                                          <w:tblGrid>
-                                            <w:gridCol w:w="4214"/>
-                                            <w:gridCol w:w="4176"/>
-                                          </w:tblGrid>
-                                          <w:tr>
-                                            <w:trPr>
-                                              <w:trHeight w:val="300"/>
-                                            </w:trPr>
-                                            <w:tc>
-                                              <w:tcPr>
-                                                <w:tcW w:w="4227" w:type="dxa"/>
-                                              </w:tcPr>
-                                              <w:p>
-                                                <w:pPr>
-                                                  <w:pStyle w:val="ListParagraph"/>
-                                                  <w:numPr>
-                                                    <w:ilvl w:val="0"/>
-                                                    <w:numId w:val="13"/>
-                                                  </w:numPr>
-                                                </w:pPr>
-                                                <w:r>
-                                                  <w:t xml:space="preserve">Secure the screws back in place </w:t>
-                                                </w:r>
-                                              </w:p>
-                                              <w:p>
-                                                <w:pPr>
-                                                  <w:pStyle w:val="ListParagraph"/>
-                                                  <w:numPr>
-                                                    <w:ilvl w:val="0"/>
-                                                    <w:numId w:val="13"/>
-                                                  </w:numPr>
-                                                </w:pPr>
-                                                <w:r>
-                                                  <w:t xml:space="preserve">Push the plastic compartment back inside the toy to the original position </w:t>
-                                                </w:r>
-                                              </w:p>
-                                              <w:p>
-                                                <w:pPr>
-                                                  <w:pStyle w:val="ListParagraph"/>
-                                                  <w:numPr>
-                                                    <w:ilvl w:val="0"/>
-                                                    <w:numId w:val="13"/>
-                                                  </w:numPr>
-                                                </w:pPr>
-                                                <w:r>
-                                                  <w:t xml:space="preserve">Use you new zip tie, thread the zip tie through the seam (if the original zip tie is still there, remove it) and secure it around the plastic compartment to hold it in place. </w:t>
-                                                </w:r>
-                                              </w:p>
-                                              <w:p>
-                                                <w:pPr>
-                                                  <w:pStyle w:val="ListParagraph"/>
-                                                  <w:numPr>
-                                                    <w:ilvl w:val="0"/>
-                                                    <w:numId w:val="13"/>
-                                                  </w:numPr>
-                                                </w:pPr>
-                                                <w:r>
-                                                  <w:t xml:space="preserve">Make sure you cable </w:t>
-                                                </w:r>
-                                                <w:proofErr w:type="gramStart"/>
-                                                <w:r>
-                                                  <w:t>is able to</w:t>
-                                                </w:r>
-                                                <w:proofErr w:type="gramEnd"/>
-                                                <w:r>
-                                                  <w:t xml:space="preserve"> be accessed and outside of the toy before securing the zip tie  </w:t>
-                                                </w:r>
-                                              </w:p>
-                                              <w:p/>
-                                            </w:tc>
-                                            <w:tc>
-                                              <w:tcPr>
-                                                <w:tcW w:w="4163" w:type="dxa"/>
-                                              </w:tcPr>
-                                              <w:p>
-                                                <w:pPr>
-                                                  <w:spacing w:after="200" w:line="276" w:lineRule="auto"/>
-                                                </w:pPr>
-                                                <w:r>
-                                                  <w:rPr>
-                                                    <w:noProof/>
-                                                  </w:rPr>
-                                                  <w:drawing>
-                                                    <wp:inline distT="0" distB="0" distL="0" distR="0" wp14:anchorId="0A78E3D9" wp14:editId="6CD1FE32">
-                                                      <wp:extent cx="2506345" cy="1879600"/>
-                                                      <wp:effectExtent l="0" t="0" r="8255" b="6350"/>
-                                                      <wp:docPr id="916306708" name="Picture 5" descr="A person holding a plastic object&#10;&#10;Description automatically generated"/>
-                                                      <wp:cNvGraphicFramePr>
-                                                        <a:graphicFrameLocks xmlns:a="http://schemas.openxmlformats.org/drawingml/2006/main" noChangeAspect="1"/>
-                                                      </wp:cNvGraphicFramePr>
-                                                      <a:graphic xmlns:a="http://schemas.openxmlformats.org/drawingml/2006/main">
-                                                        <a:graphicData uri="http://schemas.openxmlformats.org/drawingml/2006/picture">
-                                                          <pic:pic xmlns:pic="http://schemas.openxmlformats.org/drawingml/2006/picture">
-                                                            <pic:nvPicPr>
-                                                              <pic:cNvPr id="916306708" name="Picture 5" descr="A person holding a plastic object&#10;&#10;Description automatically generated"/>
-                                                              <pic:cNvPicPr/>
-                                                            </pic:nvPicPr>
-                                                            <pic:blipFill>
-                                                              <a:blip r:embed="rId24" cstate="print">
-                                                                <a:extLst>
-                                                                  <a:ext uri="{28A0092B-C50C-407E-A947-70E740481C1C}">
-                                                                    <a14:useLocalDpi xmlns:a14="http://schemas.microsoft.com/office/drawing/2010/main" val="0"/>
-                                                                  </a:ext>
-                                                                </a:extLst>
-                                                              </a:blip>
-                                                              <a:stretch>
-                                                                <a:fillRect/>
-                                                              </a:stretch>
-                                                            </pic:blipFill>
-                                                            <pic:spPr>
-                                                              <a:xfrm>
-                                                                <a:off x="0" y="0"/>
-                                                                <a:ext cx="2506345" cy="1879600"/>
-                                                              </a:xfrm>
-                                                              <a:prstGeom prst="rect">
-                                                                <a:avLst/>
-                                                              </a:prstGeom>
-                                                            </pic:spPr>
-                                                          </pic:pic>
-                                                        </a:graphicData>
-                                                      </a:graphic>
-                                                    </wp:inline>
-                                                  </w:drawing>
-                                                </w:r>
-                                              </w:p>
-                                            </w:tc>
-                                          </w:tr>
-                                        </w:tbl>
-                                        <w:p>
-                                          <w:pPr>
-                                            <w:spacing w:after="200" w:line="276" w:lineRule="auto"/>
-                                          </w:pPr>
-                                        </w:p>
-                                        <w:p>
-                                          <w:pPr>
-                                            <w:spacing w:after="200" w:line="276" w:lineRule="auto"/>
-                                          </w:pPr>
-                                        </w:p>
-                                        <w:p>
-                                          <w:pPr>
-                                            <w:spacing w:after="200" w:line="276" w:lineRule="auto"/>
-                                            <w:jc w:val="center"/>
-                                          </w:pPr>
-                                          <w:r>
-                                            <w:t>The toy is complete!</w:t>
-                                          </w:r>
-                                        </w:p>
-                                        <w:p>
-                                          <w:pPr>
-                                            <w:spacing w:after="200" w:line="276" w:lineRule="auto"/>
-                                            <w:jc w:val="center"/>
-                                          </w:pPr>
-                                        </w:p>
-                                        <w:p>
-                                          <w:pPr>
-                                            <w:spacing w:after="200" w:line="276" w:lineRule="auto"/>
-                                          </w:pPr>
-                                        </w:p>
-                                        <w:p>
-                                          <w:pPr>
-                                            <w:spacing w:after="200" w:line="276" w:lineRule="auto"/>
-                                          </w:pPr>
-                                        </w:p>
-                                      </w:tc>
-                                      <w:tc>
-                                        <w:tcPr>
-                                          <w:tcW w:w="236" w:type="dxa"/>
-                                          <w:tcBorders>
-                                            <w:top w:val="nil"/>
-                                            <w:left w:val="nil"/>
-                                            <w:bottom w:val="nil"/>
-                                            <w:right w:val="nil"/>
-                                          </w:tcBorders>
-                                        </w:tcPr>
-                                        <w:p>
-                                          <w:pPr>
-                                            <w:spacing w:after="200" w:line="276" w:lineRule="auto"/>
-                                          </w:pPr>
-                                        </w:p>
-                                      </w:tc>
-                                    </w:tr>
-                                  </w:tbl>
-                                  <w:p>
-                                    <w:pPr>
-                                      <w:spacing w:after="200" w:line="276" w:lineRule="auto"/>
-                                    </w:pPr>
-                                  </w:p>
-                                </w:tc>
-                                <w:tc>
-                                  <w:tcPr>
-                                    <w:tcW w:w="236" w:type="dxa"/>
-                                    <w:tcBorders>
-                                      <w:top w:val="nil"/>
-                                      <w:left w:val="nil"/>
-                                      <w:bottom w:val="nil"/>
-                                      <w:right w:val="nil"/>
-                                    </w:tcBorders>
-                                  </w:tcPr>
-                                  <w:p>
-                                    <w:pPr>
-                                      <w:spacing w:after="200" w:line="276" w:lineRule="auto"/>
-                                    </w:pPr>
-                                  </w:p>
-                                </w:tc>
-                              </w:tr>
-                            </w:tbl>
-                            <w:p>
-                              <w:pPr>
-                                <w:spacing w:after="200" w:line="276" w:lineRule="auto"/>
-                              </w:pPr>
-                            </w:p>
-                          </w:tc>
-                          <w:tc>
-                            <w:tcPr>
-                              <w:tcW w:w="236" w:type="dxa"/>
-                              <w:tcBorders>
-                                <w:top w:val="nil"/>
-                                <w:left w:val="nil"/>
-                                <w:bottom w:val="nil"/>
-                                <w:right w:val="nil"/>
-                              </w:tcBorders>
-                            </w:tcPr>
-                            <w:p>
-                              <w:pPr>
-                                <w:spacing w:after="200" w:line="276" w:lineRule="auto"/>
-                              </w:pPr>
-                            </w:p>
-                          </w:tc>
-                        </w:tr>
-                      </w:tbl>
-                      <w:p>
-                        <w:pPr>
-                          <w:spacing w:after="200" w:line="276" w:lineRule="auto"/>
-                        </w:pPr>
-                      </w:p>
-                      <w:p>
-                        <w:pPr>
-                          <w:spacing w:after="200" w:line="276" w:lineRule="auto"/>
-                        </w:pPr>
-                      </w:p>
-                    </w:tc>
-                    <w:tc>
-                      <w:tcPr>
-                        <w:tcW w:w="236" w:type="dxa"/>
-                        <w:tcBorders>
-                          <w:top w:val="nil"/>
-                          <w:left w:val="nil"/>
-                          <w:bottom w:val="nil"/>
-                          <w:right w:val="nil"/>
-                        </w:tcBorders>
-                      </w:tcPr>
-                      <w:p>
-                        <w:pPr>
-                          <w:spacing w:after="200" w:line="276" w:lineRule="auto"/>
-                        </w:pPr>
-                      </w:p>
-                    </w:tc>
-                  </w:tr>
-                </w:tbl>
-                <w:p>
-                  <w:pPr>
-                    <w:spacing w:after="200" w:line="276" w:lineRule="auto"/>
-                  </w:pPr>
-                </w:p>
-              </w:tc>
-              <w:tc>
-                <w:tcPr>
-                  <w:tcW w:w="236" w:type="dxa"/>
-                  <w:tcBorders>
-                    <w:top w:val="nil"/>
-                    <w:left w:val="nil"/>
-                    <w:bottom w:val="nil"/>
-                    <w:right w:val="nil"/>
-                  </w:tcBorders>
-                </w:tcPr>
-                <w:p>
-                  <w:pPr>
-                    <w:spacing w:after="200" w:line="276" w:lineRule="auto"/>
-                  </w:pPr>
-                </w:p>
-              </w:tc>
-            </w:tr>
-          </w:tbl>
-          <w:p>
-            <w:pPr>
-              <w:spacing w:after="200" w:line="276" w:lineRule="auto"/>
-            </w:pPr>
-          </w:p>
+          <w:p/>
         </w:tc>
         <w:tc>
           <w:tcPr>
-            <w:tcW w:w="236" w:type="dxa"/>
+            <w:tcW w:w="2530" w:type="pct"/>
             <w:tcBorders>
               <w:top w:val="nil"/>
               <w:left w:val="nil"/>
@@ -2945,175 +2732,20 @@
               <w:right w:val="nil"/>
             </w:tcBorders>
           </w:tcPr>
-          <w:p>
-            <w:pPr>
-              <w:spacing w:after="200" w:line="276" w:lineRule="auto"/>
-            </w:pPr>
-          </w:p>
+          <w:p/>
         </w:tc>
       </w:tr>
     </w:tbl>
     <w:p>
       <w:pPr>
-        <w:keepNext/>
-        <w:keepLines/>
-        <w:spacing w:before="200" w:after="0"/>
-        <w:outlineLvl w:val="1"/>
-        <w:rPr>
-          <w:rFonts w:asciiTheme="majorHAnsi" w:eastAsiaTheme="majorEastAsia" w:hAnsiTheme="majorHAnsi" w:cstheme="majorBidi"/>
-          <w:b/>
-          <w:bCs/>
-          <w:color w:val="26225E" w:themeColor="accent1"/>
-          <w:sz w:val="26"/>
-          <w:szCs w:val="26"/>
-        </w:rPr>
-      </w:pPr>
-    </w:p>
-    <w:tbl>
-      <w:tblPr>
-        <w:tblStyle w:val="TableGrid"/>
-        <w:tblW w:w="0" w:type="auto"/>
-        <w:tblBorders>
-          <w:top w:val="none" w:sz="0" w:space="0" w:color="auto"/>
-          <w:left w:val="none" w:sz="0" w:space="0" w:color="auto"/>
-          <w:bottom w:val="none" w:sz="0" w:space="0" w:color="auto"/>
-          <w:right w:val="none" w:sz="0" w:space="0" w:color="auto"/>
-          <w:insideH w:val="none" w:sz="0" w:space="0" w:color="auto"/>
-          <w:insideV w:val="none" w:sz="0" w:space="0" w:color="auto"/>
-        </w:tblBorders>
-        <w:tblLook w:val="04A0" w:firstRow="1" w:lastRow="0" w:firstColumn="1" w:lastColumn="0" w:noHBand="0" w:noVBand="1"/>
-      </w:tblPr>
-      <w:tblGrid>
-        <w:gridCol w:w="3681"/>
-        <w:gridCol w:w="5669"/>
-      </w:tblGrid>
-      <w:tr>
-        <w:tc>
-          <w:tcPr>
-            <w:tcW w:w="3681" w:type="dxa"/>
-          </w:tcPr>
-          <w:p/>
-          <w:p>
-            <w:pPr>
-              <w:rPr>
-                <w:b/>
-                <w:bCs/>
-              </w:rPr>
-            </w:pPr>
-          </w:p>
-        </w:tc>
-        <w:tc>
-          <w:tcPr>
-            <w:tcW w:w="5669" w:type="dxa"/>
-          </w:tcPr>
-          <w:p>
-            <w:pPr>
-              <w:jc w:val="center"/>
-            </w:pPr>
-          </w:p>
-          <w:p>
-            <w:pPr>
-              <w:jc w:val="center"/>
-            </w:pPr>
-          </w:p>
-        </w:tc>
-      </w:tr>
-    </w:tbl>
-    <w:p/>
-    <w:tbl>
-      <w:tblPr>
-        <w:tblStyle w:val="TableGrid"/>
-        <w:tblW w:w="4994" w:type="pct"/>
-        <w:tblBorders>
-          <w:top w:val="none" w:sz="0" w:space="0" w:color="auto"/>
-          <w:left w:val="none" w:sz="0" w:space="0" w:color="auto"/>
-          <w:bottom w:val="none" w:sz="0" w:space="0" w:color="auto"/>
-          <w:right w:val="none" w:sz="0" w:space="0" w:color="auto"/>
-          <w:insideH w:val="none" w:sz="0" w:space="0" w:color="auto"/>
-          <w:insideV w:val="none" w:sz="0" w:space="0" w:color="auto"/>
-        </w:tblBorders>
-        <w:tblLook w:val="04A0" w:firstRow="1" w:lastRow="0" w:firstColumn="1" w:lastColumn="0" w:noHBand="0" w:noVBand="1"/>
-      </w:tblPr>
-      <w:tblGrid>
-        <w:gridCol w:w="3682"/>
-        <w:gridCol w:w="5667"/>
-      </w:tblGrid>
-      <w:tr>
-        <w:tc>
-          <w:tcPr>
-            <w:tcW w:w="1969" w:type="pct"/>
-          </w:tcPr>
-          <w:p>
-            <w:pPr>
-              <w:rPr>
-                <w:sz w:val="24"/>
-              </w:rPr>
-            </w:pPr>
-          </w:p>
-        </w:tc>
-        <w:tc>
-          <w:tcPr>
-            <w:tcW w:w="3031" w:type="pct"/>
-          </w:tcPr>
-          <w:p>
-            <w:pPr>
-              <w:jc w:val="center"/>
-              <w:rPr>
-                <w:noProof/>
-              </w:rPr>
-            </w:pPr>
-          </w:p>
-        </w:tc>
-      </w:tr>
-    </w:tbl>
-    <w:p/>
-    <w:tbl>
-      <w:tblPr>
-        <w:tblStyle w:val="TableGrid"/>
-        <w:tblW w:w="0" w:type="auto"/>
-        <w:tblBorders>
-          <w:top w:val="none" w:sz="0" w:space="0" w:color="auto"/>
-          <w:left w:val="none" w:sz="0" w:space="0" w:color="auto"/>
-          <w:bottom w:val="none" w:sz="0" w:space="0" w:color="auto"/>
-          <w:right w:val="none" w:sz="0" w:space="0" w:color="auto"/>
-          <w:insideH w:val="none" w:sz="0" w:space="0" w:color="auto"/>
-          <w:insideV w:val="none" w:sz="0" w:space="0" w:color="auto"/>
-        </w:tblBorders>
-        <w:tblLook w:val="04A0" w:firstRow="1" w:lastRow="0" w:firstColumn="1" w:lastColumn="0" w:noHBand="0" w:noVBand="1"/>
-      </w:tblPr>
-      <w:tblGrid>
-        <w:gridCol w:w="3681"/>
-        <w:gridCol w:w="5669"/>
-      </w:tblGrid>
-      <w:tr>
-        <w:tc>
-          <w:tcPr>
-            <w:tcW w:w="3681" w:type="dxa"/>
-          </w:tcPr>
-          <w:p/>
-        </w:tc>
-        <w:tc>
-          <w:tcPr>
-            <w:tcW w:w="5669" w:type="dxa"/>
-          </w:tcPr>
-          <w:p>
-            <w:pPr>
-              <w:jc w:val="center"/>
-            </w:pPr>
-          </w:p>
-        </w:tc>
-      </w:tr>
-    </w:tbl>
-    <w:p>
-      <w:pPr>
         <w:tabs>
           <w:tab w:val="left" w:pos="1956"/>
         </w:tabs>
       </w:pPr>
     </w:p>
     <w:sectPr>
-      <w:headerReference w:type="default" r:id="rId25"/>
-      <w:footerReference w:type="default" r:id="rId26"/>
+      <w:headerReference w:type="default" r:id="rId28"/>
+      <w:footerReference w:type="default" r:id="rId29"/>
       <w:pgSz w:w="12240" w:h="15840"/>
       <w:pgMar w:top="1440" w:right="1440" w:bottom="1440" w:left="1440" w:header="720" w:footer="708" w:gutter="0"/>
       <w:cols w:space="708"/>
@@ -3480,6 +3112,17 @@
         <w:szCs w:val="16"/>
       </w:rPr>
       <w:t>1.0</w:t>
+    </w:r>
+    <w:r>
+      <w:rPr>
+        <w:rFonts w:ascii="Calibri" w:eastAsia="Calibri" w:hAnsi="Calibri" w:cs="Calibri"/>
+        <w:b/>
+        <w:bCs/>
+        <w:color w:val="646464"/>
+        <w:sz w:val="16"/>
+        <w:szCs w:val="16"/>
+      </w:rPr>
+      <w:t>.1</w:t>
     </w:r>
     <w:r>
       <w:rPr>
@@ -3741,16 +3384,20 @@
   <w:abstractNum w:abstractNumId="0" w15:restartNumberingAfterBreak="0">
     <w:nsid w:val="0E342596"/>
     <w:multiLevelType w:val="hybridMultilevel"/>
-    <w:tmpl w:val="CE1EC96E"/>
-    <w:lvl w:ilvl="0" w:tplc="41409460">
+    <w:tmpl w:val="7668CF10"/>
+    <w:lvl w:ilvl="0" w:tplc="0E366C08">
       <w:numFmt w:val="bullet"/>
       <w:lvlText w:val="-"/>
       <w:lvlJc w:val="left"/>
       <w:pPr>
-        <w:ind w:left="720" w:hanging="360"/>
+        <w:ind w:left="360" w:hanging="360"/>
       </w:pPr>
       <w:rPr>
         <w:rFonts w:ascii="Calibri" w:eastAsiaTheme="minorEastAsia" w:hAnsi="Calibri" w:cs="Calibri" w:hint="default"/>
+        <w:b w:val="0"/>
+        <w:bCs w:val="0"/>
+        <w:sz w:val="24"/>
+        <w:szCs w:val="24"/>
       </w:rPr>
     </w:lvl>
     <w:lvl w:ilvl="1" w:tplc="10090003" w:tentative="1">
@@ -3759,7 +3406,7 @@
       <w:lvlText w:val="o"/>
       <w:lvlJc w:val="left"/>
       <w:pPr>
-        <w:ind w:left="1440" w:hanging="360"/>
+        <w:ind w:left="1080" w:hanging="360"/>
       </w:pPr>
       <w:rPr>
         <w:rFonts w:ascii="Courier New" w:hAnsi="Courier New" w:cs="Courier New" w:hint="default"/>
@@ -3771,7 +3418,7 @@
       <w:lvlText w:val=""/>
       <w:lvlJc w:val="left"/>
       <w:pPr>
-        <w:ind w:left="2160" w:hanging="360"/>
+        <w:ind w:left="1800" w:hanging="360"/>
       </w:pPr>
       <w:rPr>
         <w:rFonts w:ascii="Wingdings" w:hAnsi="Wingdings" w:hint="default"/>
@@ -3783,7 +3430,7 @@
       <w:lvlText w:val=""/>
       <w:lvlJc w:val="left"/>
       <w:pPr>
-        <w:ind w:left="2880" w:hanging="360"/>
+        <w:ind w:left="2520" w:hanging="360"/>
       </w:pPr>
       <w:rPr>
         <w:rFonts w:ascii="Symbol" w:hAnsi="Symbol" w:hint="default"/>
@@ -3795,7 +3442,7 @@
       <w:lvlText w:val="o"/>
       <w:lvlJc w:val="left"/>
       <w:pPr>
-        <w:ind w:left="3600" w:hanging="360"/>
+        <w:ind w:left="3240" w:hanging="360"/>
       </w:pPr>
       <w:rPr>
         <w:rFonts w:ascii="Courier New" w:hAnsi="Courier New" w:cs="Courier New" w:hint="default"/>
@@ -3807,7 +3454,7 @@
       <w:lvlText w:val=""/>
       <w:lvlJc w:val="left"/>
       <w:pPr>
-        <w:ind w:left="4320" w:hanging="360"/>
+        <w:ind w:left="3960" w:hanging="360"/>
       </w:pPr>
       <w:rPr>
         <w:rFonts w:ascii="Wingdings" w:hAnsi="Wingdings" w:hint="default"/>
@@ -3819,7 +3466,7 @@
       <w:lvlText w:val=""/>
       <w:lvlJc w:val="left"/>
       <w:pPr>
-        <w:ind w:left="5040" w:hanging="360"/>
+        <w:ind w:left="4680" w:hanging="360"/>
       </w:pPr>
       <w:rPr>
         <w:rFonts w:ascii="Symbol" w:hAnsi="Symbol" w:hint="default"/>
@@ -3831,7 +3478,7 @@
       <w:lvlText w:val="o"/>
       <w:lvlJc w:val="left"/>
       <w:pPr>
-        <w:ind w:left="5760" w:hanging="360"/>
+        <w:ind w:left="5400" w:hanging="360"/>
       </w:pPr>
       <w:rPr>
         <w:rFonts w:ascii="Courier New" w:hAnsi="Courier New" w:cs="Courier New" w:hint="default"/>
@@ -3843,7 +3490,7 @@
       <w:lvlText w:val=""/>
       <w:lvlJc w:val="left"/>
       <w:pPr>
-        <w:ind w:left="6480" w:hanging="360"/>
+        <w:ind w:left="6120" w:hanging="360"/>
       </w:pPr>
       <w:rPr>
         <w:rFonts w:ascii="Wingdings" w:hAnsi="Wingdings" w:hint="default"/>
@@ -6360,6 +6007,18 @@
       <w:shd w:val="clear" w:color="auto" w:fill="E1DFDD"/>
     </w:rPr>
   </w:style>
+  <w:style w:type="character" w:styleId="FollowedHyperlink">
+    <w:name w:val="FollowedHyperlink"/>
+    <w:basedOn w:val="DefaultParagraphFont"/>
+    <w:uiPriority w:val="99"/>
+    <w:semiHidden/>
+    <w:unhideWhenUsed/>
+    <w:rsid w:val="000235DB"/>
+    <w:rPr>
+      <w:color w:val="954F72" w:themeColor="followedHyperlink"/>
+      <w:u w:val="single"/>
+    </w:rPr>
+  </w:style>
 </w:styles>
 </file>
 
@@ -6625,21 +6284,10 @@
 </file>
 
 <file path=customXml/item1.xml><?xml version="1.0" encoding="utf-8"?>
-<p:properties xmlns:p="http://schemas.microsoft.com/office/2006/metadata/properties" xmlns:xsi="http://www.w3.org/2001/XMLSchema-instance" xmlns:pc="http://schemas.microsoft.com/office/infopath/2007/PartnerControls">
-  <documentManagement>
-    <TaxCatchAll xmlns="38b325e6-602c-452a-8617-173bf47082c5" xsi:nil="true"/>
-    <lcf76f155ced4ddcb4097134ff3c332f xmlns="8cf100d1-0775-4feb-8634-62999c4541bc">
-      <Terms xmlns="http://schemas.microsoft.com/office/infopath/2007/PartnerControls"/>
-    </lcf76f155ced4ddcb4097134ff3c332f>
-  </documentManagement>
-</p:properties>
+<b:Sources xmlns:b="http://schemas.openxmlformats.org/officeDocument/2006/bibliography" xmlns="http://schemas.openxmlformats.org/officeDocument/2006/bibliography" SelectedStyle="\APASixthEditionOfficeOnline.xsl" StyleName="APA" Version="6"/>
 </file>
 
 <file path=customXml/item2.xml><?xml version="1.0" encoding="utf-8"?>
-<b:Sources xmlns:b="http://schemas.openxmlformats.org/officeDocument/2006/bibliography" xmlns="http://schemas.openxmlformats.org/officeDocument/2006/bibliography" SelectedStyle="\APASixthEditionOfficeOnline.xsl" StyleName="APA" Version="6"/>
-</file>
-
-<file path=customXml/item3.xml><?xml version="1.0" encoding="utf-8"?>
 <?mso-contentType ?>
 <FormTemplates xmlns="http://schemas.microsoft.com/sharepoint/v3/contenttype/forms">
   <Display>DocumentLibraryForm</Display>
@@ -6648,9 +6296,9 @@
 </FormTemplates>
 </file>
 
-<file path=customXml/item4.xml><?xml version="1.0" encoding="utf-8"?>
-<ct:contentTypeSchema xmlns:ct="http://schemas.microsoft.com/office/2006/metadata/contentType" xmlns:ma="http://schemas.microsoft.com/office/2006/metadata/properties/metaAttributes" ct:_="" ma:_="" ma:contentTypeName="Document" ma:contentTypeID="0x010100456CAEA290209545A9F8681F83603874" ma:contentTypeVersion="19" ma:contentTypeDescription="Create a new document." ma:contentTypeScope="" ma:versionID="4bf10bb897fc0ef406baa02b9d664253">
-  <xsd:schema xmlns:xsd="http://www.w3.org/2001/XMLSchema" xmlns:xs="http://www.w3.org/2001/XMLSchema" xmlns:p="http://schemas.microsoft.com/office/2006/metadata/properties" xmlns:ns2="8cf100d1-0775-4feb-8634-62999c4541bc" xmlns:ns3="38b325e6-602c-452a-8617-173bf47082c5" targetNamespace="http://schemas.microsoft.com/office/2006/metadata/properties" ma:root="true" ma:fieldsID="1c6be4edf2b996d6a6f54fa7c1dd8d7b" ns2:_="" ns3:_="">
+<file path=customXml/item3.xml><?xml version="1.0" encoding="utf-8"?>
+<ct:contentTypeSchema xmlns:ct="http://schemas.microsoft.com/office/2006/metadata/contentType" xmlns:ma="http://schemas.microsoft.com/office/2006/metadata/properties/metaAttributes" ct:_="" ma:_="" ma:contentTypeName="Document" ma:contentTypeID="0x010100456CAEA290209545A9F8681F83603874" ma:contentTypeVersion="19" ma:contentTypeDescription="Create a new document." ma:contentTypeScope="" ma:versionID="a5b95c81d0183cd265e4c0ae7d195efc">
+  <xsd:schema xmlns:xsd="http://www.w3.org/2001/XMLSchema" xmlns:xs="http://www.w3.org/2001/XMLSchema" xmlns:p="http://schemas.microsoft.com/office/2006/metadata/properties" xmlns:ns2="8cf100d1-0775-4feb-8634-62999c4541bc" xmlns:ns3="38b325e6-602c-452a-8617-173bf47082c5" targetNamespace="http://schemas.microsoft.com/office/2006/metadata/properties" ma:root="true" ma:fieldsID="39769bd7f15653c282ab5152dbadbd81" ns2:_="" ns3:_="">
     <xsd:import namespace="8cf100d1-0775-4feb-8634-62999c4541bc"/>
     <xsd:import namespace="38b325e6-602c-452a-8617-173bf47082c5"/>
     <xsd:element name="properties">
@@ -6903,18 +6551,18 @@
 </ct:contentTypeSchema>
 </file>
 
-<file path=customXml/itemProps1.xml><?xml version="1.0" encoding="utf-8"?>
-<ds:datastoreItem xmlns:ds="http://schemas.openxmlformats.org/officeDocument/2006/customXml" ds:itemID="{3A085C18-819E-4466-9494-DD461C39C2B0}">
-  <ds:schemaRefs>
-    <ds:schemaRef ds:uri="http://schemas.microsoft.com/office/2006/metadata/properties"/>
-    <ds:schemaRef ds:uri="http://schemas.microsoft.com/office/infopath/2007/PartnerControls"/>
-    <ds:schemaRef ds:uri="38b325e6-602c-452a-8617-173bf47082c5"/>
-    <ds:schemaRef ds:uri="8cf100d1-0775-4feb-8634-62999c4541bc"/>
-  </ds:schemaRefs>
-</ds:datastoreItem>
+<file path=customXml/item4.xml><?xml version="1.0" encoding="utf-8"?>
+<p:properties xmlns:p="http://schemas.microsoft.com/office/2006/metadata/properties" xmlns:xsi="http://www.w3.org/2001/XMLSchema-instance" xmlns:pc="http://schemas.microsoft.com/office/infopath/2007/PartnerControls">
+  <documentManagement>
+    <TaxCatchAll xmlns="38b325e6-602c-452a-8617-173bf47082c5" xsi:nil="true"/>
+    <lcf76f155ced4ddcb4097134ff3c332f xmlns="8cf100d1-0775-4feb-8634-62999c4541bc">
+      <Terms xmlns="http://schemas.microsoft.com/office/infopath/2007/PartnerControls"/>
+    </lcf76f155ced4ddcb4097134ff3c332f>
+  </documentManagement>
+</p:properties>
 </file>
 
-<file path=customXml/itemProps2.xml><?xml version="1.0" encoding="utf-8"?>
+<file path=customXml/itemProps1.xml><?xml version="1.0" encoding="utf-8"?>
 <ds:datastoreItem xmlns:ds="http://schemas.openxmlformats.org/officeDocument/2006/customXml" ds:itemID="{C438ADBA-56D5-474C-BF2C-97C24DDF66BD}">
   <ds:schemaRefs>
     <ds:schemaRef ds:uri="http://schemas.openxmlformats.org/officeDocument/2006/bibliography"/>
@@ -6922,7 +6570,7 @@
 </ds:datastoreItem>
 </file>
 
-<file path=customXml/itemProps3.xml><?xml version="1.0" encoding="utf-8"?>
+<file path=customXml/itemProps2.xml><?xml version="1.0" encoding="utf-8"?>
 <ds:datastoreItem xmlns:ds="http://schemas.openxmlformats.org/officeDocument/2006/customXml" ds:itemID="{2585761D-1AE9-4796-83E7-A2FC381967AF}">
   <ds:schemaRefs>
     <ds:schemaRef ds:uri="http://schemas.microsoft.com/sharepoint/v3/contenttype/forms"/>
@@ -6930,8 +6578,8 @@
 </ds:datastoreItem>
 </file>
 
-<file path=customXml/itemProps4.xml><?xml version="1.0" encoding="utf-8"?>
-<ds:datastoreItem xmlns:ds="http://schemas.openxmlformats.org/officeDocument/2006/customXml" ds:itemID="{498A8FE2-8E27-4252-A117-A76AFE615EF2}">
+<file path=customXml/itemProps3.xml><?xml version="1.0" encoding="utf-8"?>
+<ds:datastoreItem xmlns:ds="http://schemas.openxmlformats.org/officeDocument/2006/customXml" ds:itemID="{45E670B7-100F-4690-96E0-4DEC2A7F56DD}">
   <ds:schemaRefs>
     <ds:schemaRef ds:uri="http://schemas.microsoft.com/office/2006/metadata/contentType"/>
     <ds:schemaRef ds:uri="http://schemas.microsoft.com/office/2006/metadata/properties/metaAttributes"/>
@@ -6947,4 +6595,15 @@
     <ds:schemaRef ds:uri="http://schemas.microsoft.com/internal/obd"/>
   </ds:schemaRefs>
 </ds:datastoreItem>
+</file>
+
+<file path=customXml/itemProps4.xml><?xml version="1.0" encoding="utf-8"?>
+<ds:datastoreItem xmlns:ds="http://schemas.openxmlformats.org/officeDocument/2006/customXml" ds:itemID="{3A085C18-819E-4466-9494-DD461C39C2B0}">
+  <ds:schemaRefs>
+    <ds:schemaRef ds:uri="http://schemas.microsoft.com/office/2006/metadata/properties"/>
+    <ds:schemaRef ds:uri="http://schemas.microsoft.com/office/infopath/2007/PartnerControls"/>
+    <ds:schemaRef ds:uri="38b325e6-602c-452a-8617-173bf47082c5"/>
+    <ds:schemaRef ds:uri="8cf100d1-0775-4feb-8634-62999c4541bc"/>
+  </ds:schemaRefs>
+</ds:datastoreItem>
 </file>
</xml_diff>